<commit_message>
1 Test und 1 neuen Punkt: Datenbank eingefügt
</commit_message>
<xml_diff>
--- a/Testdokumentation_Unittests_Restaurant_Adminbereich.docx
+++ b/Testdokumentation_Unittests_Restaurant_Adminbereich.docx
@@ -1105,10 +1105,7 @@
       </w:r>
       <w:proofErr w:type="spellStart"/>
       <w:r>
-        <w:t>M</w:t>
-      </w:r>
-      <w:r>
-        <w:t>öglichkeiten</w:t>
+        <w:t>Möglichkeiten</w:t>
       </w:r>
       <w:proofErr w:type="spellEnd"/>
       <w:r>
@@ -1228,6 +1225,1700 @@
     </w:p>
     <w:p>
       <w:pPr>
+        <w:pStyle w:val="berschrift1"/>
+        <w:spacing w:before="240" w:after="120"/>
+        <w:rPr>
+          <w:lang w:val="de-DE"/>
+        </w:rPr>
+      </w:pPr>
+      <w:r>
+        <w:rPr>
+          <w:lang w:val="de-DE"/>
+        </w:rPr>
+        <w:t xml:space="preserve">4. </w:t>
+      </w:r>
+      <w:r>
+        <w:rPr>
+          <w:lang w:val="de-DE"/>
+        </w:rPr>
+        <w:t>Datenbankanbindung</w:t>
+      </w:r>
+    </w:p>
+    <w:p>
+      <w:pPr>
+        <w:rPr>
+          <w:lang w:val="de-DE"/>
+        </w:rPr>
+      </w:pPr>
+      <w:r>
+        <w:rPr>
+          <w:b/>
+          <w:lang w:val="de-DE"/>
+        </w:rPr>
+        <w:t xml:space="preserve">Ziel des Bereichs: </w:t>
+      </w:r>
+      <w:r>
+        <w:rPr>
+          <w:lang w:val="de-DE"/>
+        </w:rPr>
+        <w:t>Verbindung der Software mit der Datenbank.</w:t>
+      </w:r>
+    </w:p>
+    <w:tbl>
+      <w:tblPr>
+        <w:tblStyle w:val="Tabellenraster"/>
+        <w:tblW w:w="0" w:type="auto"/>
+        <w:jc w:val="center"/>
+        <w:tblLook w:val="04A0" w:firstRow="1" w:lastRow="0" w:firstColumn="1" w:lastColumn="0" w:noHBand="0" w:noVBand="1"/>
+      </w:tblPr>
+      <w:tblGrid>
+        <w:gridCol w:w="2376"/>
+        <w:gridCol w:w="7704"/>
+      </w:tblGrid>
+      <w:tr>
+        <w:trPr>
+          <w:cantSplit/>
+          <w:jc w:val="center"/>
+        </w:trPr>
+        <w:tc>
+          <w:tcPr>
+            <w:tcW w:w="2376" w:type="dxa"/>
+            <w:shd w:val="clear" w:color="auto" w:fill="EEF4F8"/>
+            <w:tcMar>
+              <w:top w:w="100" w:type="dxa"/>
+              <w:left w:w="100" w:type="dxa"/>
+              <w:bottom w:w="100" w:type="dxa"/>
+              <w:right w:w="100" w:type="dxa"/>
+            </w:tcMar>
+            <w:vAlign w:val="center"/>
+          </w:tcPr>
+          <w:p>
+            <w:pPr>
+              <w:spacing w:before="40" w:after="40"/>
+            </w:pPr>
+            <w:proofErr w:type="spellStart"/>
+            <w:r>
+              <w:rPr>
+                <w:b/>
+                <w:color w:val="1F4E79"/>
+                <w:sz w:val="19"/>
+              </w:rPr>
+              <w:t>Verantwortlich</w:t>
+            </w:r>
+            <w:proofErr w:type="spellEnd"/>
+          </w:p>
+        </w:tc>
+        <w:tc>
+          <w:tcPr>
+            <w:tcW w:w="7704" w:type="dxa"/>
+            <w:tcMar>
+              <w:top w:w="100" w:type="dxa"/>
+              <w:left w:w="100" w:type="dxa"/>
+              <w:bottom w:w="100" w:type="dxa"/>
+              <w:right w:w="100" w:type="dxa"/>
+            </w:tcMar>
+            <w:vAlign w:val="center"/>
+          </w:tcPr>
+          <w:p>
+            <w:pPr>
+              <w:spacing w:before="40" w:after="40"/>
+            </w:pPr>
+            <w:r>
+              <w:rPr>
+                <w:sz w:val="19"/>
+              </w:rPr>
+              <w:t>[Name / Team]</w:t>
+            </w:r>
+          </w:p>
+        </w:tc>
+      </w:tr>
+      <w:tr>
+        <w:trPr>
+          <w:cantSplit/>
+          <w:jc w:val="center"/>
+        </w:trPr>
+        <w:tc>
+          <w:tcPr>
+            <w:tcW w:w="2376" w:type="dxa"/>
+            <w:shd w:val="clear" w:color="auto" w:fill="EEF4F8"/>
+            <w:tcMar>
+              <w:top w:w="100" w:type="dxa"/>
+              <w:left w:w="100" w:type="dxa"/>
+              <w:bottom w:w="100" w:type="dxa"/>
+              <w:right w:w="100" w:type="dxa"/>
+            </w:tcMar>
+            <w:vAlign w:val="center"/>
+          </w:tcPr>
+          <w:p>
+            <w:pPr>
+              <w:spacing w:before="40" w:after="40"/>
+            </w:pPr>
+            <w:r>
+              <w:rPr>
+                <w:b/>
+                <w:color w:val="1F4E79"/>
+                <w:sz w:val="19"/>
+              </w:rPr>
+              <w:t>Datum</w:t>
+            </w:r>
+          </w:p>
+        </w:tc>
+        <w:tc>
+          <w:tcPr>
+            <w:tcW w:w="7704" w:type="dxa"/>
+            <w:tcMar>
+              <w:top w:w="100" w:type="dxa"/>
+              <w:left w:w="100" w:type="dxa"/>
+              <w:bottom w:w="100" w:type="dxa"/>
+              <w:right w:w="100" w:type="dxa"/>
+            </w:tcMar>
+            <w:vAlign w:val="center"/>
+          </w:tcPr>
+          <w:p>
+            <w:pPr>
+              <w:spacing w:before="40" w:after="40"/>
+            </w:pPr>
+            <w:r>
+              <w:rPr>
+                <w:sz w:val="19"/>
+              </w:rPr>
+              <w:t>[TT.MM.JJJJ]</w:t>
+            </w:r>
+          </w:p>
+        </w:tc>
+      </w:tr>
+      <w:tr>
+        <w:trPr>
+          <w:cantSplit/>
+          <w:jc w:val="center"/>
+        </w:trPr>
+        <w:tc>
+          <w:tcPr>
+            <w:tcW w:w="2376" w:type="dxa"/>
+            <w:shd w:val="clear" w:color="auto" w:fill="EEF4F8"/>
+            <w:tcMar>
+              <w:top w:w="100" w:type="dxa"/>
+              <w:left w:w="100" w:type="dxa"/>
+              <w:bottom w:w="100" w:type="dxa"/>
+              <w:right w:w="100" w:type="dxa"/>
+            </w:tcMar>
+            <w:vAlign w:val="center"/>
+          </w:tcPr>
+          <w:p>
+            <w:pPr>
+              <w:spacing w:before="40" w:after="40"/>
+            </w:pPr>
+            <w:r>
+              <w:rPr>
+                <w:b/>
+                <w:color w:val="1F4E79"/>
+                <w:sz w:val="19"/>
+              </w:rPr>
+              <w:t>Build / Commit</w:t>
+            </w:r>
+          </w:p>
+        </w:tc>
+        <w:tc>
+          <w:tcPr>
+            <w:tcW w:w="7704" w:type="dxa"/>
+            <w:tcMar>
+              <w:top w:w="100" w:type="dxa"/>
+              <w:left w:w="100" w:type="dxa"/>
+              <w:bottom w:w="100" w:type="dxa"/>
+              <w:right w:w="100" w:type="dxa"/>
+            </w:tcMar>
+            <w:vAlign w:val="center"/>
+          </w:tcPr>
+          <w:p>
+            <w:pPr>
+              <w:spacing w:before="40" w:after="40"/>
+            </w:pPr>
+            <w:r>
+              <w:rPr>
+                <w:sz w:val="19"/>
+              </w:rPr>
+              <w:t>[z. B. Commit-ID]</w:t>
+            </w:r>
+          </w:p>
+        </w:tc>
+      </w:tr>
+      <w:tr>
+        <w:trPr>
+          <w:cantSplit/>
+          <w:jc w:val="center"/>
+        </w:trPr>
+        <w:tc>
+          <w:tcPr>
+            <w:tcW w:w="2376" w:type="dxa"/>
+            <w:shd w:val="clear" w:color="auto" w:fill="EEF4F8"/>
+            <w:tcMar>
+              <w:top w:w="100" w:type="dxa"/>
+              <w:left w:w="100" w:type="dxa"/>
+              <w:bottom w:w="100" w:type="dxa"/>
+              <w:right w:w="100" w:type="dxa"/>
+            </w:tcMar>
+            <w:vAlign w:val="center"/>
+          </w:tcPr>
+          <w:p>
+            <w:pPr>
+              <w:spacing w:before="40" w:after="40"/>
+            </w:pPr>
+            <w:proofErr w:type="spellStart"/>
+            <w:r>
+              <w:rPr>
+                <w:b/>
+                <w:color w:val="1F4E79"/>
+                <w:sz w:val="19"/>
+              </w:rPr>
+              <w:t>Testframework</w:t>
+            </w:r>
+            <w:proofErr w:type="spellEnd"/>
+          </w:p>
+        </w:tc>
+        <w:tc>
+          <w:tcPr>
+            <w:tcW w:w="7704" w:type="dxa"/>
+            <w:tcMar>
+              <w:top w:w="100" w:type="dxa"/>
+              <w:left w:w="100" w:type="dxa"/>
+              <w:bottom w:w="100" w:type="dxa"/>
+              <w:right w:w="100" w:type="dxa"/>
+            </w:tcMar>
+            <w:vAlign w:val="center"/>
+          </w:tcPr>
+          <w:p>
+            <w:pPr>
+              <w:spacing w:before="40" w:after="40"/>
+            </w:pPr>
+            <w:r>
+              <w:rPr>
+                <w:sz w:val="19"/>
+              </w:rPr>
+              <w:t xml:space="preserve">[z. B. JUnit / </w:t>
+            </w:r>
+            <w:proofErr w:type="spellStart"/>
+            <w:r>
+              <w:rPr>
+                <w:sz w:val="19"/>
+              </w:rPr>
+              <w:t>pytest</w:t>
+            </w:r>
+            <w:proofErr w:type="spellEnd"/>
+            <w:r>
+              <w:rPr>
+                <w:sz w:val="19"/>
+              </w:rPr>
+              <w:t xml:space="preserve"> / Jest]</w:t>
+            </w:r>
+          </w:p>
+        </w:tc>
+      </w:tr>
+      <w:tr>
+        <w:trPr>
+          <w:cantSplit/>
+          <w:jc w:val="center"/>
+        </w:trPr>
+        <w:tc>
+          <w:tcPr>
+            <w:tcW w:w="2376" w:type="dxa"/>
+            <w:shd w:val="clear" w:color="auto" w:fill="EEF4F8"/>
+            <w:tcMar>
+              <w:top w:w="100" w:type="dxa"/>
+              <w:left w:w="100" w:type="dxa"/>
+              <w:bottom w:w="100" w:type="dxa"/>
+              <w:right w:w="100" w:type="dxa"/>
+            </w:tcMar>
+            <w:vAlign w:val="center"/>
+          </w:tcPr>
+          <w:p>
+            <w:pPr>
+              <w:spacing w:before="40" w:after="40"/>
+            </w:pPr>
+            <w:proofErr w:type="spellStart"/>
+            <w:r>
+              <w:rPr>
+                <w:b/>
+                <w:color w:val="1F4E79"/>
+                <w:sz w:val="19"/>
+              </w:rPr>
+              <w:t>Testumfang</w:t>
+            </w:r>
+            <w:proofErr w:type="spellEnd"/>
+          </w:p>
+        </w:tc>
+        <w:tc>
+          <w:tcPr>
+            <w:tcW w:w="7704" w:type="dxa"/>
+            <w:tcMar>
+              <w:top w:w="100" w:type="dxa"/>
+              <w:left w:w="100" w:type="dxa"/>
+              <w:bottom w:w="100" w:type="dxa"/>
+              <w:right w:w="100" w:type="dxa"/>
+            </w:tcMar>
+            <w:vAlign w:val="center"/>
+          </w:tcPr>
+          <w:p>
+            <w:pPr>
+              <w:spacing w:before="40" w:after="40"/>
+            </w:pPr>
+            <w:r>
+              <w:rPr>
+                <w:sz w:val="19"/>
+              </w:rPr>
+              <w:t>[</w:t>
+            </w:r>
+            <w:proofErr w:type="spellStart"/>
+            <w:r>
+              <w:rPr>
+                <w:sz w:val="19"/>
+              </w:rPr>
+              <w:t>Welche</w:t>
+            </w:r>
+            <w:proofErr w:type="spellEnd"/>
+            <w:r>
+              <w:rPr>
+                <w:sz w:val="19"/>
+              </w:rPr>
+              <w:t xml:space="preserve"> Units </w:t>
+            </w:r>
+            <w:proofErr w:type="spellStart"/>
+            <w:r>
+              <w:rPr>
+                <w:sz w:val="19"/>
+              </w:rPr>
+              <w:t>werden</w:t>
+            </w:r>
+            <w:proofErr w:type="spellEnd"/>
+            <w:r>
+              <w:rPr>
+                <w:sz w:val="19"/>
+              </w:rPr>
+              <w:t xml:space="preserve"> </w:t>
+            </w:r>
+            <w:proofErr w:type="spellStart"/>
+            <w:r>
+              <w:rPr>
+                <w:sz w:val="19"/>
+              </w:rPr>
+              <w:t>betrachtet</w:t>
+            </w:r>
+            <w:proofErr w:type="spellEnd"/>
+            <w:r>
+              <w:rPr>
+                <w:sz w:val="19"/>
+              </w:rPr>
+              <w:t>?]</w:t>
+            </w:r>
+          </w:p>
+        </w:tc>
+      </w:tr>
+    </w:tbl>
+    <w:p/>
+    <w:p>
+      <w:pPr>
+        <w:pStyle w:val="berschrift2"/>
+        <w:spacing w:before="160" w:after="120"/>
+      </w:pPr>
+      <w:proofErr w:type="spellStart"/>
+      <w:r>
+        <w:t>Testfälle</w:t>
+      </w:r>
+      <w:proofErr w:type="spellEnd"/>
+    </w:p>
+    <w:tbl>
+      <w:tblPr>
+        <w:tblStyle w:val="Tabellenraster"/>
+        <w:tblW w:w="0" w:type="auto"/>
+        <w:jc w:val="center"/>
+        <w:tblLook w:val="04A0" w:firstRow="1" w:lastRow="0" w:firstColumn="1" w:lastColumn="0" w:noHBand="0" w:noVBand="1"/>
+      </w:tblPr>
+      <w:tblGrid>
+        <w:gridCol w:w="922"/>
+        <w:gridCol w:w="2810"/>
+        <w:gridCol w:w="1170"/>
+        <w:gridCol w:w="1407"/>
+        <w:gridCol w:w="1105"/>
+        <w:gridCol w:w="1231"/>
+        <w:gridCol w:w="1491"/>
+      </w:tblGrid>
+      <w:tr>
+        <w:trPr>
+          <w:cantSplit/>
+          <w:tblHeader/>
+          <w:jc w:val="center"/>
+        </w:trPr>
+        <w:tc>
+          <w:tcPr>
+            <w:tcW w:w="1080" w:type="dxa"/>
+            <w:shd w:val="clear" w:color="auto" w:fill="D9EAF7"/>
+            <w:tcMar>
+              <w:top w:w="100" w:type="dxa"/>
+              <w:left w:w="100" w:type="dxa"/>
+              <w:bottom w:w="100" w:type="dxa"/>
+              <w:right w:w="100" w:type="dxa"/>
+            </w:tcMar>
+            <w:vAlign w:val="center"/>
+          </w:tcPr>
+          <w:p>
+            <w:pPr>
+              <w:spacing w:before="40" w:after="40"/>
+            </w:pPr>
+            <w:proofErr w:type="spellStart"/>
+            <w:r>
+              <w:rPr>
+                <w:b/>
+                <w:color w:val="1F4E79"/>
+                <w:sz w:val="19"/>
+              </w:rPr>
+              <w:t>Testfall</w:t>
+            </w:r>
+            <w:proofErr w:type="spellEnd"/>
+            <w:r>
+              <w:rPr>
+                <w:b/>
+                <w:color w:val="1F4E79"/>
+                <w:sz w:val="19"/>
+              </w:rPr>
+              <w:t>-ID</w:t>
+            </w:r>
+          </w:p>
+        </w:tc>
+        <w:tc>
+          <w:tcPr>
+            <w:tcW w:w="1512" w:type="dxa"/>
+            <w:shd w:val="clear" w:color="auto" w:fill="D9EAF7"/>
+            <w:tcMar>
+              <w:top w:w="100" w:type="dxa"/>
+              <w:left w:w="100" w:type="dxa"/>
+              <w:bottom w:w="100" w:type="dxa"/>
+              <w:right w:w="100" w:type="dxa"/>
+            </w:tcMar>
+            <w:vAlign w:val="center"/>
+          </w:tcPr>
+          <w:p>
+            <w:pPr>
+              <w:spacing w:before="40" w:after="40"/>
+            </w:pPr>
+            <w:r>
+              <w:rPr>
+                <w:b/>
+                <w:color w:val="1F4E79"/>
+                <w:sz w:val="19"/>
+              </w:rPr>
+              <w:t>Unit / Methode</w:t>
+            </w:r>
+          </w:p>
+        </w:tc>
+        <w:tc>
+          <w:tcPr>
+            <w:tcW w:w="1656" w:type="dxa"/>
+            <w:shd w:val="clear" w:color="auto" w:fill="D9EAF7"/>
+            <w:tcMar>
+              <w:top w:w="100" w:type="dxa"/>
+              <w:left w:w="100" w:type="dxa"/>
+              <w:bottom w:w="100" w:type="dxa"/>
+              <w:right w:w="100" w:type="dxa"/>
+            </w:tcMar>
+            <w:vAlign w:val="center"/>
+          </w:tcPr>
+          <w:p>
+            <w:pPr>
+              <w:spacing w:before="40" w:after="40"/>
+            </w:pPr>
+            <w:r>
+              <w:rPr>
+                <w:b/>
+                <w:color w:val="1F4E79"/>
+                <w:sz w:val="19"/>
+              </w:rPr>
+              <w:t>Zweck</w:t>
+            </w:r>
+          </w:p>
+        </w:tc>
+        <w:tc>
+          <w:tcPr>
+            <w:tcW w:w="1512" w:type="dxa"/>
+            <w:shd w:val="clear" w:color="auto" w:fill="D9EAF7"/>
+            <w:tcMar>
+              <w:top w:w="100" w:type="dxa"/>
+              <w:left w:w="100" w:type="dxa"/>
+              <w:bottom w:w="100" w:type="dxa"/>
+              <w:right w:w="100" w:type="dxa"/>
+            </w:tcMar>
+            <w:vAlign w:val="center"/>
+          </w:tcPr>
+          <w:p>
+            <w:pPr>
+              <w:spacing w:before="40" w:after="40"/>
+            </w:pPr>
+            <w:proofErr w:type="spellStart"/>
+            <w:r>
+              <w:rPr>
+                <w:b/>
+                <w:color w:val="1F4E79"/>
+                <w:sz w:val="19"/>
+              </w:rPr>
+              <w:t>Vorbedingung</w:t>
+            </w:r>
+            <w:proofErr w:type="spellEnd"/>
+          </w:p>
+        </w:tc>
+        <w:tc>
+          <w:tcPr>
+            <w:tcW w:w="1800" w:type="dxa"/>
+            <w:shd w:val="clear" w:color="auto" w:fill="D9EAF7"/>
+            <w:tcMar>
+              <w:top w:w="100" w:type="dxa"/>
+              <w:left w:w="100" w:type="dxa"/>
+              <w:bottom w:w="100" w:type="dxa"/>
+              <w:right w:w="100" w:type="dxa"/>
+            </w:tcMar>
+            <w:vAlign w:val="center"/>
+          </w:tcPr>
+          <w:p>
+            <w:pPr>
+              <w:spacing w:before="40" w:after="40"/>
+            </w:pPr>
+            <w:proofErr w:type="spellStart"/>
+            <w:r>
+              <w:rPr>
+                <w:b/>
+                <w:color w:val="1F4E79"/>
+                <w:sz w:val="19"/>
+              </w:rPr>
+              <w:t>Eingabe</w:t>
+            </w:r>
+            <w:proofErr w:type="spellEnd"/>
+            <w:r>
+              <w:rPr>
+                <w:b/>
+                <w:color w:val="1F4E79"/>
+                <w:sz w:val="19"/>
+              </w:rPr>
+              <w:t xml:space="preserve"> / </w:t>
+            </w:r>
+            <w:proofErr w:type="spellStart"/>
+            <w:r>
+              <w:rPr>
+                <w:b/>
+                <w:color w:val="1F4E79"/>
+                <w:sz w:val="19"/>
+              </w:rPr>
+              <w:t>Testdaten</w:t>
+            </w:r>
+            <w:proofErr w:type="spellEnd"/>
+          </w:p>
+        </w:tc>
+        <w:tc>
+          <w:tcPr>
+            <w:tcW w:w="1872" w:type="dxa"/>
+            <w:shd w:val="clear" w:color="auto" w:fill="D9EAF7"/>
+            <w:tcMar>
+              <w:top w:w="100" w:type="dxa"/>
+              <w:left w:w="100" w:type="dxa"/>
+              <w:bottom w:w="100" w:type="dxa"/>
+              <w:right w:w="100" w:type="dxa"/>
+            </w:tcMar>
+            <w:vAlign w:val="center"/>
+          </w:tcPr>
+          <w:p>
+            <w:pPr>
+              <w:spacing w:before="40" w:after="40"/>
+            </w:pPr>
+            <w:proofErr w:type="spellStart"/>
+            <w:r>
+              <w:rPr>
+                <w:b/>
+                <w:color w:val="1F4E79"/>
+                <w:sz w:val="19"/>
+              </w:rPr>
+              <w:t>Erwartetes</w:t>
+            </w:r>
+            <w:proofErr w:type="spellEnd"/>
+            <w:r>
+              <w:rPr>
+                <w:b/>
+                <w:color w:val="1F4E79"/>
+                <w:sz w:val="19"/>
+              </w:rPr>
+              <w:t xml:space="preserve"> </w:t>
+            </w:r>
+            <w:proofErr w:type="spellStart"/>
+            <w:r>
+              <w:rPr>
+                <w:b/>
+                <w:color w:val="1F4E79"/>
+                <w:sz w:val="19"/>
+              </w:rPr>
+              <w:t>Ergebnis</w:t>
+            </w:r>
+            <w:proofErr w:type="spellEnd"/>
+          </w:p>
+        </w:tc>
+        <w:tc>
+          <w:tcPr>
+            <w:tcW w:w="1368" w:type="dxa"/>
+            <w:shd w:val="clear" w:color="auto" w:fill="D9EAF7"/>
+            <w:tcMar>
+              <w:top w:w="100" w:type="dxa"/>
+              <w:left w:w="100" w:type="dxa"/>
+              <w:bottom w:w="100" w:type="dxa"/>
+              <w:right w:w="100" w:type="dxa"/>
+            </w:tcMar>
+            <w:vAlign w:val="center"/>
+          </w:tcPr>
+          <w:p>
+            <w:pPr>
+              <w:spacing w:before="40" w:after="40"/>
+            </w:pPr>
+            <w:r>
+              <w:rPr>
+                <w:b/>
+                <w:color w:val="1F4E79"/>
+                <w:sz w:val="19"/>
+              </w:rPr>
+              <w:t>Status</w:t>
+            </w:r>
+          </w:p>
+        </w:tc>
+      </w:tr>
+      <w:tr>
+        <w:trPr>
+          <w:cantSplit/>
+          <w:jc w:val="center"/>
+        </w:trPr>
+        <w:tc>
+          <w:tcPr>
+            <w:tcW w:w="1080" w:type="dxa"/>
+            <w:tcMar>
+              <w:top w:w="100" w:type="dxa"/>
+              <w:left w:w="100" w:type="dxa"/>
+              <w:bottom w:w="100" w:type="dxa"/>
+              <w:right w:w="100" w:type="dxa"/>
+            </w:tcMar>
+            <w:vAlign w:val="center"/>
+          </w:tcPr>
+          <w:p>
+            <w:pPr>
+              <w:spacing w:before="40" w:after="40"/>
+            </w:pPr>
+            <w:r>
+              <w:rPr>
+                <w:sz w:val="19"/>
+              </w:rPr>
+              <w:t>UT-</w:t>
+            </w:r>
+            <w:r>
+              <w:rPr>
+                <w:sz w:val="19"/>
+              </w:rPr>
+              <w:t>01</w:t>
+            </w:r>
+          </w:p>
+        </w:tc>
+        <w:tc>
+          <w:tcPr>
+            <w:tcW w:w="1512" w:type="dxa"/>
+            <w:tcMar>
+              <w:top w:w="100" w:type="dxa"/>
+              <w:left w:w="100" w:type="dxa"/>
+              <w:bottom w:w="100" w:type="dxa"/>
+              <w:right w:w="100" w:type="dxa"/>
+            </w:tcMar>
+            <w:vAlign w:val="center"/>
+          </w:tcPr>
+          <w:p>
+            <w:pPr>
+              <w:spacing w:before="40" w:after="40"/>
+            </w:pPr>
+            <w:proofErr w:type="spellStart"/>
+            <w:proofErr w:type="gramStart"/>
+            <w:r>
+              <w:t>pruefeTabellen</w:t>
+            </w:r>
+            <w:proofErr w:type="spellEnd"/>
+            <w:r>
+              <w:t>(</w:t>
+            </w:r>
+            <w:proofErr w:type="gramEnd"/>
+            <w:r>
+              <w:t>Connection connection)</w:t>
+            </w:r>
+          </w:p>
+          <w:p>
+            <w:pPr>
+              <w:spacing w:before="40" w:after="40"/>
+            </w:pPr>
+          </w:p>
+        </w:tc>
+        <w:tc>
+          <w:tcPr>
+            <w:tcW w:w="1656" w:type="dxa"/>
+            <w:tcMar>
+              <w:top w:w="100" w:type="dxa"/>
+              <w:left w:w="100" w:type="dxa"/>
+              <w:bottom w:w="100" w:type="dxa"/>
+              <w:right w:w="100" w:type="dxa"/>
+            </w:tcMar>
+            <w:vAlign w:val="center"/>
+          </w:tcPr>
+          <w:p>
+            <w:pPr>
+              <w:spacing w:before="40" w:after="40"/>
+              <w:rPr>
+                <w:lang w:val="de-DE"/>
+              </w:rPr>
+            </w:pPr>
+            <w:r>
+              <w:rPr>
+                <w:sz w:val="19"/>
+                <w:lang w:val="de-DE"/>
+              </w:rPr>
+              <w:t>Es wird geprüft</w:t>
+            </w:r>
+            <w:r>
+              <w:rPr>
+                <w:sz w:val="19"/>
+                <w:lang w:val="de-DE"/>
+              </w:rPr>
+              <w:t xml:space="preserve"> ob a</w:t>
+            </w:r>
+            <w:r>
+              <w:rPr>
+                <w:sz w:val="19"/>
+                <w:lang w:val="de-DE"/>
+              </w:rPr>
+              <w:t xml:space="preserve">lle Tabellen vorhanden </w:t>
+            </w:r>
+            <w:proofErr w:type="gramStart"/>
+            <w:r>
+              <w:rPr>
+                <w:sz w:val="19"/>
+                <w:lang w:val="de-DE"/>
+              </w:rPr>
+              <w:t>sind</w:t>
+            </w:r>
+            <w:proofErr w:type="gramEnd"/>
+          </w:p>
+        </w:tc>
+        <w:tc>
+          <w:tcPr>
+            <w:tcW w:w="1512" w:type="dxa"/>
+            <w:tcMar>
+              <w:top w:w="100" w:type="dxa"/>
+              <w:left w:w="100" w:type="dxa"/>
+              <w:bottom w:w="100" w:type="dxa"/>
+              <w:right w:w="100" w:type="dxa"/>
+            </w:tcMar>
+            <w:vAlign w:val="center"/>
+          </w:tcPr>
+          <w:p>
+            <w:pPr>
+              <w:spacing w:before="40" w:after="40"/>
+            </w:pPr>
+            <w:r>
+              <w:rPr>
+                <w:sz w:val="19"/>
+              </w:rPr>
+              <w:t xml:space="preserve">DB und Software </w:t>
+            </w:r>
+            <w:proofErr w:type="spellStart"/>
+            <w:r>
+              <w:rPr>
+                <w:sz w:val="19"/>
+              </w:rPr>
+              <w:t>vorhanden</w:t>
+            </w:r>
+            <w:proofErr w:type="spellEnd"/>
+          </w:p>
+        </w:tc>
+        <w:tc>
+          <w:tcPr>
+            <w:tcW w:w="1800" w:type="dxa"/>
+            <w:tcMar>
+              <w:top w:w="100" w:type="dxa"/>
+              <w:left w:w="100" w:type="dxa"/>
+              <w:bottom w:w="100" w:type="dxa"/>
+              <w:right w:w="100" w:type="dxa"/>
+            </w:tcMar>
+            <w:vAlign w:val="center"/>
+          </w:tcPr>
+          <w:p>
+            <w:pPr>
+              <w:spacing w:before="40" w:after="40"/>
+            </w:pPr>
+            <w:r>
+              <w:t>/</w:t>
+            </w:r>
+          </w:p>
+        </w:tc>
+        <w:tc>
+          <w:tcPr>
+            <w:tcW w:w="1872" w:type="dxa"/>
+            <w:tcMar>
+              <w:top w:w="100" w:type="dxa"/>
+              <w:left w:w="100" w:type="dxa"/>
+              <w:bottom w:w="100" w:type="dxa"/>
+              <w:right w:w="100" w:type="dxa"/>
+            </w:tcMar>
+            <w:vAlign w:val="center"/>
+          </w:tcPr>
+          <w:p>
+            <w:pPr>
+              <w:spacing w:before="40" w:after="40"/>
+            </w:pPr>
+            <w:r>
+              <w:rPr>
+                <w:sz w:val="19"/>
+              </w:rPr>
+              <w:t xml:space="preserve">Es </w:t>
+            </w:r>
+            <w:proofErr w:type="spellStart"/>
+            <w:r>
+              <w:rPr>
+                <w:sz w:val="19"/>
+              </w:rPr>
+              <w:t>wird</w:t>
+            </w:r>
+            <w:proofErr w:type="spellEnd"/>
+            <w:r>
+              <w:rPr>
+                <w:sz w:val="19"/>
+              </w:rPr>
+              <w:t xml:space="preserve"> </w:t>
+            </w:r>
+            <w:proofErr w:type="spellStart"/>
+            <w:r>
+              <w:rPr>
+                <w:sz w:val="19"/>
+              </w:rPr>
+              <w:t>nichts</w:t>
+            </w:r>
+            <w:proofErr w:type="spellEnd"/>
+            <w:r>
+              <w:rPr>
+                <w:sz w:val="19"/>
+              </w:rPr>
+              <w:t xml:space="preserve"> </w:t>
+            </w:r>
+            <w:proofErr w:type="spellStart"/>
+            <w:r>
+              <w:rPr>
+                <w:sz w:val="19"/>
+              </w:rPr>
+              <w:t>ausgegeben</w:t>
+            </w:r>
+            <w:proofErr w:type="spellEnd"/>
+          </w:p>
+        </w:tc>
+        <w:tc>
+          <w:tcPr>
+            <w:tcW w:w="1368" w:type="dxa"/>
+            <w:tcMar>
+              <w:top w:w="100" w:type="dxa"/>
+              <w:left w:w="100" w:type="dxa"/>
+              <w:bottom w:w="100" w:type="dxa"/>
+              <w:right w:w="100" w:type="dxa"/>
+            </w:tcMar>
+            <w:vAlign w:val="center"/>
+          </w:tcPr>
+          <w:p>
+            <w:pPr>
+              <w:spacing w:before="40" w:after="40"/>
+            </w:pPr>
+            <w:proofErr w:type="spellStart"/>
+            <w:r>
+              <w:rPr>
+                <w:sz w:val="19"/>
+              </w:rPr>
+              <w:t>Bestanden</w:t>
+            </w:r>
+            <w:proofErr w:type="spellEnd"/>
+            <w:r>
+              <w:rPr>
+                <w:sz w:val="19"/>
+              </w:rPr>
+              <w:t xml:space="preserve"> </w:t>
+            </w:r>
+          </w:p>
+        </w:tc>
+      </w:tr>
+      <w:tr>
+        <w:trPr>
+          <w:cantSplit/>
+          <w:jc w:val="center"/>
+        </w:trPr>
+        <w:tc>
+          <w:tcPr>
+            <w:tcW w:w="1080" w:type="dxa"/>
+            <w:tcMar>
+              <w:top w:w="100" w:type="dxa"/>
+              <w:left w:w="100" w:type="dxa"/>
+              <w:bottom w:w="100" w:type="dxa"/>
+              <w:right w:w="100" w:type="dxa"/>
+            </w:tcMar>
+            <w:vAlign w:val="center"/>
+          </w:tcPr>
+          <w:p>
+            <w:pPr>
+              <w:spacing w:before="40" w:after="40"/>
+            </w:pPr>
+            <w:r>
+              <w:rPr>
+                <w:sz w:val="19"/>
+              </w:rPr>
+              <w:t>UT-XXX</w:t>
+            </w:r>
+          </w:p>
+        </w:tc>
+        <w:tc>
+          <w:tcPr>
+            <w:tcW w:w="1512" w:type="dxa"/>
+            <w:tcMar>
+              <w:top w:w="100" w:type="dxa"/>
+              <w:left w:w="100" w:type="dxa"/>
+              <w:bottom w:w="100" w:type="dxa"/>
+              <w:right w:w="100" w:type="dxa"/>
+            </w:tcMar>
+            <w:vAlign w:val="center"/>
+          </w:tcPr>
+          <w:p>
+            <w:pPr>
+              <w:spacing w:before="40" w:after="40"/>
+            </w:pPr>
+            <w:r>
+              <w:rPr>
+                <w:sz w:val="19"/>
+              </w:rPr>
+              <w:t xml:space="preserve">z. B. </w:t>
+            </w:r>
+            <w:proofErr w:type="spellStart"/>
+            <w:r>
+              <w:rPr>
+                <w:sz w:val="19"/>
+              </w:rPr>
+              <w:t>MitarbeiterService.create</w:t>
+            </w:r>
+            <w:proofErr w:type="spellEnd"/>
+            <w:r>
+              <w:rPr>
+                <w:sz w:val="19"/>
+              </w:rPr>
+              <w:t>()</w:t>
+            </w:r>
+          </w:p>
+        </w:tc>
+        <w:tc>
+          <w:tcPr>
+            <w:tcW w:w="1656" w:type="dxa"/>
+            <w:tcMar>
+              <w:top w:w="100" w:type="dxa"/>
+              <w:left w:w="100" w:type="dxa"/>
+              <w:bottom w:w="100" w:type="dxa"/>
+              <w:right w:w="100" w:type="dxa"/>
+            </w:tcMar>
+            <w:vAlign w:val="center"/>
+          </w:tcPr>
+          <w:p>
+            <w:pPr>
+              <w:spacing w:before="40" w:after="40"/>
+            </w:pPr>
+            <w:proofErr w:type="spellStart"/>
+            <w:proofErr w:type="gramStart"/>
+            <w:r>
+              <w:rPr>
+                <w:sz w:val="19"/>
+              </w:rPr>
+              <w:t>Beschreibt</w:t>
+            </w:r>
+            <w:proofErr w:type="spellEnd"/>
+            <w:r>
+              <w:rPr>
+                <w:sz w:val="19"/>
+              </w:rPr>
+              <w:t>,</w:t>
+            </w:r>
+            <w:proofErr w:type="gramEnd"/>
+            <w:r>
+              <w:rPr>
+                <w:sz w:val="19"/>
+              </w:rPr>
+              <w:t xml:space="preserve"> was </w:t>
+            </w:r>
+            <w:proofErr w:type="spellStart"/>
+            <w:r>
+              <w:rPr>
+                <w:sz w:val="19"/>
+              </w:rPr>
+              <w:t>geprüft</w:t>
+            </w:r>
+            <w:proofErr w:type="spellEnd"/>
+            <w:r>
+              <w:rPr>
+                <w:sz w:val="19"/>
+              </w:rPr>
+              <w:t xml:space="preserve"> </w:t>
+            </w:r>
+            <w:proofErr w:type="spellStart"/>
+            <w:r>
+              <w:rPr>
+                <w:sz w:val="19"/>
+              </w:rPr>
+              <w:t>wird</w:t>
+            </w:r>
+            <w:proofErr w:type="spellEnd"/>
+            <w:r>
+              <w:rPr>
+                <w:sz w:val="19"/>
+              </w:rPr>
+              <w:t>.</w:t>
+            </w:r>
+          </w:p>
+        </w:tc>
+        <w:tc>
+          <w:tcPr>
+            <w:tcW w:w="1512" w:type="dxa"/>
+            <w:tcMar>
+              <w:top w:w="100" w:type="dxa"/>
+              <w:left w:w="100" w:type="dxa"/>
+              <w:bottom w:w="100" w:type="dxa"/>
+              <w:right w:w="100" w:type="dxa"/>
+            </w:tcMar>
+            <w:vAlign w:val="center"/>
+          </w:tcPr>
+          <w:p>
+            <w:pPr>
+              <w:spacing w:before="40" w:after="40"/>
+            </w:pPr>
+            <w:proofErr w:type="spellStart"/>
+            <w:r>
+              <w:rPr>
+                <w:sz w:val="19"/>
+              </w:rPr>
+              <w:t>Relevante</w:t>
+            </w:r>
+            <w:proofErr w:type="spellEnd"/>
+            <w:r>
+              <w:rPr>
+                <w:sz w:val="19"/>
+              </w:rPr>
+              <w:t xml:space="preserve"> </w:t>
+            </w:r>
+            <w:proofErr w:type="spellStart"/>
+            <w:r>
+              <w:rPr>
+                <w:sz w:val="19"/>
+              </w:rPr>
+              <w:t>Objekte</w:t>
+            </w:r>
+            <w:proofErr w:type="spellEnd"/>
+            <w:r>
+              <w:rPr>
+                <w:sz w:val="19"/>
+              </w:rPr>
+              <w:t xml:space="preserve"> / Mocks </w:t>
+            </w:r>
+            <w:proofErr w:type="spellStart"/>
+            <w:r>
+              <w:rPr>
+                <w:sz w:val="19"/>
+              </w:rPr>
+              <w:t>vorhanden</w:t>
+            </w:r>
+            <w:proofErr w:type="spellEnd"/>
+            <w:r>
+              <w:rPr>
+                <w:sz w:val="19"/>
+              </w:rPr>
+              <w:t>.</w:t>
+            </w:r>
+          </w:p>
+        </w:tc>
+        <w:tc>
+          <w:tcPr>
+            <w:tcW w:w="1800" w:type="dxa"/>
+            <w:tcMar>
+              <w:top w:w="100" w:type="dxa"/>
+              <w:left w:w="100" w:type="dxa"/>
+              <w:bottom w:w="100" w:type="dxa"/>
+              <w:right w:w="100" w:type="dxa"/>
+            </w:tcMar>
+            <w:vAlign w:val="center"/>
+          </w:tcPr>
+          <w:p>
+            <w:pPr>
+              <w:spacing w:before="40" w:after="40"/>
+            </w:pPr>
+            <w:proofErr w:type="spellStart"/>
+            <w:r>
+              <w:rPr>
+                <w:sz w:val="19"/>
+              </w:rPr>
+              <w:t>Konkrete</w:t>
+            </w:r>
+            <w:proofErr w:type="spellEnd"/>
+            <w:r>
+              <w:rPr>
+                <w:sz w:val="19"/>
+              </w:rPr>
+              <w:t xml:space="preserve"> </w:t>
+            </w:r>
+            <w:proofErr w:type="spellStart"/>
+            <w:r>
+              <w:rPr>
+                <w:sz w:val="19"/>
+              </w:rPr>
+              <w:t>Testwerte</w:t>
+            </w:r>
+            <w:proofErr w:type="spellEnd"/>
+            <w:r>
+              <w:rPr>
+                <w:sz w:val="19"/>
+              </w:rPr>
+              <w:t xml:space="preserve"> </w:t>
+            </w:r>
+            <w:proofErr w:type="spellStart"/>
+            <w:r>
+              <w:rPr>
+                <w:sz w:val="19"/>
+              </w:rPr>
+              <w:t>eintragen</w:t>
+            </w:r>
+            <w:proofErr w:type="spellEnd"/>
+            <w:r>
+              <w:rPr>
+                <w:sz w:val="19"/>
+              </w:rPr>
+              <w:t>.</w:t>
+            </w:r>
+          </w:p>
+        </w:tc>
+        <w:tc>
+          <w:tcPr>
+            <w:tcW w:w="1872" w:type="dxa"/>
+            <w:tcMar>
+              <w:top w:w="100" w:type="dxa"/>
+              <w:left w:w="100" w:type="dxa"/>
+              <w:bottom w:w="100" w:type="dxa"/>
+              <w:right w:w="100" w:type="dxa"/>
+            </w:tcMar>
+            <w:vAlign w:val="center"/>
+          </w:tcPr>
+          <w:p>
+            <w:pPr>
+              <w:spacing w:before="40" w:after="40"/>
+            </w:pPr>
+            <w:proofErr w:type="spellStart"/>
+            <w:r>
+              <w:rPr>
+                <w:sz w:val="19"/>
+              </w:rPr>
+              <w:t>Konkretes</w:t>
+            </w:r>
+            <w:proofErr w:type="spellEnd"/>
+            <w:r>
+              <w:rPr>
+                <w:sz w:val="19"/>
+              </w:rPr>
+              <w:t xml:space="preserve"> </w:t>
+            </w:r>
+            <w:proofErr w:type="spellStart"/>
+            <w:r>
+              <w:rPr>
+                <w:sz w:val="19"/>
+              </w:rPr>
+              <w:t>erwartetes</w:t>
+            </w:r>
+            <w:proofErr w:type="spellEnd"/>
+            <w:r>
+              <w:rPr>
+                <w:sz w:val="19"/>
+              </w:rPr>
+              <w:t xml:space="preserve"> </w:t>
+            </w:r>
+            <w:proofErr w:type="spellStart"/>
+            <w:r>
+              <w:rPr>
+                <w:sz w:val="19"/>
+              </w:rPr>
+              <w:t>Verhalten</w:t>
+            </w:r>
+            <w:proofErr w:type="spellEnd"/>
+            <w:r>
+              <w:rPr>
+                <w:sz w:val="19"/>
+              </w:rPr>
+              <w:t xml:space="preserve"> </w:t>
+            </w:r>
+            <w:proofErr w:type="spellStart"/>
+            <w:r>
+              <w:rPr>
+                <w:sz w:val="19"/>
+              </w:rPr>
+              <w:t>eintragen</w:t>
+            </w:r>
+            <w:proofErr w:type="spellEnd"/>
+            <w:r>
+              <w:rPr>
+                <w:sz w:val="19"/>
+              </w:rPr>
+              <w:t>.</w:t>
+            </w:r>
+          </w:p>
+        </w:tc>
+        <w:tc>
+          <w:tcPr>
+            <w:tcW w:w="1368" w:type="dxa"/>
+            <w:tcMar>
+              <w:top w:w="100" w:type="dxa"/>
+              <w:left w:w="100" w:type="dxa"/>
+              <w:bottom w:w="100" w:type="dxa"/>
+              <w:right w:w="100" w:type="dxa"/>
+            </w:tcMar>
+            <w:vAlign w:val="center"/>
+          </w:tcPr>
+          <w:p>
+            <w:pPr>
+              <w:spacing w:before="40" w:after="40"/>
+            </w:pPr>
+            <w:r>
+              <w:rPr>
+                <w:sz w:val="19"/>
+              </w:rPr>
+              <w:t xml:space="preserve">☐ </w:t>
+            </w:r>
+            <w:proofErr w:type="gramStart"/>
+            <w:r>
+              <w:rPr>
+                <w:sz w:val="19"/>
+              </w:rPr>
+              <w:t>Offen  ☐</w:t>
+            </w:r>
+            <w:proofErr w:type="gramEnd"/>
+            <w:r>
+              <w:rPr>
+                <w:sz w:val="19"/>
+              </w:rPr>
+              <w:t xml:space="preserve"> </w:t>
+            </w:r>
+            <w:proofErr w:type="spellStart"/>
+            <w:proofErr w:type="gramStart"/>
+            <w:r>
+              <w:rPr>
+                <w:sz w:val="19"/>
+              </w:rPr>
+              <w:t>Bestanden</w:t>
+            </w:r>
+            <w:proofErr w:type="spellEnd"/>
+            <w:r>
+              <w:rPr>
+                <w:sz w:val="19"/>
+              </w:rPr>
+              <w:t xml:space="preserve">  ☐</w:t>
+            </w:r>
+            <w:proofErr w:type="gramEnd"/>
+            <w:r>
+              <w:rPr>
+                <w:sz w:val="19"/>
+              </w:rPr>
+              <w:t xml:space="preserve"> </w:t>
+            </w:r>
+            <w:proofErr w:type="spellStart"/>
+            <w:r>
+              <w:rPr>
+                <w:sz w:val="19"/>
+              </w:rPr>
+              <w:t>Fehlgeschlagen</w:t>
+            </w:r>
+            <w:proofErr w:type="spellEnd"/>
+          </w:p>
+        </w:tc>
+      </w:tr>
+    </w:tbl>
+    <w:p>
+      <w:pPr>
+        <w:pStyle w:val="berschrift2"/>
+        <w:spacing w:before="160" w:after="120"/>
+      </w:pPr>
+      <w:proofErr w:type="spellStart"/>
+      <w:r>
+        <w:t>Spezielle</w:t>
+      </w:r>
+      <w:proofErr w:type="spellEnd"/>
+      <w:r>
+        <w:t xml:space="preserve"> </w:t>
+      </w:r>
+      <w:proofErr w:type="spellStart"/>
+      <w:r>
+        <w:t>Prüfaspekte</w:t>
+      </w:r>
+      <w:proofErr w:type="spellEnd"/>
+    </w:p>
+    <w:p>
+      <w:pPr>
+        <w:pStyle w:val="Aufzhlungszeichen"/>
+        <w:rPr>
+          <w:lang w:val="de-DE"/>
+        </w:rPr>
+      </w:pPr>
+      <w:r>
+        <w:rPr>
+          <w:lang w:val="de-DE"/>
+        </w:rPr>
+        <w:t>Ob die Datenbank vollständig ist</w:t>
+      </w:r>
+    </w:p>
+    <w:p>
+      <w:pPr>
+        <w:pStyle w:val="Aufzhlungszeichen"/>
+        <w:rPr>
+          <w:lang w:val="de-DE"/>
+        </w:rPr>
+      </w:pPr>
+      <w:r>
+        <w:rPr>
+          <w:lang w:val="de-DE"/>
+        </w:rPr>
+        <w:t>Ob die Verbindung funktioniert</w:t>
+      </w:r>
+    </w:p>
+    <w:p>
+      <w:pPr>
+        <w:pStyle w:val="Aufzhlungszeichen"/>
+        <w:rPr>
+          <w:lang w:val="de-DE"/>
+        </w:rPr>
+      </w:pPr>
+    </w:p>
+    <w:p>
+      <w:pPr>
+        <w:pStyle w:val="berschrift2"/>
+        <w:spacing w:before="160" w:after="120"/>
+      </w:pPr>
+      <w:proofErr w:type="spellStart"/>
+      <w:r>
+        <w:lastRenderedPageBreak/>
+        <w:t>Ergebnisse</w:t>
+      </w:r>
+      <w:proofErr w:type="spellEnd"/>
+      <w:r>
+        <w:t xml:space="preserve"> / </w:t>
+      </w:r>
+      <w:proofErr w:type="spellStart"/>
+      <w:r>
+        <w:t>Auffälligkeiten</w:t>
+      </w:r>
+      <w:proofErr w:type="spellEnd"/>
+    </w:p>
+    <w:tbl>
+      <w:tblPr>
+        <w:tblStyle w:val="Tabellenraster"/>
+        <w:tblW w:w="0" w:type="auto"/>
+        <w:jc w:val="center"/>
+        <w:tblLook w:val="04A0" w:firstRow="1" w:lastRow="0" w:firstColumn="1" w:lastColumn="0" w:noHBand="0" w:noVBand="1"/>
+      </w:tblPr>
+      <w:tblGrid>
+        <w:gridCol w:w="1296"/>
+        <w:gridCol w:w="3672"/>
+        <w:gridCol w:w="3168"/>
+        <w:gridCol w:w="1800"/>
+      </w:tblGrid>
+      <w:tr>
+        <w:trPr>
+          <w:cantSplit/>
+          <w:tblHeader/>
+          <w:jc w:val="center"/>
+        </w:trPr>
+        <w:tc>
+          <w:tcPr>
+            <w:tcW w:w="1296" w:type="dxa"/>
+            <w:shd w:val="clear" w:color="auto" w:fill="D9EAF7"/>
+            <w:tcMar>
+              <w:top w:w="100" w:type="dxa"/>
+              <w:left w:w="100" w:type="dxa"/>
+              <w:bottom w:w="100" w:type="dxa"/>
+              <w:right w:w="100" w:type="dxa"/>
+            </w:tcMar>
+            <w:vAlign w:val="center"/>
+          </w:tcPr>
+          <w:p>
+            <w:pPr>
+              <w:spacing w:before="40" w:after="40"/>
+            </w:pPr>
+            <w:proofErr w:type="spellStart"/>
+            <w:r>
+              <w:rPr>
+                <w:b/>
+                <w:color w:val="1F4E79"/>
+                <w:sz w:val="19"/>
+              </w:rPr>
+              <w:t>Referenz</w:t>
+            </w:r>
+            <w:proofErr w:type="spellEnd"/>
+          </w:p>
+        </w:tc>
+        <w:tc>
+          <w:tcPr>
+            <w:tcW w:w="3672" w:type="dxa"/>
+            <w:shd w:val="clear" w:color="auto" w:fill="D9EAF7"/>
+            <w:tcMar>
+              <w:top w:w="100" w:type="dxa"/>
+              <w:left w:w="100" w:type="dxa"/>
+              <w:bottom w:w="100" w:type="dxa"/>
+              <w:right w:w="100" w:type="dxa"/>
+            </w:tcMar>
+            <w:vAlign w:val="center"/>
+          </w:tcPr>
+          <w:p>
+            <w:pPr>
+              <w:spacing w:before="40" w:after="40"/>
+            </w:pPr>
+            <w:proofErr w:type="spellStart"/>
+            <w:r>
+              <w:rPr>
+                <w:b/>
+                <w:color w:val="1F4E79"/>
+                <w:sz w:val="19"/>
+              </w:rPr>
+              <w:t>Beobachtung</w:t>
+            </w:r>
+            <w:proofErr w:type="spellEnd"/>
+          </w:p>
+        </w:tc>
+        <w:tc>
+          <w:tcPr>
+            <w:tcW w:w="3168" w:type="dxa"/>
+            <w:shd w:val="clear" w:color="auto" w:fill="D9EAF7"/>
+            <w:tcMar>
+              <w:top w:w="100" w:type="dxa"/>
+              <w:left w:w="100" w:type="dxa"/>
+              <w:bottom w:w="100" w:type="dxa"/>
+              <w:right w:w="100" w:type="dxa"/>
+            </w:tcMar>
+            <w:vAlign w:val="center"/>
+          </w:tcPr>
+          <w:p>
+            <w:pPr>
+              <w:spacing w:before="40" w:after="40"/>
+            </w:pPr>
+            <w:proofErr w:type="spellStart"/>
+            <w:r>
+              <w:rPr>
+                <w:b/>
+                <w:color w:val="1F4E79"/>
+                <w:sz w:val="19"/>
+              </w:rPr>
+              <w:t>Maßnahme</w:t>
+            </w:r>
+            <w:proofErr w:type="spellEnd"/>
+            <w:r>
+              <w:rPr>
+                <w:b/>
+                <w:color w:val="1F4E79"/>
+                <w:sz w:val="19"/>
+              </w:rPr>
+              <w:t xml:space="preserve"> / Ticket</w:t>
+            </w:r>
+          </w:p>
+        </w:tc>
+        <w:tc>
+          <w:tcPr>
+            <w:tcW w:w="1800" w:type="dxa"/>
+            <w:shd w:val="clear" w:color="auto" w:fill="D9EAF7"/>
+            <w:tcMar>
+              <w:top w:w="100" w:type="dxa"/>
+              <w:left w:w="100" w:type="dxa"/>
+              <w:bottom w:w="100" w:type="dxa"/>
+              <w:right w:w="100" w:type="dxa"/>
+            </w:tcMar>
+            <w:vAlign w:val="center"/>
+          </w:tcPr>
+          <w:p>
+            <w:pPr>
+              <w:spacing w:before="40" w:after="40"/>
+            </w:pPr>
+            <w:r>
+              <w:rPr>
+                <w:b/>
+                <w:color w:val="1F4E79"/>
+                <w:sz w:val="19"/>
+              </w:rPr>
+              <w:t>Status</w:t>
+            </w:r>
+          </w:p>
+        </w:tc>
+      </w:tr>
+      <w:tr>
+        <w:trPr>
+          <w:cantSplit/>
+          <w:jc w:val="center"/>
+        </w:trPr>
+        <w:tc>
+          <w:tcPr>
+            <w:tcW w:w="1296" w:type="dxa"/>
+            <w:tcMar>
+              <w:top w:w="100" w:type="dxa"/>
+              <w:left w:w="100" w:type="dxa"/>
+              <w:bottom w:w="100" w:type="dxa"/>
+              <w:right w:w="100" w:type="dxa"/>
+            </w:tcMar>
+            <w:vAlign w:val="center"/>
+          </w:tcPr>
+          <w:p>
+            <w:pPr>
+              <w:spacing w:before="40" w:after="40"/>
+            </w:pPr>
+            <w:r>
+              <w:rPr>
+                <w:sz w:val="19"/>
+              </w:rPr>
+              <w:t>[UT-ID]</w:t>
+            </w:r>
+          </w:p>
+        </w:tc>
+        <w:tc>
+          <w:tcPr>
+            <w:tcW w:w="3672" w:type="dxa"/>
+            <w:tcMar>
+              <w:top w:w="100" w:type="dxa"/>
+              <w:left w:w="100" w:type="dxa"/>
+              <w:bottom w:w="100" w:type="dxa"/>
+              <w:right w:w="100" w:type="dxa"/>
+            </w:tcMar>
+            <w:vAlign w:val="center"/>
+          </w:tcPr>
+          <w:p>
+            <w:pPr>
+              <w:spacing w:before="40" w:after="40"/>
+            </w:pPr>
+            <w:r>
+              <w:rPr>
+                <w:sz w:val="19"/>
+              </w:rPr>
+              <w:t>[</w:t>
+            </w:r>
+            <w:proofErr w:type="spellStart"/>
+            <w:r>
+              <w:rPr>
+                <w:sz w:val="19"/>
+              </w:rPr>
+              <w:t>Ergebnis</w:t>
+            </w:r>
+            <w:proofErr w:type="spellEnd"/>
+            <w:r>
+              <w:rPr>
+                <w:sz w:val="19"/>
+              </w:rPr>
+              <w:t xml:space="preserve"> oder </w:t>
+            </w:r>
+            <w:proofErr w:type="spellStart"/>
+            <w:r>
+              <w:rPr>
+                <w:sz w:val="19"/>
+              </w:rPr>
+              <w:t>Auffälligkeit</w:t>
+            </w:r>
+            <w:proofErr w:type="spellEnd"/>
+            <w:r>
+              <w:rPr>
+                <w:sz w:val="19"/>
+              </w:rPr>
+              <w:t>]</w:t>
+            </w:r>
+          </w:p>
+        </w:tc>
+        <w:tc>
+          <w:tcPr>
+            <w:tcW w:w="3168" w:type="dxa"/>
+            <w:tcMar>
+              <w:top w:w="100" w:type="dxa"/>
+              <w:left w:w="100" w:type="dxa"/>
+              <w:bottom w:w="100" w:type="dxa"/>
+              <w:right w:w="100" w:type="dxa"/>
+            </w:tcMar>
+            <w:vAlign w:val="center"/>
+          </w:tcPr>
+          <w:p>
+            <w:pPr>
+              <w:spacing w:before="40" w:after="40"/>
+            </w:pPr>
+            <w:r>
+              <w:rPr>
+                <w:sz w:val="19"/>
+              </w:rPr>
+              <w:t xml:space="preserve">[Ticket / </w:t>
+            </w:r>
+            <w:proofErr w:type="spellStart"/>
+            <w:r>
+              <w:rPr>
+                <w:sz w:val="19"/>
+              </w:rPr>
+              <w:t>keine</w:t>
+            </w:r>
+            <w:proofErr w:type="spellEnd"/>
+            <w:r>
+              <w:rPr>
+                <w:sz w:val="19"/>
+              </w:rPr>
+              <w:t xml:space="preserve"> </w:t>
+            </w:r>
+            <w:proofErr w:type="spellStart"/>
+            <w:r>
+              <w:rPr>
+                <w:sz w:val="19"/>
+              </w:rPr>
+              <w:t>Maßnahme</w:t>
+            </w:r>
+            <w:proofErr w:type="spellEnd"/>
+            <w:r>
+              <w:rPr>
+                <w:sz w:val="19"/>
+              </w:rPr>
+              <w:t>]</w:t>
+            </w:r>
+          </w:p>
+        </w:tc>
+        <w:tc>
+          <w:tcPr>
+            <w:tcW w:w="1800" w:type="dxa"/>
+            <w:tcMar>
+              <w:top w:w="100" w:type="dxa"/>
+              <w:left w:w="100" w:type="dxa"/>
+              <w:bottom w:w="100" w:type="dxa"/>
+              <w:right w:w="100" w:type="dxa"/>
+            </w:tcMar>
+            <w:vAlign w:val="center"/>
+          </w:tcPr>
+          <w:p>
+            <w:pPr>
+              <w:spacing w:before="40" w:after="40"/>
+            </w:pPr>
+            <w:r>
+              <w:rPr>
+                <w:sz w:val="19"/>
+              </w:rPr>
+              <w:t xml:space="preserve">[Offen / </w:t>
+            </w:r>
+            <w:proofErr w:type="spellStart"/>
+            <w:r>
+              <w:rPr>
+                <w:sz w:val="19"/>
+              </w:rPr>
+              <w:t>Erledigt</w:t>
+            </w:r>
+            <w:proofErr w:type="spellEnd"/>
+            <w:r>
+              <w:rPr>
+                <w:sz w:val="19"/>
+              </w:rPr>
+              <w:t>]</w:t>
+            </w:r>
+          </w:p>
+        </w:tc>
+      </w:tr>
+    </w:tbl>
+    <w:p>
+      <w:pPr>
         <w:rPr>
           <w:lang w:val="de-DE"/>
         </w:rPr>
@@ -1237,18 +2928,22 @@
       <w:pPr>
         <w:pStyle w:val="berschrift1"/>
         <w:spacing w:before="240" w:after="120"/>
+        <w:rPr>
+          <w:lang w:val="de-DE"/>
+        </w:rPr>
       </w:pPr>
       <w:r>
-        <w:t>4</w:t>
+        <w:rPr>
+          <w:lang w:val="de-DE"/>
+        </w:rPr>
+        <w:t>5</w:t>
       </w:r>
       <w:r>
-        <w:t xml:space="preserve">. </w:t>
+        <w:rPr>
+          <w:lang w:val="de-DE"/>
+        </w:rPr>
+        <w:t>. Mitarbeiterverwaltung</w:t>
       </w:r>
-      <w:proofErr w:type="spellStart"/>
-      <w:r>
-        <w:t>Mitarbeiterverwaltung</w:t>
-      </w:r>
-      <w:proofErr w:type="spellEnd"/>
     </w:p>
     <w:p>
       <w:pPr>
@@ -2244,13 +3939,7 @@
               <w:rPr>
                 <w:sz w:val="19"/>
               </w:rPr>
-              <w:t>☐</w:t>
-            </w:r>
-            <w:r>
-              <w:rPr>
-                <w:sz w:val="19"/>
-              </w:rPr>
-              <w:t xml:space="preserve"> </w:t>
+              <w:t xml:space="preserve">☐ </w:t>
             </w:r>
             <w:proofErr w:type="gramStart"/>
             <w:r>
@@ -2641,13 +4330,7 @@
               <w:rPr>
                 <w:sz w:val="19"/>
               </w:rPr>
-              <w:t>☐</w:t>
-            </w:r>
-            <w:r>
-              <w:rPr>
-                <w:sz w:val="19"/>
-              </w:rPr>
-              <w:t xml:space="preserve"> </w:t>
+              <w:t xml:space="preserve">☐ </w:t>
             </w:r>
             <w:proofErr w:type="gramStart"/>
             <w:r>
@@ -2820,7 +4503,6 @@
       </w:pPr>
       <w:proofErr w:type="spellStart"/>
       <w:r>
-        <w:lastRenderedPageBreak/>
         <w:t>Ergebnisse</w:t>
       </w:r>
       <w:proofErr w:type="spellEnd"/>
@@ -2995,6 +4677,7 @@
               <w:rPr>
                 <w:sz w:val="19"/>
               </w:rPr>
+              <w:lastRenderedPageBreak/>
               <w:t>[UT-ID]</w:t>
             </w:r>
           </w:p>
@@ -3146,7 +4829,7 @@
         <w:spacing w:before="240" w:after="120"/>
       </w:pPr>
       <w:r>
-        <w:t>5</w:t>
+        <w:t>6</w:t>
       </w:r>
       <w:r>
         <w:t xml:space="preserve">. </w:t>
@@ -4143,13 +5826,7 @@
               <w:rPr>
                 <w:sz w:val="19"/>
               </w:rPr>
-              <w:t>☐</w:t>
-            </w:r>
-            <w:r>
-              <w:rPr>
-                <w:sz w:val="19"/>
-              </w:rPr>
-              <w:t xml:space="preserve"> </w:t>
+              <w:t xml:space="preserve">☐ </w:t>
             </w:r>
             <w:proofErr w:type="gramStart"/>
             <w:r>
@@ -4540,13 +6217,7 @@
               <w:rPr>
                 <w:sz w:val="19"/>
               </w:rPr>
-              <w:t>☐</w:t>
-            </w:r>
-            <w:r>
-              <w:rPr>
-                <w:sz w:val="19"/>
-              </w:rPr>
-              <w:t xml:space="preserve"> </w:t>
+              <w:t xml:space="preserve">☐ </w:t>
             </w:r>
             <w:proofErr w:type="gramStart"/>
             <w:r>
@@ -4986,8 +6657,7 @@
         <w:spacing w:before="240" w:after="120"/>
       </w:pPr>
       <w:r>
-        <w:lastRenderedPageBreak/>
-        <w:t>6</w:t>
+        <w:t>7</w:t>
       </w:r>
       <w:r>
         <w:t xml:space="preserve">. </w:t>
@@ -5057,6 +6727,7 @@
                 <w:color w:val="1F4E79"/>
                 <w:sz w:val="19"/>
               </w:rPr>
+              <w:lastRenderedPageBreak/>
               <w:t>Verantwortlich</w:t>
             </w:r>
             <w:proofErr w:type="spellEnd"/>
@@ -5978,13 +7649,7 @@
               <w:rPr>
                 <w:sz w:val="19"/>
               </w:rPr>
-              <w:t>☐</w:t>
-            </w:r>
-            <w:r>
-              <w:rPr>
-                <w:sz w:val="19"/>
-              </w:rPr>
-              <w:t xml:space="preserve"> </w:t>
+              <w:t xml:space="preserve">☐ </w:t>
             </w:r>
             <w:proofErr w:type="gramStart"/>
             <w:r>
@@ -6375,13 +8040,7 @@
               <w:rPr>
                 <w:sz w:val="19"/>
               </w:rPr>
-              <w:t>☐</w:t>
-            </w:r>
-            <w:r>
-              <w:rPr>
-                <w:sz w:val="19"/>
-              </w:rPr>
-              <w:t xml:space="preserve"> </w:t>
+              <w:t xml:space="preserve">☐ </w:t>
             </w:r>
             <w:proofErr w:type="gramStart"/>
             <w:r>
@@ -6908,8 +8567,7 @@
         <w:spacing w:before="240" w:after="120"/>
       </w:pPr>
       <w:r>
-        <w:lastRenderedPageBreak/>
-        <w:t>7</w:t>
+        <w:t>8</w:t>
       </w:r>
       <w:r>
         <w:t xml:space="preserve">. </w:t>
@@ -7035,6 +8693,7 @@
                 <w:color w:val="1F4E79"/>
                 <w:sz w:val="19"/>
               </w:rPr>
+              <w:lastRenderedPageBreak/>
               <w:t>Datum</w:t>
             </w:r>
           </w:p>
@@ -7900,13 +9559,7 @@
               <w:rPr>
                 <w:sz w:val="19"/>
               </w:rPr>
-              <w:t>☐</w:t>
-            </w:r>
-            <w:r>
-              <w:rPr>
-                <w:sz w:val="19"/>
-              </w:rPr>
-              <w:t xml:space="preserve"> </w:t>
+              <w:t xml:space="preserve">☐ </w:t>
             </w:r>
             <w:proofErr w:type="gramStart"/>
             <w:r>
@@ -8297,13 +9950,7 @@
               <w:rPr>
                 <w:sz w:val="19"/>
               </w:rPr>
-              <w:t>☐</w:t>
-            </w:r>
-            <w:r>
-              <w:rPr>
-                <w:sz w:val="19"/>
-              </w:rPr>
-              <w:t xml:space="preserve"> </w:t>
+              <w:t xml:space="preserve">☐ </w:t>
             </w:r>
             <w:proofErr w:type="gramStart"/>
             <w:r>
@@ -8804,8 +10451,7 @@
         <w:spacing w:before="240" w:after="120"/>
       </w:pPr>
       <w:r>
-        <w:lastRenderedPageBreak/>
-        <w:t>8</w:t>
+        <w:t>9</w:t>
       </w:r>
       <w:r>
         <w:t xml:space="preserve">. </w:t>
@@ -9086,6 +10732,7 @@
                 <w:color w:val="1F4E79"/>
                 <w:sz w:val="19"/>
               </w:rPr>
+              <w:lastRenderedPageBreak/>
               <w:t>Übersprungen</w:t>
             </w:r>
             <w:proofErr w:type="spellEnd"/>

</xml_diff>

<commit_message>
2 Tests hinzugefügt und Dateilänge gekürzt
</commit_message>
<xml_diff>
--- a/Testdokumentation_Unittests_Restaurant_Adminbereich.docx
+++ b/Testdokumentation_Unittests_Restaurant_Adminbereich.docx
@@ -1264,356 +1264,6 @@
         <w:t>Verbindung der Software mit der Datenbank.</w:t>
       </w:r>
     </w:p>
-    <w:tbl>
-      <w:tblPr>
-        <w:tblStyle w:val="Tabellenraster"/>
-        <w:tblW w:w="0" w:type="auto"/>
-        <w:jc w:val="center"/>
-        <w:tblLook w:val="04A0" w:firstRow="1" w:lastRow="0" w:firstColumn="1" w:lastColumn="0" w:noHBand="0" w:noVBand="1"/>
-      </w:tblPr>
-      <w:tblGrid>
-        <w:gridCol w:w="2376"/>
-        <w:gridCol w:w="7704"/>
-      </w:tblGrid>
-      <w:tr>
-        <w:trPr>
-          <w:cantSplit/>
-          <w:jc w:val="center"/>
-        </w:trPr>
-        <w:tc>
-          <w:tcPr>
-            <w:tcW w:w="2376" w:type="dxa"/>
-            <w:shd w:val="clear" w:color="auto" w:fill="EEF4F8"/>
-            <w:tcMar>
-              <w:top w:w="100" w:type="dxa"/>
-              <w:left w:w="100" w:type="dxa"/>
-              <w:bottom w:w="100" w:type="dxa"/>
-              <w:right w:w="100" w:type="dxa"/>
-            </w:tcMar>
-            <w:vAlign w:val="center"/>
-          </w:tcPr>
-          <w:p>
-            <w:pPr>
-              <w:spacing w:before="40" w:after="40"/>
-            </w:pPr>
-            <w:proofErr w:type="spellStart"/>
-            <w:r>
-              <w:rPr>
-                <w:b/>
-                <w:color w:val="1F4E79"/>
-                <w:sz w:val="19"/>
-              </w:rPr>
-              <w:t>Verantwortlich</w:t>
-            </w:r>
-            <w:proofErr w:type="spellEnd"/>
-          </w:p>
-        </w:tc>
-        <w:tc>
-          <w:tcPr>
-            <w:tcW w:w="7704" w:type="dxa"/>
-            <w:tcMar>
-              <w:top w:w="100" w:type="dxa"/>
-              <w:left w:w="100" w:type="dxa"/>
-              <w:bottom w:w="100" w:type="dxa"/>
-              <w:right w:w="100" w:type="dxa"/>
-            </w:tcMar>
-            <w:vAlign w:val="center"/>
-          </w:tcPr>
-          <w:p>
-            <w:pPr>
-              <w:spacing w:before="40" w:after="40"/>
-            </w:pPr>
-            <w:r>
-              <w:rPr>
-                <w:sz w:val="19"/>
-              </w:rPr>
-              <w:t>[Name / Team]</w:t>
-            </w:r>
-          </w:p>
-        </w:tc>
-      </w:tr>
-      <w:tr>
-        <w:trPr>
-          <w:cantSplit/>
-          <w:jc w:val="center"/>
-        </w:trPr>
-        <w:tc>
-          <w:tcPr>
-            <w:tcW w:w="2376" w:type="dxa"/>
-            <w:shd w:val="clear" w:color="auto" w:fill="EEF4F8"/>
-            <w:tcMar>
-              <w:top w:w="100" w:type="dxa"/>
-              <w:left w:w="100" w:type="dxa"/>
-              <w:bottom w:w="100" w:type="dxa"/>
-              <w:right w:w="100" w:type="dxa"/>
-            </w:tcMar>
-            <w:vAlign w:val="center"/>
-          </w:tcPr>
-          <w:p>
-            <w:pPr>
-              <w:spacing w:before="40" w:after="40"/>
-            </w:pPr>
-            <w:r>
-              <w:rPr>
-                <w:b/>
-                <w:color w:val="1F4E79"/>
-                <w:sz w:val="19"/>
-              </w:rPr>
-              <w:t>Datum</w:t>
-            </w:r>
-          </w:p>
-        </w:tc>
-        <w:tc>
-          <w:tcPr>
-            <w:tcW w:w="7704" w:type="dxa"/>
-            <w:tcMar>
-              <w:top w:w="100" w:type="dxa"/>
-              <w:left w:w="100" w:type="dxa"/>
-              <w:bottom w:w="100" w:type="dxa"/>
-              <w:right w:w="100" w:type="dxa"/>
-            </w:tcMar>
-            <w:vAlign w:val="center"/>
-          </w:tcPr>
-          <w:p>
-            <w:pPr>
-              <w:spacing w:before="40" w:after="40"/>
-            </w:pPr>
-            <w:r>
-              <w:rPr>
-                <w:sz w:val="19"/>
-              </w:rPr>
-              <w:t>[TT.MM.JJJJ]</w:t>
-            </w:r>
-          </w:p>
-        </w:tc>
-      </w:tr>
-      <w:tr>
-        <w:trPr>
-          <w:cantSplit/>
-          <w:jc w:val="center"/>
-        </w:trPr>
-        <w:tc>
-          <w:tcPr>
-            <w:tcW w:w="2376" w:type="dxa"/>
-            <w:shd w:val="clear" w:color="auto" w:fill="EEF4F8"/>
-            <w:tcMar>
-              <w:top w:w="100" w:type="dxa"/>
-              <w:left w:w="100" w:type="dxa"/>
-              <w:bottom w:w="100" w:type="dxa"/>
-              <w:right w:w="100" w:type="dxa"/>
-            </w:tcMar>
-            <w:vAlign w:val="center"/>
-          </w:tcPr>
-          <w:p>
-            <w:pPr>
-              <w:spacing w:before="40" w:after="40"/>
-            </w:pPr>
-            <w:r>
-              <w:rPr>
-                <w:b/>
-                <w:color w:val="1F4E79"/>
-                <w:sz w:val="19"/>
-              </w:rPr>
-              <w:t>Build / Commit</w:t>
-            </w:r>
-          </w:p>
-        </w:tc>
-        <w:tc>
-          <w:tcPr>
-            <w:tcW w:w="7704" w:type="dxa"/>
-            <w:tcMar>
-              <w:top w:w="100" w:type="dxa"/>
-              <w:left w:w="100" w:type="dxa"/>
-              <w:bottom w:w="100" w:type="dxa"/>
-              <w:right w:w="100" w:type="dxa"/>
-            </w:tcMar>
-            <w:vAlign w:val="center"/>
-          </w:tcPr>
-          <w:p>
-            <w:pPr>
-              <w:spacing w:before="40" w:after="40"/>
-            </w:pPr>
-            <w:r>
-              <w:rPr>
-                <w:sz w:val="19"/>
-              </w:rPr>
-              <w:t>[z. B. Commit-ID]</w:t>
-            </w:r>
-          </w:p>
-        </w:tc>
-      </w:tr>
-      <w:tr>
-        <w:trPr>
-          <w:cantSplit/>
-          <w:jc w:val="center"/>
-        </w:trPr>
-        <w:tc>
-          <w:tcPr>
-            <w:tcW w:w="2376" w:type="dxa"/>
-            <w:shd w:val="clear" w:color="auto" w:fill="EEF4F8"/>
-            <w:tcMar>
-              <w:top w:w="100" w:type="dxa"/>
-              <w:left w:w="100" w:type="dxa"/>
-              <w:bottom w:w="100" w:type="dxa"/>
-              <w:right w:w="100" w:type="dxa"/>
-            </w:tcMar>
-            <w:vAlign w:val="center"/>
-          </w:tcPr>
-          <w:p>
-            <w:pPr>
-              <w:spacing w:before="40" w:after="40"/>
-            </w:pPr>
-            <w:proofErr w:type="spellStart"/>
-            <w:r>
-              <w:rPr>
-                <w:b/>
-                <w:color w:val="1F4E79"/>
-                <w:sz w:val="19"/>
-              </w:rPr>
-              <w:t>Testframework</w:t>
-            </w:r>
-            <w:proofErr w:type="spellEnd"/>
-          </w:p>
-        </w:tc>
-        <w:tc>
-          <w:tcPr>
-            <w:tcW w:w="7704" w:type="dxa"/>
-            <w:tcMar>
-              <w:top w:w="100" w:type="dxa"/>
-              <w:left w:w="100" w:type="dxa"/>
-              <w:bottom w:w="100" w:type="dxa"/>
-              <w:right w:w="100" w:type="dxa"/>
-            </w:tcMar>
-            <w:vAlign w:val="center"/>
-          </w:tcPr>
-          <w:p>
-            <w:pPr>
-              <w:spacing w:before="40" w:after="40"/>
-            </w:pPr>
-            <w:r>
-              <w:rPr>
-                <w:sz w:val="19"/>
-              </w:rPr>
-              <w:t xml:space="preserve">[z. B. JUnit / </w:t>
-            </w:r>
-            <w:proofErr w:type="spellStart"/>
-            <w:r>
-              <w:rPr>
-                <w:sz w:val="19"/>
-              </w:rPr>
-              <w:t>pytest</w:t>
-            </w:r>
-            <w:proofErr w:type="spellEnd"/>
-            <w:r>
-              <w:rPr>
-                <w:sz w:val="19"/>
-              </w:rPr>
-              <w:t xml:space="preserve"> / Jest]</w:t>
-            </w:r>
-          </w:p>
-        </w:tc>
-      </w:tr>
-      <w:tr>
-        <w:trPr>
-          <w:cantSplit/>
-          <w:jc w:val="center"/>
-        </w:trPr>
-        <w:tc>
-          <w:tcPr>
-            <w:tcW w:w="2376" w:type="dxa"/>
-            <w:shd w:val="clear" w:color="auto" w:fill="EEF4F8"/>
-            <w:tcMar>
-              <w:top w:w="100" w:type="dxa"/>
-              <w:left w:w="100" w:type="dxa"/>
-              <w:bottom w:w="100" w:type="dxa"/>
-              <w:right w:w="100" w:type="dxa"/>
-            </w:tcMar>
-            <w:vAlign w:val="center"/>
-          </w:tcPr>
-          <w:p>
-            <w:pPr>
-              <w:spacing w:before="40" w:after="40"/>
-            </w:pPr>
-            <w:proofErr w:type="spellStart"/>
-            <w:r>
-              <w:rPr>
-                <w:b/>
-                <w:color w:val="1F4E79"/>
-                <w:sz w:val="19"/>
-              </w:rPr>
-              <w:t>Testumfang</w:t>
-            </w:r>
-            <w:proofErr w:type="spellEnd"/>
-          </w:p>
-        </w:tc>
-        <w:tc>
-          <w:tcPr>
-            <w:tcW w:w="7704" w:type="dxa"/>
-            <w:tcMar>
-              <w:top w:w="100" w:type="dxa"/>
-              <w:left w:w="100" w:type="dxa"/>
-              <w:bottom w:w="100" w:type="dxa"/>
-              <w:right w:w="100" w:type="dxa"/>
-            </w:tcMar>
-            <w:vAlign w:val="center"/>
-          </w:tcPr>
-          <w:p>
-            <w:pPr>
-              <w:spacing w:before="40" w:after="40"/>
-            </w:pPr>
-            <w:r>
-              <w:rPr>
-                <w:sz w:val="19"/>
-              </w:rPr>
-              <w:t>[</w:t>
-            </w:r>
-            <w:proofErr w:type="spellStart"/>
-            <w:r>
-              <w:rPr>
-                <w:sz w:val="19"/>
-              </w:rPr>
-              <w:t>Welche</w:t>
-            </w:r>
-            <w:proofErr w:type="spellEnd"/>
-            <w:r>
-              <w:rPr>
-                <w:sz w:val="19"/>
-              </w:rPr>
-              <w:t xml:space="preserve"> Units </w:t>
-            </w:r>
-            <w:proofErr w:type="spellStart"/>
-            <w:r>
-              <w:rPr>
-                <w:sz w:val="19"/>
-              </w:rPr>
-              <w:t>werden</w:t>
-            </w:r>
-            <w:proofErr w:type="spellEnd"/>
-            <w:r>
-              <w:rPr>
-                <w:sz w:val="19"/>
-              </w:rPr>
-              <w:t xml:space="preserve"> </w:t>
-            </w:r>
-            <w:proofErr w:type="spellStart"/>
-            <w:r>
-              <w:rPr>
-                <w:sz w:val="19"/>
-              </w:rPr>
-              <w:t>betrachtet</w:t>
-            </w:r>
-            <w:proofErr w:type="spellEnd"/>
-            <w:r>
-              <w:rPr>
-                <w:sz w:val="19"/>
-              </w:rPr>
-              <w:t>?]</w:t>
-            </w:r>
-          </w:p>
-        </w:tc>
-      </w:tr>
-    </w:tbl>
-    <w:p/>
     <w:p>
       <w:pPr>
         <w:pStyle w:val="berschrift2"/>
@@ -1932,17 +1582,12 @@
               <w:spacing w:before="40" w:after="40"/>
             </w:pPr>
             <w:proofErr w:type="spellStart"/>
-            <w:proofErr w:type="gramStart"/>
             <w:r>
               <w:t>pruefeTabellen</w:t>
             </w:r>
             <w:proofErr w:type="spellEnd"/>
             <w:r>
-              <w:t>(</w:t>
-            </w:r>
-            <w:proofErr w:type="gramEnd"/>
-            <w:r>
-              <w:t>Connection connection)</w:t>
+              <w:t>(Connection connection)</w:t>
             </w:r>
           </w:p>
           <w:p>
@@ -1988,17 +1633,8 @@
                 <w:sz w:val="19"/>
                 <w:lang w:val="de-DE"/>
               </w:rPr>
-              <w:t xml:space="preserve">lle Tabellen vorhanden </w:t>
-            </w:r>
-            <w:proofErr w:type="gramStart"/>
-            <w:r>
-              <w:rPr>
-                <w:sz w:val="19"/>
-                <w:lang w:val="de-DE"/>
-              </w:rPr>
-              <w:t>sind</w:t>
-            </w:r>
-            <w:proofErr w:type="gramEnd"/>
+              <w:t>lle Tabellen vorhanden sind</w:t>
+            </w:r>
           </w:p>
         </w:tc>
         <w:tc>
@@ -2224,7 +1860,6 @@
               <w:spacing w:before="40" w:after="40"/>
             </w:pPr>
             <w:proofErr w:type="spellStart"/>
-            <w:proofErr w:type="gramStart"/>
             <w:r>
               <w:rPr>
                 <w:sz w:val="19"/>
@@ -2236,14 +1871,7 @@
               <w:rPr>
                 <w:sz w:val="19"/>
               </w:rPr>
-              <w:t>,</w:t>
-            </w:r>
-            <w:proofErr w:type="gramEnd"/>
-            <w:r>
-              <w:rPr>
-                <w:sz w:val="19"/>
-              </w:rPr>
-              <w:t xml:space="preserve"> was </w:t>
+              <w:t xml:space="preserve">, was </w:t>
             </w:r>
             <w:proofErr w:type="spellStart"/>
             <w:r>
@@ -2485,24 +2113,9 @@
               <w:rPr>
                 <w:sz w:val="19"/>
               </w:rPr>
-              <w:t xml:space="preserve">☐ </w:t>
-            </w:r>
-            <w:proofErr w:type="gramStart"/>
-            <w:r>
-              <w:rPr>
-                <w:sz w:val="19"/>
-              </w:rPr>
-              <w:t>Offen  ☐</w:t>
-            </w:r>
-            <w:proofErr w:type="gramEnd"/>
-            <w:r>
-              <w:rPr>
-                <w:sz w:val="19"/>
-              </w:rPr>
-              <w:t xml:space="preserve"> </w:t>
+              <w:t xml:space="preserve">☐ Offen  ☐ </w:t>
             </w:r>
             <w:proofErr w:type="spellStart"/>
-            <w:proofErr w:type="gramStart"/>
             <w:r>
               <w:rPr>
                 <w:sz w:val="19"/>
@@ -2514,14 +2127,7 @@
               <w:rPr>
                 <w:sz w:val="19"/>
               </w:rPr>
-              <w:t xml:space="preserve">  ☐</w:t>
-            </w:r>
-            <w:proofErr w:type="gramEnd"/>
-            <w:r>
-              <w:rPr>
-                <w:sz w:val="19"/>
-              </w:rPr>
-              <w:t xml:space="preserve"> </w:t>
+              <w:t xml:space="preserve">  ☐ </w:t>
             </w:r>
             <w:proofErr w:type="spellStart"/>
             <w:r>
@@ -2581,348 +2187,6 @@
         </w:rPr>
         <w:t>Ob die Verbindung funktioniert</w:t>
       </w:r>
-    </w:p>
-    <w:p>
-      <w:pPr>
-        <w:pStyle w:val="Aufzhlungszeichen"/>
-        <w:rPr>
-          <w:lang w:val="de-DE"/>
-        </w:rPr>
-      </w:pPr>
-    </w:p>
-    <w:p>
-      <w:pPr>
-        <w:pStyle w:val="berschrift2"/>
-        <w:spacing w:before="160" w:after="120"/>
-      </w:pPr>
-      <w:proofErr w:type="spellStart"/>
-      <w:r>
-        <w:lastRenderedPageBreak/>
-        <w:t>Ergebnisse</w:t>
-      </w:r>
-      <w:proofErr w:type="spellEnd"/>
-      <w:r>
-        <w:t xml:space="preserve"> / </w:t>
-      </w:r>
-      <w:proofErr w:type="spellStart"/>
-      <w:r>
-        <w:t>Auffälligkeiten</w:t>
-      </w:r>
-      <w:proofErr w:type="spellEnd"/>
-    </w:p>
-    <w:tbl>
-      <w:tblPr>
-        <w:tblStyle w:val="Tabellenraster"/>
-        <w:tblW w:w="0" w:type="auto"/>
-        <w:jc w:val="center"/>
-        <w:tblLook w:val="04A0" w:firstRow="1" w:lastRow="0" w:firstColumn="1" w:lastColumn="0" w:noHBand="0" w:noVBand="1"/>
-      </w:tblPr>
-      <w:tblGrid>
-        <w:gridCol w:w="1296"/>
-        <w:gridCol w:w="3672"/>
-        <w:gridCol w:w="3168"/>
-        <w:gridCol w:w="1800"/>
-      </w:tblGrid>
-      <w:tr>
-        <w:trPr>
-          <w:cantSplit/>
-          <w:tblHeader/>
-          <w:jc w:val="center"/>
-        </w:trPr>
-        <w:tc>
-          <w:tcPr>
-            <w:tcW w:w="1296" w:type="dxa"/>
-            <w:shd w:val="clear" w:color="auto" w:fill="D9EAF7"/>
-            <w:tcMar>
-              <w:top w:w="100" w:type="dxa"/>
-              <w:left w:w="100" w:type="dxa"/>
-              <w:bottom w:w="100" w:type="dxa"/>
-              <w:right w:w="100" w:type="dxa"/>
-            </w:tcMar>
-            <w:vAlign w:val="center"/>
-          </w:tcPr>
-          <w:p>
-            <w:pPr>
-              <w:spacing w:before="40" w:after="40"/>
-            </w:pPr>
-            <w:proofErr w:type="spellStart"/>
-            <w:r>
-              <w:rPr>
-                <w:b/>
-                <w:color w:val="1F4E79"/>
-                <w:sz w:val="19"/>
-              </w:rPr>
-              <w:t>Referenz</w:t>
-            </w:r>
-            <w:proofErr w:type="spellEnd"/>
-          </w:p>
-        </w:tc>
-        <w:tc>
-          <w:tcPr>
-            <w:tcW w:w="3672" w:type="dxa"/>
-            <w:shd w:val="clear" w:color="auto" w:fill="D9EAF7"/>
-            <w:tcMar>
-              <w:top w:w="100" w:type="dxa"/>
-              <w:left w:w="100" w:type="dxa"/>
-              <w:bottom w:w="100" w:type="dxa"/>
-              <w:right w:w="100" w:type="dxa"/>
-            </w:tcMar>
-            <w:vAlign w:val="center"/>
-          </w:tcPr>
-          <w:p>
-            <w:pPr>
-              <w:spacing w:before="40" w:after="40"/>
-            </w:pPr>
-            <w:proofErr w:type="spellStart"/>
-            <w:r>
-              <w:rPr>
-                <w:b/>
-                <w:color w:val="1F4E79"/>
-                <w:sz w:val="19"/>
-              </w:rPr>
-              <w:t>Beobachtung</w:t>
-            </w:r>
-            <w:proofErr w:type="spellEnd"/>
-          </w:p>
-        </w:tc>
-        <w:tc>
-          <w:tcPr>
-            <w:tcW w:w="3168" w:type="dxa"/>
-            <w:shd w:val="clear" w:color="auto" w:fill="D9EAF7"/>
-            <w:tcMar>
-              <w:top w:w="100" w:type="dxa"/>
-              <w:left w:w="100" w:type="dxa"/>
-              <w:bottom w:w="100" w:type="dxa"/>
-              <w:right w:w="100" w:type="dxa"/>
-            </w:tcMar>
-            <w:vAlign w:val="center"/>
-          </w:tcPr>
-          <w:p>
-            <w:pPr>
-              <w:spacing w:before="40" w:after="40"/>
-            </w:pPr>
-            <w:proofErr w:type="spellStart"/>
-            <w:r>
-              <w:rPr>
-                <w:b/>
-                <w:color w:val="1F4E79"/>
-                <w:sz w:val="19"/>
-              </w:rPr>
-              <w:t>Maßnahme</w:t>
-            </w:r>
-            <w:proofErr w:type="spellEnd"/>
-            <w:r>
-              <w:rPr>
-                <w:b/>
-                <w:color w:val="1F4E79"/>
-                <w:sz w:val="19"/>
-              </w:rPr>
-              <w:t xml:space="preserve"> / Ticket</w:t>
-            </w:r>
-          </w:p>
-        </w:tc>
-        <w:tc>
-          <w:tcPr>
-            <w:tcW w:w="1800" w:type="dxa"/>
-            <w:shd w:val="clear" w:color="auto" w:fill="D9EAF7"/>
-            <w:tcMar>
-              <w:top w:w="100" w:type="dxa"/>
-              <w:left w:w="100" w:type="dxa"/>
-              <w:bottom w:w="100" w:type="dxa"/>
-              <w:right w:w="100" w:type="dxa"/>
-            </w:tcMar>
-            <w:vAlign w:val="center"/>
-          </w:tcPr>
-          <w:p>
-            <w:pPr>
-              <w:spacing w:before="40" w:after="40"/>
-            </w:pPr>
-            <w:r>
-              <w:rPr>
-                <w:b/>
-                <w:color w:val="1F4E79"/>
-                <w:sz w:val="19"/>
-              </w:rPr>
-              <w:t>Status</w:t>
-            </w:r>
-          </w:p>
-        </w:tc>
-      </w:tr>
-      <w:tr>
-        <w:trPr>
-          <w:cantSplit/>
-          <w:jc w:val="center"/>
-        </w:trPr>
-        <w:tc>
-          <w:tcPr>
-            <w:tcW w:w="1296" w:type="dxa"/>
-            <w:tcMar>
-              <w:top w:w="100" w:type="dxa"/>
-              <w:left w:w="100" w:type="dxa"/>
-              <w:bottom w:w="100" w:type="dxa"/>
-              <w:right w:w="100" w:type="dxa"/>
-            </w:tcMar>
-            <w:vAlign w:val="center"/>
-          </w:tcPr>
-          <w:p>
-            <w:pPr>
-              <w:spacing w:before="40" w:after="40"/>
-            </w:pPr>
-            <w:r>
-              <w:rPr>
-                <w:sz w:val="19"/>
-              </w:rPr>
-              <w:t>[UT-ID]</w:t>
-            </w:r>
-          </w:p>
-        </w:tc>
-        <w:tc>
-          <w:tcPr>
-            <w:tcW w:w="3672" w:type="dxa"/>
-            <w:tcMar>
-              <w:top w:w="100" w:type="dxa"/>
-              <w:left w:w="100" w:type="dxa"/>
-              <w:bottom w:w="100" w:type="dxa"/>
-              <w:right w:w="100" w:type="dxa"/>
-            </w:tcMar>
-            <w:vAlign w:val="center"/>
-          </w:tcPr>
-          <w:p>
-            <w:pPr>
-              <w:spacing w:before="40" w:after="40"/>
-            </w:pPr>
-            <w:r>
-              <w:rPr>
-                <w:sz w:val="19"/>
-              </w:rPr>
-              <w:t>[</w:t>
-            </w:r>
-            <w:proofErr w:type="spellStart"/>
-            <w:r>
-              <w:rPr>
-                <w:sz w:val="19"/>
-              </w:rPr>
-              <w:t>Ergebnis</w:t>
-            </w:r>
-            <w:proofErr w:type="spellEnd"/>
-            <w:r>
-              <w:rPr>
-                <w:sz w:val="19"/>
-              </w:rPr>
-              <w:t xml:space="preserve"> oder </w:t>
-            </w:r>
-            <w:proofErr w:type="spellStart"/>
-            <w:r>
-              <w:rPr>
-                <w:sz w:val="19"/>
-              </w:rPr>
-              <w:t>Auffälligkeit</w:t>
-            </w:r>
-            <w:proofErr w:type="spellEnd"/>
-            <w:r>
-              <w:rPr>
-                <w:sz w:val="19"/>
-              </w:rPr>
-              <w:t>]</w:t>
-            </w:r>
-          </w:p>
-        </w:tc>
-        <w:tc>
-          <w:tcPr>
-            <w:tcW w:w="3168" w:type="dxa"/>
-            <w:tcMar>
-              <w:top w:w="100" w:type="dxa"/>
-              <w:left w:w="100" w:type="dxa"/>
-              <w:bottom w:w="100" w:type="dxa"/>
-              <w:right w:w="100" w:type="dxa"/>
-            </w:tcMar>
-            <w:vAlign w:val="center"/>
-          </w:tcPr>
-          <w:p>
-            <w:pPr>
-              <w:spacing w:before="40" w:after="40"/>
-            </w:pPr>
-            <w:r>
-              <w:rPr>
-                <w:sz w:val="19"/>
-              </w:rPr>
-              <w:t xml:space="preserve">[Ticket / </w:t>
-            </w:r>
-            <w:proofErr w:type="spellStart"/>
-            <w:r>
-              <w:rPr>
-                <w:sz w:val="19"/>
-              </w:rPr>
-              <w:t>keine</w:t>
-            </w:r>
-            <w:proofErr w:type="spellEnd"/>
-            <w:r>
-              <w:rPr>
-                <w:sz w:val="19"/>
-              </w:rPr>
-              <w:t xml:space="preserve"> </w:t>
-            </w:r>
-            <w:proofErr w:type="spellStart"/>
-            <w:r>
-              <w:rPr>
-                <w:sz w:val="19"/>
-              </w:rPr>
-              <w:t>Maßnahme</w:t>
-            </w:r>
-            <w:proofErr w:type="spellEnd"/>
-            <w:r>
-              <w:rPr>
-                <w:sz w:val="19"/>
-              </w:rPr>
-              <w:t>]</w:t>
-            </w:r>
-          </w:p>
-        </w:tc>
-        <w:tc>
-          <w:tcPr>
-            <w:tcW w:w="1800" w:type="dxa"/>
-            <w:tcMar>
-              <w:top w:w="100" w:type="dxa"/>
-              <w:left w:w="100" w:type="dxa"/>
-              <w:bottom w:w="100" w:type="dxa"/>
-              <w:right w:w="100" w:type="dxa"/>
-            </w:tcMar>
-            <w:vAlign w:val="center"/>
-          </w:tcPr>
-          <w:p>
-            <w:pPr>
-              <w:spacing w:before="40" w:after="40"/>
-            </w:pPr>
-            <w:r>
-              <w:rPr>
-                <w:sz w:val="19"/>
-              </w:rPr>
-              <w:t xml:space="preserve">[Offen / </w:t>
-            </w:r>
-            <w:proofErr w:type="spellStart"/>
-            <w:r>
-              <w:rPr>
-                <w:sz w:val="19"/>
-              </w:rPr>
-              <w:t>Erledigt</w:t>
-            </w:r>
-            <w:proofErr w:type="spellEnd"/>
-            <w:r>
-              <w:rPr>
-                <w:sz w:val="19"/>
-              </w:rPr>
-              <w:t>]</w:t>
-            </w:r>
-          </w:p>
-        </w:tc>
-      </w:tr>
-    </w:tbl>
-    <w:p>
-      <w:pPr>
-        <w:rPr>
-          <w:lang w:val="de-DE"/>
-        </w:rPr>
-      </w:pPr>
     </w:p>
     <w:p>
       <w:pPr>
@@ -2979,356 +2243,6 @@
         <w:t>.</w:t>
       </w:r>
     </w:p>
-    <w:tbl>
-      <w:tblPr>
-        <w:tblStyle w:val="Tabellenraster"/>
-        <w:tblW w:w="0" w:type="auto"/>
-        <w:jc w:val="center"/>
-        <w:tblLook w:val="04A0" w:firstRow="1" w:lastRow="0" w:firstColumn="1" w:lastColumn="0" w:noHBand="0" w:noVBand="1"/>
-      </w:tblPr>
-      <w:tblGrid>
-        <w:gridCol w:w="2376"/>
-        <w:gridCol w:w="7704"/>
-      </w:tblGrid>
-      <w:tr>
-        <w:trPr>
-          <w:cantSplit/>
-          <w:jc w:val="center"/>
-        </w:trPr>
-        <w:tc>
-          <w:tcPr>
-            <w:tcW w:w="2376" w:type="dxa"/>
-            <w:shd w:val="clear" w:color="auto" w:fill="EEF4F8"/>
-            <w:tcMar>
-              <w:top w:w="100" w:type="dxa"/>
-              <w:left w:w="100" w:type="dxa"/>
-              <w:bottom w:w="100" w:type="dxa"/>
-              <w:right w:w="100" w:type="dxa"/>
-            </w:tcMar>
-            <w:vAlign w:val="center"/>
-          </w:tcPr>
-          <w:p>
-            <w:pPr>
-              <w:spacing w:before="40" w:after="40"/>
-            </w:pPr>
-            <w:proofErr w:type="spellStart"/>
-            <w:r>
-              <w:rPr>
-                <w:b/>
-                <w:color w:val="1F4E79"/>
-                <w:sz w:val="19"/>
-              </w:rPr>
-              <w:t>Verantwortlich</w:t>
-            </w:r>
-            <w:proofErr w:type="spellEnd"/>
-          </w:p>
-        </w:tc>
-        <w:tc>
-          <w:tcPr>
-            <w:tcW w:w="7704" w:type="dxa"/>
-            <w:tcMar>
-              <w:top w:w="100" w:type="dxa"/>
-              <w:left w:w="100" w:type="dxa"/>
-              <w:bottom w:w="100" w:type="dxa"/>
-              <w:right w:w="100" w:type="dxa"/>
-            </w:tcMar>
-            <w:vAlign w:val="center"/>
-          </w:tcPr>
-          <w:p>
-            <w:pPr>
-              <w:spacing w:before="40" w:after="40"/>
-            </w:pPr>
-            <w:r>
-              <w:rPr>
-                <w:sz w:val="19"/>
-              </w:rPr>
-              <w:t>[Name / Team]</w:t>
-            </w:r>
-          </w:p>
-        </w:tc>
-      </w:tr>
-      <w:tr>
-        <w:trPr>
-          <w:cantSplit/>
-          <w:jc w:val="center"/>
-        </w:trPr>
-        <w:tc>
-          <w:tcPr>
-            <w:tcW w:w="2376" w:type="dxa"/>
-            <w:shd w:val="clear" w:color="auto" w:fill="EEF4F8"/>
-            <w:tcMar>
-              <w:top w:w="100" w:type="dxa"/>
-              <w:left w:w="100" w:type="dxa"/>
-              <w:bottom w:w="100" w:type="dxa"/>
-              <w:right w:w="100" w:type="dxa"/>
-            </w:tcMar>
-            <w:vAlign w:val="center"/>
-          </w:tcPr>
-          <w:p>
-            <w:pPr>
-              <w:spacing w:before="40" w:after="40"/>
-            </w:pPr>
-            <w:r>
-              <w:rPr>
-                <w:b/>
-                <w:color w:val="1F4E79"/>
-                <w:sz w:val="19"/>
-              </w:rPr>
-              <w:t>Datum</w:t>
-            </w:r>
-          </w:p>
-        </w:tc>
-        <w:tc>
-          <w:tcPr>
-            <w:tcW w:w="7704" w:type="dxa"/>
-            <w:tcMar>
-              <w:top w:w="100" w:type="dxa"/>
-              <w:left w:w="100" w:type="dxa"/>
-              <w:bottom w:w="100" w:type="dxa"/>
-              <w:right w:w="100" w:type="dxa"/>
-            </w:tcMar>
-            <w:vAlign w:val="center"/>
-          </w:tcPr>
-          <w:p>
-            <w:pPr>
-              <w:spacing w:before="40" w:after="40"/>
-            </w:pPr>
-            <w:r>
-              <w:rPr>
-                <w:sz w:val="19"/>
-              </w:rPr>
-              <w:t>[TT.MM.JJJJ]</w:t>
-            </w:r>
-          </w:p>
-        </w:tc>
-      </w:tr>
-      <w:tr>
-        <w:trPr>
-          <w:cantSplit/>
-          <w:jc w:val="center"/>
-        </w:trPr>
-        <w:tc>
-          <w:tcPr>
-            <w:tcW w:w="2376" w:type="dxa"/>
-            <w:shd w:val="clear" w:color="auto" w:fill="EEF4F8"/>
-            <w:tcMar>
-              <w:top w:w="100" w:type="dxa"/>
-              <w:left w:w="100" w:type="dxa"/>
-              <w:bottom w:w="100" w:type="dxa"/>
-              <w:right w:w="100" w:type="dxa"/>
-            </w:tcMar>
-            <w:vAlign w:val="center"/>
-          </w:tcPr>
-          <w:p>
-            <w:pPr>
-              <w:spacing w:before="40" w:after="40"/>
-            </w:pPr>
-            <w:r>
-              <w:rPr>
-                <w:b/>
-                <w:color w:val="1F4E79"/>
-                <w:sz w:val="19"/>
-              </w:rPr>
-              <w:t>Build / Commit</w:t>
-            </w:r>
-          </w:p>
-        </w:tc>
-        <w:tc>
-          <w:tcPr>
-            <w:tcW w:w="7704" w:type="dxa"/>
-            <w:tcMar>
-              <w:top w:w="100" w:type="dxa"/>
-              <w:left w:w="100" w:type="dxa"/>
-              <w:bottom w:w="100" w:type="dxa"/>
-              <w:right w:w="100" w:type="dxa"/>
-            </w:tcMar>
-            <w:vAlign w:val="center"/>
-          </w:tcPr>
-          <w:p>
-            <w:pPr>
-              <w:spacing w:before="40" w:after="40"/>
-            </w:pPr>
-            <w:r>
-              <w:rPr>
-                <w:sz w:val="19"/>
-              </w:rPr>
-              <w:t>[z. B. Commit-ID]</w:t>
-            </w:r>
-          </w:p>
-        </w:tc>
-      </w:tr>
-      <w:tr>
-        <w:trPr>
-          <w:cantSplit/>
-          <w:jc w:val="center"/>
-        </w:trPr>
-        <w:tc>
-          <w:tcPr>
-            <w:tcW w:w="2376" w:type="dxa"/>
-            <w:shd w:val="clear" w:color="auto" w:fill="EEF4F8"/>
-            <w:tcMar>
-              <w:top w:w="100" w:type="dxa"/>
-              <w:left w:w="100" w:type="dxa"/>
-              <w:bottom w:w="100" w:type="dxa"/>
-              <w:right w:w="100" w:type="dxa"/>
-            </w:tcMar>
-            <w:vAlign w:val="center"/>
-          </w:tcPr>
-          <w:p>
-            <w:pPr>
-              <w:spacing w:before="40" w:after="40"/>
-            </w:pPr>
-            <w:proofErr w:type="spellStart"/>
-            <w:r>
-              <w:rPr>
-                <w:b/>
-                <w:color w:val="1F4E79"/>
-                <w:sz w:val="19"/>
-              </w:rPr>
-              <w:t>Testframework</w:t>
-            </w:r>
-            <w:proofErr w:type="spellEnd"/>
-          </w:p>
-        </w:tc>
-        <w:tc>
-          <w:tcPr>
-            <w:tcW w:w="7704" w:type="dxa"/>
-            <w:tcMar>
-              <w:top w:w="100" w:type="dxa"/>
-              <w:left w:w="100" w:type="dxa"/>
-              <w:bottom w:w="100" w:type="dxa"/>
-              <w:right w:w="100" w:type="dxa"/>
-            </w:tcMar>
-            <w:vAlign w:val="center"/>
-          </w:tcPr>
-          <w:p>
-            <w:pPr>
-              <w:spacing w:before="40" w:after="40"/>
-            </w:pPr>
-            <w:r>
-              <w:rPr>
-                <w:sz w:val="19"/>
-              </w:rPr>
-              <w:t xml:space="preserve">[z. B. JUnit / </w:t>
-            </w:r>
-            <w:proofErr w:type="spellStart"/>
-            <w:r>
-              <w:rPr>
-                <w:sz w:val="19"/>
-              </w:rPr>
-              <w:t>pytest</w:t>
-            </w:r>
-            <w:proofErr w:type="spellEnd"/>
-            <w:r>
-              <w:rPr>
-                <w:sz w:val="19"/>
-              </w:rPr>
-              <w:t xml:space="preserve"> / Jest]</w:t>
-            </w:r>
-          </w:p>
-        </w:tc>
-      </w:tr>
-      <w:tr>
-        <w:trPr>
-          <w:cantSplit/>
-          <w:jc w:val="center"/>
-        </w:trPr>
-        <w:tc>
-          <w:tcPr>
-            <w:tcW w:w="2376" w:type="dxa"/>
-            <w:shd w:val="clear" w:color="auto" w:fill="EEF4F8"/>
-            <w:tcMar>
-              <w:top w:w="100" w:type="dxa"/>
-              <w:left w:w="100" w:type="dxa"/>
-              <w:bottom w:w="100" w:type="dxa"/>
-              <w:right w:w="100" w:type="dxa"/>
-            </w:tcMar>
-            <w:vAlign w:val="center"/>
-          </w:tcPr>
-          <w:p>
-            <w:pPr>
-              <w:spacing w:before="40" w:after="40"/>
-            </w:pPr>
-            <w:proofErr w:type="spellStart"/>
-            <w:r>
-              <w:rPr>
-                <w:b/>
-                <w:color w:val="1F4E79"/>
-                <w:sz w:val="19"/>
-              </w:rPr>
-              <w:t>Testumfang</w:t>
-            </w:r>
-            <w:proofErr w:type="spellEnd"/>
-          </w:p>
-        </w:tc>
-        <w:tc>
-          <w:tcPr>
-            <w:tcW w:w="7704" w:type="dxa"/>
-            <w:tcMar>
-              <w:top w:w="100" w:type="dxa"/>
-              <w:left w:w="100" w:type="dxa"/>
-              <w:bottom w:w="100" w:type="dxa"/>
-              <w:right w:w="100" w:type="dxa"/>
-            </w:tcMar>
-            <w:vAlign w:val="center"/>
-          </w:tcPr>
-          <w:p>
-            <w:pPr>
-              <w:spacing w:before="40" w:after="40"/>
-            </w:pPr>
-            <w:r>
-              <w:rPr>
-                <w:sz w:val="19"/>
-              </w:rPr>
-              <w:t>[</w:t>
-            </w:r>
-            <w:proofErr w:type="spellStart"/>
-            <w:r>
-              <w:rPr>
-                <w:sz w:val="19"/>
-              </w:rPr>
-              <w:t>Welche</w:t>
-            </w:r>
-            <w:proofErr w:type="spellEnd"/>
-            <w:r>
-              <w:rPr>
-                <w:sz w:val="19"/>
-              </w:rPr>
-              <w:t xml:space="preserve"> Units </w:t>
-            </w:r>
-            <w:proofErr w:type="spellStart"/>
-            <w:r>
-              <w:rPr>
-                <w:sz w:val="19"/>
-              </w:rPr>
-              <w:t>werden</w:t>
-            </w:r>
-            <w:proofErr w:type="spellEnd"/>
-            <w:r>
-              <w:rPr>
-                <w:sz w:val="19"/>
-              </w:rPr>
-              <w:t xml:space="preserve"> </w:t>
-            </w:r>
-            <w:proofErr w:type="spellStart"/>
-            <w:r>
-              <w:rPr>
-                <w:sz w:val="19"/>
-              </w:rPr>
-              <w:t>betrachtet</w:t>
-            </w:r>
-            <w:proofErr w:type="spellEnd"/>
-            <w:r>
-              <w:rPr>
-                <w:sz w:val="19"/>
-              </w:rPr>
-              <w:t>?]</w:t>
-            </w:r>
-          </w:p>
-        </w:tc>
-      </w:tr>
-    </w:tbl>
-    <w:p/>
     <w:p>
       <w:pPr>
         <w:pStyle w:val="berschrift2"/>
@@ -3348,12 +2262,12 @@
         <w:tblLook w:val="04A0" w:firstRow="1" w:lastRow="0" w:firstColumn="1" w:lastColumn="0" w:noHBand="0" w:noVBand="1"/>
       </w:tblPr>
       <w:tblGrid>
-        <w:gridCol w:w="956"/>
+        <w:gridCol w:w="931"/>
         <w:gridCol w:w="2393"/>
-        <w:gridCol w:w="1276"/>
-        <w:gridCol w:w="1430"/>
-        <w:gridCol w:w="1257"/>
-        <w:gridCol w:w="1333"/>
+        <w:gridCol w:w="1353"/>
+        <w:gridCol w:w="1413"/>
+        <w:gridCol w:w="1146"/>
+        <w:gridCol w:w="1409"/>
         <w:gridCol w:w="1491"/>
       </w:tblGrid>
       <w:tr>
@@ -3621,111 +2535,19 @@
               <w:rPr>
                 <w:sz w:val="19"/>
               </w:rPr>
-              <w:t>UT-XXX</w:t>
-            </w:r>
-          </w:p>
-        </w:tc>
-        <w:tc>
-          <w:tcPr>
-            <w:tcW w:w="1512" w:type="dxa"/>
-            <w:tcMar>
-              <w:top w:w="100" w:type="dxa"/>
-              <w:left w:w="100" w:type="dxa"/>
-              <w:bottom w:w="100" w:type="dxa"/>
-              <w:right w:w="100" w:type="dxa"/>
-            </w:tcMar>
-            <w:vAlign w:val="center"/>
-          </w:tcPr>
-          <w:p>
-            <w:pPr>
-              <w:spacing w:before="40" w:after="40"/>
-            </w:pPr>
-            <w:r>
-              <w:rPr>
-                <w:sz w:val="19"/>
-              </w:rPr>
-              <w:t xml:space="preserve">z. B. </w:t>
-            </w:r>
-            <w:proofErr w:type="spellStart"/>
-            <w:r>
-              <w:rPr>
-                <w:sz w:val="19"/>
-              </w:rPr>
-              <w:t>MitarbeiterService.create</w:t>
-            </w:r>
-            <w:proofErr w:type="spellEnd"/>
-            <w:r>
-              <w:rPr>
-                <w:sz w:val="19"/>
-              </w:rPr>
-              <w:t>()</w:t>
-            </w:r>
-          </w:p>
-        </w:tc>
-        <w:tc>
-          <w:tcPr>
-            <w:tcW w:w="1656" w:type="dxa"/>
-            <w:tcMar>
-              <w:top w:w="100" w:type="dxa"/>
-              <w:left w:w="100" w:type="dxa"/>
-              <w:bottom w:w="100" w:type="dxa"/>
-              <w:right w:w="100" w:type="dxa"/>
-            </w:tcMar>
-            <w:vAlign w:val="center"/>
-          </w:tcPr>
-          <w:p>
-            <w:pPr>
-              <w:spacing w:before="40" w:after="40"/>
-            </w:pPr>
-            <w:proofErr w:type="spellStart"/>
-            <w:proofErr w:type="gramStart"/>
-            <w:r>
-              <w:rPr>
-                <w:sz w:val="19"/>
-              </w:rPr>
-              <w:t>Beschreibt</w:t>
-            </w:r>
-            <w:proofErr w:type="spellEnd"/>
-            <w:r>
-              <w:rPr>
-                <w:sz w:val="19"/>
-              </w:rPr>
-              <w:t>,</w:t>
-            </w:r>
-            <w:proofErr w:type="gramEnd"/>
-            <w:r>
-              <w:rPr>
-                <w:sz w:val="19"/>
-              </w:rPr>
-              <w:t xml:space="preserve"> was </w:t>
-            </w:r>
-            <w:proofErr w:type="spellStart"/>
-            <w:r>
-              <w:rPr>
-                <w:sz w:val="19"/>
-              </w:rPr>
-              <w:t>geprüft</w:t>
-            </w:r>
-            <w:proofErr w:type="spellEnd"/>
-            <w:r>
-              <w:rPr>
-                <w:sz w:val="19"/>
-              </w:rPr>
-              <w:t xml:space="preserve"> </w:t>
-            </w:r>
-            <w:proofErr w:type="spellStart"/>
-            <w:r>
-              <w:rPr>
-                <w:sz w:val="19"/>
-              </w:rPr>
-              <w:t>wird</w:t>
-            </w:r>
-            <w:proofErr w:type="spellEnd"/>
-            <w:r>
-              <w:rPr>
-                <w:sz w:val="19"/>
-              </w:rPr>
-              <w:t>.</w:t>
+              <w:t>UT-</w:t>
+            </w:r>
+            <w:r>
+              <w:rPr>
+                <w:sz w:val="19"/>
+              </w:rPr>
+              <w:t>0</w:t>
+            </w:r>
+            <w:r>
+              <w:rPr>
+                <w:sz w:val="19"/>
+              </w:rPr>
+              <w:t>2</w:t>
             </w:r>
           </w:p>
         </w:tc>
@@ -3749,43 +2571,84 @@
               <w:rPr>
                 <w:sz w:val="19"/>
               </w:rPr>
-              <w:t>Relevante</w:t>
+              <w:t>Mitarbeiter</w:t>
+            </w:r>
+            <w:r>
+              <w:rPr>
+                <w:sz w:val="19"/>
+              </w:rPr>
+              <w:t>AdapterTest</w:t>
             </w:r>
             <w:proofErr w:type="spellEnd"/>
             <w:r>
               <w:rPr>
                 <w:sz w:val="19"/>
               </w:rPr>
-              <w:t xml:space="preserve"> </w:t>
+              <w:t>()</w:t>
+            </w:r>
+          </w:p>
+        </w:tc>
+        <w:tc>
+          <w:tcPr>
+            <w:tcW w:w="1656" w:type="dxa"/>
+            <w:tcMar>
+              <w:top w:w="100" w:type="dxa"/>
+              <w:left w:w="100" w:type="dxa"/>
+              <w:bottom w:w="100" w:type="dxa"/>
+              <w:right w:w="100" w:type="dxa"/>
+            </w:tcMar>
+            <w:vAlign w:val="center"/>
+          </w:tcPr>
+          <w:p>
+            <w:pPr>
+              <w:spacing w:before="40" w:after="40"/>
+              <w:rPr>
+                <w:lang w:val="de-DE"/>
+              </w:rPr>
+            </w:pPr>
+            <w:r>
+              <w:rPr>
+                <w:lang w:val="de-DE"/>
+              </w:rPr>
+              <w:t>Prüfen ob der Mitarbeiter-A</w:t>
+            </w:r>
+            <w:r>
+              <w:rPr>
+                <w:lang w:val="de-DE"/>
+              </w:rPr>
+              <w:t>dapter funktioniert</w:t>
+            </w:r>
+          </w:p>
+        </w:tc>
+        <w:tc>
+          <w:tcPr>
+            <w:tcW w:w="1512" w:type="dxa"/>
+            <w:tcMar>
+              <w:top w:w="100" w:type="dxa"/>
+              <w:left w:w="100" w:type="dxa"/>
+              <w:bottom w:w="100" w:type="dxa"/>
+              <w:right w:w="100" w:type="dxa"/>
+            </w:tcMar>
+            <w:vAlign w:val="center"/>
+          </w:tcPr>
+          <w:p>
+            <w:pPr>
+              <w:spacing w:before="40" w:after="40"/>
+            </w:pPr>
+            <w:r>
+              <w:rPr>
+                <w:sz w:val="19"/>
+              </w:rPr>
+              <w:t xml:space="preserve">Mitarbeiter-Adapter </w:t>
             </w:r>
             <w:proofErr w:type="spellStart"/>
             <w:r>
               <w:rPr>
                 <w:sz w:val="19"/>
               </w:rPr>
-              <w:t>Objekte</w:t>
+              <w:t>vorhanden</w:t>
             </w:r>
             <w:proofErr w:type="spellEnd"/>
-            <w:r>
-              <w:rPr>
-                <w:sz w:val="19"/>
-              </w:rPr>
-              <w:t xml:space="preserve"> / Mocks </w:t>
-            </w:r>
-            <w:proofErr w:type="spellStart"/>
-            <w:r>
-              <w:rPr>
-                <w:sz w:val="19"/>
-              </w:rPr>
-              <w:t>vorhanden</w:t>
-            </w:r>
-            <w:proofErr w:type="spellEnd"/>
-            <w:r>
-              <w:rPr>
-                <w:sz w:val="19"/>
-              </w:rPr>
-              <w:t>.</w:t>
-            </w:r>
           </w:p>
         </w:tc>
         <w:tc>
@@ -3803,47 +2666,11 @@
             <w:pPr>
               <w:spacing w:before="40" w:after="40"/>
             </w:pPr>
-            <w:proofErr w:type="spellStart"/>
-            <w:r>
-              <w:rPr>
-                <w:sz w:val="19"/>
-              </w:rPr>
-              <w:t>Konkrete</w:t>
-            </w:r>
-            <w:proofErr w:type="spellEnd"/>
-            <w:r>
-              <w:rPr>
-                <w:sz w:val="19"/>
-              </w:rPr>
-              <w:t xml:space="preserve"> </w:t>
-            </w:r>
-            <w:proofErr w:type="spellStart"/>
-            <w:r>
-              <w:rPr>
-                <w:sz w:val="19"/>
-              </w:rPr>
-              <w:t>Testwerte</w:t>
-            </w:r>
-            <w:proofErr w:type="spellEnd"/>
-            <w:r>
-              <w:rPr>
-                <w:sz w:val="19"/>
-              </w:rPr>
-              <w:t xml:space="preserve"> </w:t>
-            </w:r>
-            <w:proofErr w:type="spellStart"/>
-            <w:r>
-              <w:rPr>
-                <w:sz w:val="19"/>
-              </w:rPr>
-              <w:t>eintragen</w:t>
-            </w:r>
-            <w:proofErr w:type="spellEnd"/>
-            <w:r>
-              <w:rPr>
-                <w:sz w:val="19"/>
-              </w:rPr>
-              <w:t>.</w:t>
+            <w:r>
+              <w:rPr>
+                <w:sz w:val="19"/>
+              </w:rPr>
+              <w:t>/</w:t>
             </w:r>
           </w:p>
         </w:tc>
@@ -3861,62 +2688,21 @@
           <w:p>
             <w:pPr>
               <w:spacing w:before="40" w:after="40"/>
+              <w:rPr>
+                <w:lang w:val="de-DE"/>
+              </w:rPr>
             </w:pPr>
-            <w:proofErr w:type="spellStart"/>
-            <w:r>
-              <w:rPr>
-                <w:sz w:val="19"/>
-              </w:rPr>
-              <w:t>Konkretes</w:t>
-            </w:r>
-            <w:proofErr w:type="spellEnd"/>
-            <w:r>
-              <w:rPr>
-                <w:sz w:val="19"/>
-              </w:rPr>
-              <w:t xml:space="preserve"> </w:t>
-            </w:r>
-            <w:proofErr w:type="spellStart"/>
-            <w:r>
-              <w:rPr>
-                <w:sz w:val="19"/>
-              </w:rPr>
-              <w:t>erwartetes</w:t>
-            </w:r>
-            <w:proofErr w:type="spellEnd"/>
-            <w:r>
-              <w:rPr>
-                <w:sz w:val="19"/>
-              </w:rPr>
-              <w:t xml:space="preserve"> </w:t>
-            </w:r>
-            <w:proofErr w:type="spellStart"/>
-            <w:r>
-              <w:rPr>
-                <w:sz w:val="19"/>
-              </w:rPr>
-              <w:t>Verhalten</w:t>
-            </w:r>
-            <w:proofErr w:type="spellEnd"/>
-            <w:r>
-              <w:rPr>
-                <w:sz w:val="19"/>
-              </w:rPr>
-              <w:t xml:space="preserve"> </w:t>
-            </w:r>
-            <w:proofErr w:type="spellStart"/>
-            <w:r>
-              <w:rPr>
-                <w:sz w:val="19"/>
-              </w:rPr>
-              <w:t>eintragen</w:t>
-            </w:r>
-            <w:proofErr w:type="spellEnd"/>
-            <w:r>
-              <w:rPr>
-                <w:sz w:val="19"/>
-              </w:rPr>
-              <w:t>.</w:t>
+            <w:r>
+              <w:rPr>
+                <w:lang w:val="de-DE"/>
+              </w:rPr>
+              <w:t>Es wird kein Error a</w:t>
+            </w:r>
+            <w:r>
+              <w:rPr>
+                <w:lang w:val="de-DE"/>
+              </w:rPr>
+              <w:t>usgegeben</w:t>
             </w:r>
           </w:p>
         </w:tc>
@@ -3935,54 +2721,9 @@
             <w:pPr>
               <w:spacing w:before="40" w:after="40"/>
             </w:pPr>
-            <w:r>
-              <w:rPr>
-                <w:sz w:val="19"/>
-              </w:rPr>
-              <w:t xml:space="preserve">☐ </w:t>
-            </w:r>
-            <w:proofErr w:type="gramStart"/>
-            <w:r>
-              <w:rPr>
-                <w:sz w:val="19"/>
-              </w:rPr>
-              <w:t>Offen  ☐</w:t>
-            </w:r>
-            <w:proofErr w:type="gramEnd"/>
-            <w:r>
-              <w:rPr>
-                <w:sz w:val="19"/>
-              </w:rPr>
-              <w:t xml:space="preserve"> </w:t>
-            </w:r>
             <w:proofErr w:type="spellStart"/>
-            <w:proofErr w:type="gramStart"/>
-            <w:r>
-              <w:rPr>
-                <w:sz w:val="19"/>
-              </w:rPr>
+            <w:r>
               <w:t>Bestanden</w:t>
-            </w:r>
-            <w:proofErr w:type="spellEnd"/>
-            <w:r>
-              <w:rPr>
-                <w:sz w:val="19"/>
-              </w:rPr>
-              <w:t xml:space="preserve">  ☐</w:t>
-            </w:r>
-            <w:proofErr w:type="gramEnd"/>
-            <w:r>
-              <w:rPr>
-                <w:sz w:val="19"/>
-              </w:rPr>
-              <w:t xml:space="preserve"> </w:t>
-            </w:r>
-            <w:proofErr w:type="spellStart"/>
-            <w:r>
-              <w:rPr>
-                <w:sz w:val="19"/>
-              </w:rPr>
-              <w:t>Fehlgeschlagen</w:t>
             </w:r>
             <w:proofErr w:type="spellEnd"/>
           </w:p>
@@ -4012,6 +2753,7 @@
               <w:rPr>
                 <w:sz w:val="19"/>
               </w:rPr>
+              <w:lastRenderedPageBreak/>
               <w:t>UT-XXX</w:t>
             </w:r>
           </w:p>
@@ -4069,7 +2811,6 @@
               <w:spacing w:before="40" w:after="40"/>
             </w:pPr>
             <w:proofErr w:type="spellStart"/>
-            <w:proofErr w:type="gramStart"/>
             <w:r>
               <w:rPr>
                 <w:sz w:val="19"/>
@@ -4081,14 +2822,7 @@
               <w:rPr>
                 <w:sz w:val="19"/>
               </w:rPr>
-              <w:t>,</w:t>
-            </w:r>
-            <w:proofErr w:type="gramEnd"/>
-            <w:r>
-              <w:rPr>
-                <w:sz w:val="19"/>
-              </w:rPr>
-              <w:t xml:space="preserve"> was </w:t>
+              <w:t xml:space="preserve">, was </w:t>
             </w:r>
             <w:proofErr w:type="spellStart"/>
             <w:r>
@@ -4330,24 +3064,9 @@
               <w:rPr>
                 <w:sz w:val="19"/>
               </w:rPr>
-              <w:t xml:space="preserve">☐ </w:t>
-            </w:r>
-            <w:proofErr w:type="gramStart"/>
-            <w:r>
-              <w:rPr>
-                <w:sz w:val="19"/>
-              </w:rPr>
-              <w:t>Offen  ☐</w:t>
-            </w:r>
-            <w:proofErr w:type="gramEnd"/>
-            <w:r>
-              <w:rPr>
-                <w:sz w:val="19"/>
-              </w:rPr>
-              <w:t xml:space="preserve"> </w:t>
+              <w:t xml:space="preserve">☐ Offen  ☐ </w:t>
             </w:r>
             <w:proofErr w:type="spellStart"/>
-            <w:proofErr w:type="gramStart"/>
             <w:r>
               <w:rPr>
                 <w:sz w:val="19"/>
@@ -4359,14 +3078,7 @@
               <w:rPr>
                 <w:sz w:val="19"/>
               </w:rPr>
-              <w:t xml:space="preserve">  ☐</w:t>
-            </w:r>
-            <w:proofErr w:type="gramEnd"/>
-            <w:r>
-              <w:rPr>
-                <w:sz w:val="19"/>
-              </w:rPr>
-              <w:t xml:space="preserve"> </w:t>
+              <w:t xml:space="preserve">  ☐ </w:t>
             </w:r>
             <w:proofErr w:type="spellStart"/>
             <w:r>
@@ -4458,373 +3170,6 @@
     </w:p>
     <w:p>
       <w:pPr>
-        <w:pStyle w:val="Aufzhlungszeichen"/>
-        <w:rPr>
-          <w:lang w:val="de-DE"/>
-        </w:rPr>
-      </w:pPr>
-      <w:r>
-        <w:rPr>
-          <w:lang w:val="de-DE"/>
-        </w:rPr>
-        <w:t>Validierung ungültiger oder fehlender Eingaben.</w:t>
-      </w:r>
-    </w:p>
-    <w:p>
-      <w:pPr>
-        <w:pStyle w:val="Aufzhlungszeichen"/>
-        <w:rPr>
-          <w:lang w:val="de-DE"/>
-        </w:rPr>
-      </w:pPr>
-      <w:r>
-        <w:rPr>
-          <w:lang w:val="de-DE"/>
-        </w:rPr>
-        <w:t>Behandlung bereits vorhandener</w:t>
-      </w:r>
-      <w:r>
-        <w:rPr>
-          <w:lang w:val="de-DE"/>
-        </w:rPr>
-        <w:t xml:space="preserve"> </w:t>
-      </w:r>
-      <w:r>
-        <w:rPr>
-          <w:lang w:val="de-DE"/>
-        </w:rPr>
-        <w:t>Mitarbeiter.</w:t>
-      </w:r>
-    </w:p>
-    <w:p>
-      <w:pPr>
-        <w:pStyle w:val="berschrift2"/>
-        <w:spacing w:before="160" w:after="120"/>
-      </w:pPr>
-      <w:proofErr w:type="spellStart"/>
-      <w:r>
-        <w:t>Ergebnisse</w:t>
-      </w:r>
-      <w:proofErr w:type="spellEnd"/>
-      <w:r>
-        <w:t xml:space="preserve"> / </w:t>
-      </w:r>
-      <w:proofErr w:type="spellStart"/>
-      <w:r>
-        <w:t>Auffälligkeiten</w:t>
-      </w:r>
-      <w:proofErr w:type="spellEnd"/>
-    </w:p>
-    <w:tbl>
-      <w:tblPr>
-        <w:tblStyle w:val="Tabellenraster"/>
-        <w:tblW w:w="0" w:type="auto"/>
-        <w:jc w:val="center"/>
-        <w:tblLook w:val="04A0" w:firstRow="1" w:lastRow="0" w:firstColumn="1" w:lastColumn="0" w:noHBand="0" w:noVBand="1"/>
-      </w:tblPr>
-      <w:tblGrid>
-        <w:gridCol w:w="1296"/>
-        <w:gridCol w:w="3672"/>
-        <w:gridCol w:w="3168"/>
-        <w:gridCol w:w="1800"/>
-      </w:tblGrid>
-      <w:tr>
-        <w:trPr>
-          <w:cantSplit/>
-          <w:tblHeader/>
-          <w:jc w:val="center"/>
-        </w:trPr>
-        <w:tc>
-          <w:tcPr>
-            <w:tcW w:w="1296" w:type="dxa"/>
-            <w:shd w:val="clear" w:color="auto" w:fill="D9EAF7"/>
-            <w:tcMar>
-              <w:top w:w="100" w:type="dxa"/>
-              <w:left w:w="100" w:type="dxa"/>
-              <w:bottom w:w="100" w:type="dxa"/>
-              <w:right w:w="100" w:type="dxa"/>
-            </w:tcMar>
-            <w:vAlign w:val="center"/>
-          </w:tcPr>
-          <w:p>
-            <w:pPr>
-              <w:spacing w:before="40" w:after="40"/>
-            </w:pPr>
-            <w:proofErr w:type="spellStart"/>
-            <w:r>
-              <w:rPr>
-                <w:b/>
-                <w:color w:val="1F4E79"/>
-                <w:sz w:val="19"/>
-              </w:rPr>
-              <w:t>Referenz</w:t>
-            </w:r>
-            <w:proofErr w:type="spellEnd"/>
-          </w:p>
-        </w:tc>
-        <w:tc>
-          <w:tcPr>
-            <w:tcW w:w="3672" w:type="dxa"/>
-            <w:shd w:val="clear" w:color="auto" w:fill="D9EAF7"/>
-            <w:tcMar>
-              <w:top w:w="100" w:type="dxa"/>
-              <w:left w:w="100" w:type="dxa"/>
-              <w:bottom w:w="100" w:type="dxa"/>
-              <w:right w:w="100" w:type="dxa"/>
-            </w:tcMar>
-            <w:vAlign w:val="center"/>
-          </w:tcPr>
-          <w:p>
-            <w:pPr>
-              <w:spacing w:before="40" w:after="40"/>
-            </w:pPr>
-            <w:proofErr w:type="spellStart"/>
-            <w:r>
-              <w:rPr>
-                <w:b/>
-                <w:color w:val="1F4E79"/>
-                <w:sz w:val="19"/>
-              </w:rPr>
-              <w:t>Beobachtung</w:t>
-            </w:r>
-            <w:proofErr w:type="spellEnd"/>
-          </w:p>
-        </w:tc>
-        <w:tc>
-          <w:tcPr>
-            <w:tcW w:w="3168" w:type="dxa"/>
-            <w:shd w:val="clear" w:color="auto" w:fill="D9EAF7"/>
-            <w:tcMar>
-              <w:top w:w="100" w:type="dxa"/>
-              <w:left w:w="100" w:type="dxa"/>
-              <w:bottom w:w="100" w:type="dxa"/>
-              <w:right w:w="100" w:type="dxa"/>
-            </w:tcMar>
-            <w:vAlign w:val="center"/>
-          </w:tcPr>
-          <w:p>
-            <w:pPr>
-              <w:spacing w:before="40" w:after="40"/>
-            </w:pPr>
-            <w:proofErr w:type="spellStart"/>
-            <w:r>
-              <w:rPr>
-                <w:b/>
-                <w:color w:val="1F4E79"/>
-                <w:sz w:val="19"/>
-              </w:rPr>
-              <w:t>Maßnahme</w:t>
-            </w:r>
-            <w:proofErr w:type="spellEnd"/>
-            <w:r>
-              <w:rPr>
-                <w:b/>
-                <w:color w:val="1F4E79"/>
-                <w:sz w:val="19"/>
-              </w:rPr>
-              <w:t xml:space="preserve"> / Ticket</w:t>
-            </w:r>
-          </w:p>
-        </w:tc>
-        <w:tc>
-          <w:tcPr>
-            <w:tcW w:w="1800" w:type="dxa"/>
-            <w:shd w:val="clear" w:color="auto" w:fill="D9EAF7"/>
-            <w:tcMar>
-              <w:top w:w="100" w:type="dxa"/>
-              <w:left w:w="100" w:type="dxa"/>
-              <w:bottom w:w="100" w:type="dxa"/>
-              <w:right w:w="100" w:type="dxa"/>
-            </w:tcMar>
-            <w:vAlign w:val="center"/>
-          </w:tcPr>
-          <w:p>
-            <w:pPr>
-              <w:spacing w:before="40" w:after="40"/>
-            </w:pPr>
-            <w:r>
-              <w:rPr>
-                <w:b/>
-                <w:color w:val="1F4E79"/>
-                <w:sz w:val="19"/>
-              </w:rPr>
-              <w:t>Status</w:t>
-            </w:r>
-          </w:p>
-        </w:tc>
-      </w:tr>
-      <w:tr>
-        <w:trPr>
-          <w:cantSplit/>
-          <w:jc w:val="center"/>
-        </w:trPr>
-        <w:tc>
-          <w:tcPr>
-            <w:tcW w:w="1296" w:type="dxa"/>
-            <w:tcMar>
-              <w:top w:w="100" w:type="dxa"/>
-              <w:left w:w="100" w:type="dxa"/>
-              <w:bottom w:w="100" w:type="dxa"/>
-              <w:right w:w="100" w:type="dxa"/>
-            </w:tcMar>
-            <w:vAlign w:val="center"/>
-          </w:tcPr>
-          <w:p>
-            <w:pPr>
-              <w:spacing w:before="40" w:after="40"/>
-            </w:pPr>
-            <w:r>
-              <w:rPr>
-                <w:sz w:val="19"/>
-              </w:rPr>
-              <w:lastRenderedPageBreak/>
-              <w:t>[UT-ID]</w:t>
-            </w:r>
-          </w:p>
-        </w:tc>
-        <w:tc>
-          <w:tcPr>
-            <w:tcW w:w="3672" w:type="dxa"/>
-            <w:tcMar>
-              <w:top w:w="100" w:type="dxa"/>
-              <w:left w:w="100" w:type="dxa"/>
-              <w:bottom w:w="100" w:type="dxa"/>
-              <w:right w:w="100" w:type="dxa"/>
-            </w:tcMar>
-            <w:vAlign w:val="center"/>
-          </w:tcPr>
-          <w:p>
-            <w:pPr>
-              <w:spacing w:before="40" w:after="40"/>
-            </w:pPr>
-            <w:r>
-              <w:rPr>
-                <w:sz w:val="19"/>
-              </w:rPr>
-              <w:t>[</w:t>
-            </w:r>
-            <w:proofErr w:type="spellStart"/>
-            <w:r>
-              <w:rPr>
-                <w:sz w:val="19"/>
-              </w:rPr>
-              <w:t>Ergebnis</w:t>
-            </w:r>
-            <w:proofErr w:type="spellEnd"/>
-            <w:r>
-              <w:rPr>
-                <w:sz w:val="19"/>
-              </w:rPr>
-              <w:t xml:space="preserve"> oder </w:t>
-            </w:r>
-            <w:proofErr w:type="spellStart"/>
-            <w:r>
-              <w:rPr>
-                <w:sz w:val="19"/>
-              </w:rPr>
-              <w:t>Auffälligkeit</w:t>
-            </w:r>
-            <w:proofErr w:type="spellEnd"/>
-            <w:r>
-              <w:rPr>
-                <w:sz w:val="19"/>
-              </w:rPr>
-              <w:t>]</w:t>
-            </w:r>
-          </w:p>
-        </w:tc>
-        <w:tc>
-          <w:tcPr>
-            <w:tcW w:w="3168" w:type="dxa"/>
-            <w:tcMar>
-              <w:top w:w="100" w:type="dxa"/>
-              <w:left w:w="100" w:type="dxa"/>
-              <w:bottom w:w="100" w:type="dxa"/>
-              <w:right w:w="100" w:type="dxa"/>
-            </w:tcMar>
-            <w:vAlign w:val="center"/>
-          </w:tcPr>
-          <w:p>
-            <w:pPr>
-              <w:spacing w:before="40" w:after="40"/>
-            </w:pPr>
-            <w:r>
-              <w:rPr>
-                <w:sz w:val="19"/>
-              </w:rPr>
-              <w:t xml:space="preserve">[Ticket / </w:t>
-            </w:r>
-            <w:proofErr w:type="spellStart"/>
-            <w:r>
-              <w:rPr>
-                <w:sz w:val="19"/>
-              </w:rPr>
-              <w:t>keine</w:t>
-            </w:r>
-            <w:proofErr w:type="spellEnd"/>
-            <w:r>
-              <w:rPr>
-                <w:sz w:val="19"/>
-              </w:rPr>
-              <w:t xml:space="preserve"> </w:t>
-            </w:r>
-            <w:proofErr w:type="spellStart"/>
-            <w:r>
-              <w:rPr>
-                <w:sz w:val="19"/>
-              </w:rPr>
-              <w:t>Maßnahme</w:t>
-            </w:r>
-            <w:proofErr w:type="spellEnd"/>
-            <w:r>
-              <w:rPr>
-                <w:sz w:val="19"/>
-              </w:rPr>
-              <w:t>]</w:t>
-            </w:r>
-          </w:p>
-        </w:tc>
-        <w:tc>
-          <w:tcPr>
-            <w:tcW w:w="1800" w:type="dxa"/>
-            <w:tcMar>
-              <w:top w:w="100" w:type="dxa"/>
-              <w:left w:w="100" w:type="dxa"/>
-              <w:bottom w:w="100" w:type="dxa"/>
-              <w:right w:w="100" w:type="dxa"/>
-            </w:tcMar>
-            <w:vAlign w:val="center"/>
-          </w:tcPr>
-          <w:p>
-            <w:pPr>
-              <w:spacing w:before="40" w:after="40"/>
-            </w:pPr>
-            <w:r>
-              <w:rPr>
-                <w:sz w:val="19"/>
-              </w:rPr>
-              <w:t xml:space="preserve">[Offen / </w:t>
-            </w:r>
-            <w:proofErr w:type="spellStart"/>
-            <w:r>
-              <w:rPr>
-                <w:sz w:val="19"/>
-              </w:rPr>
-              <w:t>Erledigt</w:t>
-            </w:r>
-            <w:proofErr w:type="spellEnd"/>
-            <w:r>
-              <w:rPr>
-                <w:sz w:val="19"/>
-              </w:rPr>
-              <w:t>]</w:t>
-            </w:r>
-          </w:p>
-        </w:tc>
-      </w:tr>
-    </w:tbl>
-    <w:p>
-      <w:pPr>
         <w:pStyle w:val="berschrift1"/>
         <w:spacing w:before="240" w:after="120"/>
       </w:pPr>
@@ -4866,356 +3211,6 @@
         <w:t>. Einsehen der Kapazität und Änderung des Zustands.</w:t>
       </w:r>
     </w:p>
-    <w:tbl>
-      <w:tblPr>
-        <w:tblStyle w:val="Tabellenraster"/>
-        <w:tblW w:w="0" w:type="auto"/>
-        <w:jc w:val="center"/>
-        <w:tblLook w:val="04A0" w:firstRow="1" w:lastRow="0" w:firstColumn="1" w:lastColumn="0" w:noHBand="0" w:noVBand="1"/>
-      </w:tblPr>
-      <w:tblGrid>
-        <w:gridCol w:w="2376"/>
-        <w:gridCol w:w="7704"/>
-      </w:tblGrid>
-      <w:tr>
-        <w:trPr>
-          <w:cantSplit/>
-          <w:jc w:val="center"/>
-        </w:trPr>
-        <w:tc>
-          <w:tcPr>
-            <w:tcW w:w="2376" w:type="dxa"/>
-            <w:shd w:val="clear" w:color="auto" w:fill="EEF4F8"/>
-            <w:tcMar>
-              <w:top w:w="100" w:type="dxa"/>
-              <w:left w:w="100" w:type="dxa"/>
-              <w:bottom w:w="100" w:type="dxa"/>
-              <w:right w:w="100" w:type="dxa"/>
-            </w:tcMar>
-            <w:vAlign w:val="center"/>
-          </w:tcPr>
-          <w:p>
-            <w:pPr>
-              <w:spacing w:before="40" w:after="40"/>
-            </w:pPr>
-            <w:proofErr w:type="spellStart"/>
-            <w:r>
-              <w:rPr>
-                <w:b/>
-                <w:color w:val="1F4E79"/>
-                <w:sz w:val="19"/>
-              </w:rPr>
-              <w:t>Verantwortlich</w:t>
-            </w:r>
-            <w:proofErr w:type="spellEnd"/>
-          </w:p>
-        </w:tc>
-        <w:tc>
-          <w:tcPr>
-            <w:tcW w:w="7704" w:type="dxa"/>
-            <w:tcMar>
-              <w:top w:w="100" w:type="dxa"/>
-              <w:left w:w="100" w:type="dxa"/>
-              <w:bottom w:w="100" w:type="dxa"/>
-              <w:right w:w="100" w:type="dxa"/>
-            </w:tcMar>
-            <w:vAlign w:val="center"/>
-          </w:tcPr>
-          <w:p>
-            <w:pPr>
-              <w:spacing w:before="40" w:after="40"/>
-            </w:pPr>
-            <w:r>
-              <w:rPr>
-                <w:sz w:val="19"/>
-              </w:rPr>
-              <w:t>[Name / Team]</w:t>
-            </w:r>
-          </w:p>
-        </w:tc>
-      </w:tr>
-      <w:tr>
-        <w:trPr>
-          <w:cantSplit/>
-          <w:jc w:val="center"/>
-        </w:trPr>
-        <w:tc>
-          <w:tcPr>
-            <w:tcW w:w="2376" w:type="dxa"/>
-            <w:shd w:val="clear" w:color="auto" w:fill="EEF4F8"/>
-            <w:tcMar>
-              <w:top w:w="100" w:type="dxa"/>
-              <w:left w:w="100" w:type="dxa"/>
-              <w:bottom w:w="100" w:type="dxa"/>
-              <w:right w:w="100" w:type="dxa"/>
-            </w:tcMar>
-            <w:vAlign w:val="center"/>
-          </w:tcPr>
-          <w:p>
-            <w:pPr>
-              <w:spacing w:before="40" w:after="40"/>
-            </w:pPr>
-            <w:r>
-              <w:rPr>
-                <w:b/>
-                <w:color w:val="1F4E79"/>
-                <w:sz w:val="19"/>
-              </w:rPr>
-              <w:t>Datum</w:t>
-            </w:r>
-          </w:p>
-        </w:tc>
-        <w:tc>
-          <w:tcPr>
-            <w:tcW w:w="7704" w:type="dxa"/>
-            <w:tcMar>
-              <w:top w:w="100" w:type="dxa"/>
-              <w:left w:w="100" w:type="dxa"/>
-              <w:bottom w:w="100" w:type="dxa"/>
-              <w:right w:w="100" w:type="dxa"/>
-            </w:tcMar>
-            <w:vAlign w:val="center"/>
-          </w:tcPr>
-          <w:p>
-            <w:pPr>
-              <w:spacing w:before="40" w:after="40"/>
-            </w:pPr>
-            <w:r>
-              <w:rPr>
-                <w:sz w:val="19"/>
-              </w:rPr>
-              <w:t>[TT.MM.JJJJ]</w:t>
-            </w:r>
-          </w:p>
-        </w:tc>
-      </w:tr>
-      <w:tr>
-        <w:trPr>
-          <w:cantSplit/>
-          <w:jc w:val="center"/>
-        </w:trPr>
-        <w:tc>
-          <w:tcPr>
-            <w:tcW w:w="2376" w:type="dxa"/>
-            <w:shd w:val="clear" w:color="auto" w:fill="EEF4F8"/>
-            <w:tcMar>
-              <w:top w:w="100" w:type="dxa"/>
-              <w:left w:w="100" w:type="dxa"/>
-              <w:bottom w:w="100" w:type="dxa"/>
-              <w:right w:w="100" w:type="dxa"/>
-            </w:tcMar>
-            <w:vAlign w:val="center"/>
-          </w:tcPr>
-          <w:p>
-            <w:pPr>
-              <w:spacing w:before="40" w:after="40"/>
-            </w:pPr>
-            <w:r>
-              <w:rPr>
-                <w:b/>
-                <w:color w:val="1F4E79"/>
-                <w:sz w:val="19"/>
-              </w:rPr>
-              <w:t>Build / Commit</w:t>
-            </w:r>
-          </w:p>
-        </w:tc>
-        <w:tc>
-          <w:tcPr>
-            <w:tcW w:w="7704" w:type="dxa"/>
-            <w:tcMar>
-              <w:top w:w="100" w:type="dxa"/>
-              <w:left w:w="100" w:type="dxa"/>
-              <w:bottom w:w="100" w:type="dxa"/>
-              <w:right w:w="100" w:type="dxa"/>
-            </w:tcMar>
-            <w:vAlign w:val="center"/>
-          </w:tcPr>
-          <w:p>
-            <w:pPr>
-              <w:spacing w:before="40" w:after="40"/>
-            </w:pPr>
-            <w:r>
-              <w:rPr>
-                <w:sz w:val="19"/>
-              </w:rPr>
-              <w:t>[z. B. Commit-ID]</w:t>
-            </w:r>
-          </w:p>
-        </w:tc>
-      </w:tr>
-      <w:tr>
-        <w:trPr>
-          <w:cantSplit/>
-          <w:jc w:val="center"/>
-        </w:trPr>
-        <w:tc>
-          <w:tcPr>
-            <w:tcW w:w="2376" w:type="dxa"/>
-            <w:shd w:val="clear" w:color="auto" w:fill="EEF4F8"/>
-            <w:tcMar>
-              <w:top w:w="100" w:type="dxa"/>
-              <w:left w:w="100" w:type="dxa"/>
-              <w:bottom w:w="100" w:type="dxa"/>
-              <w:right w:w="100" w:type="dxa"/>
-            </w:tcMar>
-            <w:vAlign w:val="center"/>
-          </w:tcPr>
-          <w:p>
-            <w:pPr>
-              <w:spacing w:before="40" w:after="40"/>
-            </w:pPr>
-            <w:proofErr w:type="spellStart"/>
-            <w:r>
-              <w:rPr>
-                <w:b/>
-                <w:color w:val="1F4E79"/>
-                <w:sz w:val="19"/>
-              </w:rPr>
-              <w:t>Testframework</w:t>
-            </w:r>
-            <w:proofErr w:type="spellEnd"/>
-          </w:p>
-        </w:tc>
-        <w:tc>
-          <w:tcPr>
-            <w:tcW w:w="7704" w:type="dxa"/>
-            <w:tcMar>
-              <w:top w:w="100" w:type="dxa"/>
-              <w:left w:w="100" w:type="dxa"/>
-              <w:bottom w:w="100" w:type="dxa"/>
-              <w:right w:w="100" w:type="dxa"/>
-            </w:tcMar>
-            <w:vAlign w:val="center"/>
-          </w:tcPr>
-          <w:p>
-            <w:pPr>
-              <w:spacing w:before="40" w:after="40"/>
-            </w:pPr>
-            <w:r>
-              <w:rPr>
-                <w:sz w:val="19"/>
-              </w:rPr>
-              <w:t xml:space="preserve">[z. B. JUnit / </w:t>
-            </w:r>
-            <w:proofErr w:type="spellStart"/>
-            <w:r>
-              <w:rPr>
-                <w:sz w:val="19"/>
-              </w:rPr>
-              <w:t>pytest</w:t>
-            </w:r>
-            <w:proofErr w:type="spellEnd"/>
-            <w:r>
-              <w:rPr>
-                <w:sz w:val="19"/>
-              </w:rPr>
-              <w:t xml:space="preserve"> / Jest]</w:t>
-            </w:r>
-          </w:p>
-        </w:tc>
-      </w:tr>
-      <w:tr>
-        <w:trPr>
-          <w:cantSplit/>
-          <w:jc w:val="center"/>
-        </w:trPr>
-        <w:tc>
-          <w:tcPr>
-            <w:tcW w:w="2376" w:type="dxa"/>
-            <w:shd w:val="clear" w:color="auto" w:fill="EEF4F8"/>
-            <w:tcMar>
-              <w:top w:w="100" w:type="dxa"/>
-              <w:left w:w="100" w:type="dxa"/>
-              <w:bottom w:w="100" w:type="dxa"/>
-              <w:right w:w="100" w:type="dxa"/>
-            </w:tcMar>
-            <w:vAlign w:val="center"/>
-          </w:tcPr>
-          <w:p>
-            <w:pPr>
-              <w:spacing w:before="40" w:after="40"/>
-            </w:pPr>
-            <w:proofErr w:type="spellStart"/>
-            <w:r>
-              <w:rPr>
-                <w:b/>
-                <w:color w:val="1F4E79"/>
-                <w:sz w:val="19"/>
-              </w:rPr>
-              <w:t>Testumfang</w:t>
-            </w:r>
-            <w:proofErr w:type="spellEnd"/>
-          </w:p>
-        </w:tc>
-        <w:tc>
-          <w:tcPr>
-            <w:tcW w:w="7704" w:type="dxa"/>
-            <w:tcMar>
-              <w:top w:w="100" w:type="dxa"/>
-              <w:left w:w="100" w:type="dxa"/>
-              <w:bottom w:w="100" w:type="dxa"/>
-              <w:right w:w="100" w:type="dxa"/>
-            </w:tcMar>
-            <w:vAlign w:val="center"/>
-          </w:tcPr>
-          <w:p>
-            <w:pPr>
-              <w:spacing w:before="40" w:after="40"/>
-            </w:pPr>
-            <w:r>
-              <w:rPr>
-                <w:sz w:val="19"/>
-              </w:rPr>
-              <w:t>[</w:t>
-            </w:r>
-            <w:proofErr w:type="spellStart"/>
-            <w:r>
-              <w:rPr>
-                <w:sz w:val="19"/>
-              </w:rPr>
-              <w:t>Welche</w:t>
-            </w:r>
-            <w:proofErr w:type="spellEnd"/>
-            <w:r>
-              <w:rPr>
-                <w:sz w:val="19"/>
-              </w:rPr>
-              <w:t xml:space="preserve"> Units </w:t>
-            </w:r>
-            <w:proofErr w:type="spellStart"/>
-            <w:r>
-              <w:rPr>
-                <w:sz w:val="19"/>
-              </w:rPr>
-              <w:t>werden</w:t>
-            </w:r>
-            <w:proofErr w:type="spellEnd"/>
-            <w:r>
-              <w:rPr>
-                <w:sz w:val="19"/>
-              </w:rPr>
-              <w:t xml:space="preserve"> </w:t>
-            </w:r>
-            <w:proofErr w:type="spellStart"/>
-            <w:r>
-              <w:rPr>
-                <w:sz w:val="19"/>
-              </w:rPr>
-              <w:t>betrachtet</w:t>
-            </w:r>
-            <w:proofErr w:type="spellEnd"/>
-            <w:r>
-              <w:rPr>
-                <w:sz w:val="19"/>
-              </w:rPr>
-              <w:t>?]</w:t>
-            </w:r>
-          </w:p>
-        </w:tc>
-      </w:tr>
-    </w:tbl>
-    <w:p/>
     <w:p>
       <w:pPr>
         <w:pStyle w:val="berschrift2"/>
@@ -5565,7 +3560,6 @@
               <w:spacing w:before="40" w:after="40"/>
             </w:pPr>
             <w:proofErr w:type="spellStart"/>
-            <w:proofErr w:type="gramStart"/>
             <w:r>
               <w:rPr>
                 <w:sz w:val="19"/>
@@ -5577,14 +3571,7 @@
               <w:rPr>
                 <w:sz w:val="19"/>
               </w:rPr>
-              <w:t>,</w:t>
-            </w:r>
-            <w:proofErr w:type="gramEnd"/>
-            <w:r>
-              <w:rPr>
-                <w:sz w:val="19"/>
-              </w:rPr>
-              <w:t xml:space="preserve"> was </w:t>
+              <w:t xml:space="preserve">, was </w:t>
             </w:r>
             <w:proofErr w:type="spellStart"/>
             <w:r>
@@ -5826,24 +3813,9 @@
               <w:rPr>
                 <w:sz w:val="19"/>
               </w:rPr>
-              <w:t xml:space="preserve">☐ </w:t>
-            </w:r>
-            <w:proofErr w:type="gramStart"/>
-            <w:r>
-              <w:rPr>
-                <w:sz w:val="19"/>
-              </w:rPr>
-              <w:t>Offen  ☐</w:t>
-            </w:r>
-            <w:proofErr w:type="gramEnd"/>
-            <w:r>
-              <w:rPr>
-                <w:sz w:val="19"/>
-              </w:rPr>
-              <w:t xml:space="preserve"> </w:t>
+              <w:t xml:space="preserve">☐ Offen  ☐ </w:t>
             </w:r>
             <w:proofErr w:type="spellStart"/>
-            <w:proofErr w:type="gramStart"/>
             <w:r>
               <w:rPr>
                 <w:sz w:val="19"/>
@@ -5855,14 +3827,7 @@
               <w:rPr>
                 <w:sz w:val="19"/>
               </w:rPr>
-              <w:t xml:space="preserve">  ☐</w:t>
-            </w:r>
-            <w:proofErr w:type="gramEnd"/>
-            <w:r>
-              <w:rPr>
-                <w:sz w:val="19"/>
-              </w:rPr>
-              <w:t xml:space="preserve"> </w:t>
+              <w:t xml:space="preserve">  ☐ </w:t>
             </w:r>
             <w:proofErr w:type="spellStart"/>
             <w:r>
@@ -5956,7 +3921,6 @@
               <w:spacing w:before="40" w:after="40"/>
             </w:pPr>
             <w:proofErr w:type="spellStart"/>
-            <w:proofErr w:type="gramStart"/>
             <w:r>
               <w:rPr>
                 <w:sz w:val="19"/>
@@ -5968,14 +3932,7 @@
               <w:rPr>
                 <w:sz w:val="19"/>
               </w:rPr>
-              <w:t>,</w:t>
-            </w:r>
-            <w:proofErr w:type="gramEnd"/>
-            <w:r>
-              <w:rPr>
-                <w:sz w:val="19"/>
-              </w:rPr>
-              <w:t xml:space="preserve"> was </w:t>
+              <w:t xml:space="preserve">, was </w:t>
             </w:r>
             <w:proofErr w:type="spellStart"/>
             <w:r>
@@ -6217,24 +4174,9 @@
               <w:rPr>
                 <w:sz w:val="19"/>
               </w:rPr>
-              <w:t xml:space="preserve">☐ </w:t>
-            </w:r>
-            <w:proofErr w:type="gramStart"/>
-            <w:r>
-              <w:rPr>
-                <w:sz w:val="19"/>
-              </w:rPr>
-              <w:t>Offen  ☐</w:t>
-            </w:r>
-            <w:proofErr w:type="gramEnd"/>
-            <w:r>
-              <w:rPr>
-                <w:sz w:val="19"/>
-              </w:rPr>
-              <w:t xml:space="preserve"> </w:t>
+              <w:t xml:space="preserve">☐ Offen  ☐ </w:t>
             </w:r>
             <w:proofErr w:type="spellStart"/>
-            <w:proofErr w:type="gramStart"/>
             <w:r>
               <w:rPr>
                 <w:sz w:val="19"/>
@@ -6246,14 +4188,7 @@
               <w:rPr>
                 <w:sz w:val="19"/>
               </w:rPr>
-              <w:t xml:space="preserve">  ☐</w:t>
-            </w:r>
-            <w:proofErr w:type="gramEnd"/>
-            <w:r>
-              <w:rPr>
-                <w:sz w:val="19"/>
-              </w:rPr>
-              <w:t xml:space="preserve"> </w:t>
+              <w:t xml:space="preserve">  ☐ </w:t>
             </w:r>
             <w:proofErr w:type="spellStart"/>
             <w:r>
@@ -6327,332 +4262,6 @@
     </w:p>
     <w:p>
       <w:pPr>
-        <w:pStyle w:val="berschrift2"/>
-        <w:spacing w:before="160" w:after="120"/>
-      </w:pPr>
-      <w:proofErr w:type="spellStart"/>
-      <w:r>
-        <w:t>Ergebnisse</w:t>
-      </w:r>
-      <w:proofErr w:type="spellEnd"/>
-      <w:r>
-        <w:t xml:space="preserve"> / </w:t>
-      </w:r>
-      <w:proofErr w:type="spellStart"/>
-      <w:r>
-        <w:t>Auffälligkeiten</w:t>
-      </w:r>
-      <w:proofErr w:type="spellEnd"/>
-    </w:p>
-    <w:tbl>
-      <w:tblPr>
-        <w:tblStyle w:val="Tabellenraster"/>
-        <w:tblW w:w="0" w:type="auto"/>
-        <w:jc w:val="center"/>
-        <w:tblLook w:val="04A0" w:firstRow="1" w:lastRow="0" w:firstColumn="1" w:lastColumn="0" w:noHBand="0" w:noVBand="1"/>
-      </w:tblPr>
-      <w:tblGrid>
-        <w:gridCol w:w="1296"/>
-        <w:gridCol w:w="3672"/>
-        <w:gridCol w:w="3168"/>
-        <w:gridCol w:w="1800"/>
-      </w:tblGrid>
-      <w:tr>
-        <w:trPr>
-          <w:cantSplit/>
-          <w:tblHeader/>
-          <w:jc w:val="center"/>
-        </w:trPr>
-        <w:tc>
-          <w:tcPr>
-            <w:tcW w:w="1296" w:type="dxa"/>
-            <w:shd w:val="clear" w:color="auto" w:fill="D9EAF7"/>
-            <w:tcMar>
-              <w:top w:w="100" w:type="dxa"/>
-              <w:left w:w="100" w:type="dxa"/>
-              <w:bottom w:w="100" w:type="dxa"/>
-              <w:right w:w="100" w:type="dxa"/>
-            </w:tcMar>
-            <w:vAlign w:val="center"/>
-          </w:tcPr>
-          <w:p>
-            <w:pPr>
-              <w:spacing w:before="40" w:after="40"/>
-            </w:pPr>
-            <w:proofErr w:type="spellStart"/>
-            <w:r>
-              <w:rPr>
-                <w:b/>
-                <w:color w:val="1F4E79"/>
-                <w:sz w:val="19"/>
-              </w:rPr>
-              <w:t>Referenz</w:t>
-            </w:r>
-            <w:proofErr w:type="spellEnd"/>
-          </w:p>
-        </w:tc>
-        <w:tc>
-          <w:tcPr>
-            <w:tcW w:w="3672" w:type="dxa"/>
-            <w:shd w:val="clear" w:color="auto" w:fill="D9EAF7"/>
-            <w:tcMar>
-              <w:top w:w="100" w:type="dxa"/>
-              <w:left w:w="100" w:type="dxa"/>
-              <w:bottom w:w="100" w:type="dxa"/>
-              <w:right w:w="100" w:type="dxa"/>
-            </w:tcMar>
-            <w:vAlign w:val="center"/>
-          </w:tcPr>
-          <w:p>
-            <w:pPr>
-              <w:spacing w:before="40" w:after="40"/>
-            </w:pPr>
-            <w:proofErr w:type="spellStart"/>
-            <w:r>
-              <w:rPr>
-                <w:b/>
-                <w:color w:val="1F4E79"/>
-                <w:sz w:val="19"/>
-              </w:rPr>
-              <w:t>Beobachtung</w:t>
-            </w:r>
-            <w:proofErr w:type="spellEnd"/>
-          </w:p>
-        </w:tc>
-        <w:tc>
-          <w:tcPr>
-            <w:tcW w:w="3168" w:type="dxa"/>
-            <w:shd w:val="clear" w:color="auto" w:fill="D9EAF7"/>
-            <w:tcMar>
-              <w:top w:w="100" w:type="dxa"/>
-              <w:left w:w="100" w:type="dxa"/>
-              <w:bottom w:w="100" w:type="dxa"/>
-              <w:right w:w="100" w:type="dxa"/>
-            </w:tcMar>
-            <w:vAlign w:val="center"/>
-          </w:tcPr>
-          <w:p>
-            <w:pPr>
-              <w:spacing w:before="40" w:after="40"/>
-            </w:pPr>
-            <w:proofErr w:type="spellStart"/>
-            <w:r>
-              <w:rPr>
-                <w:b/>
-                <w:color w:val="1F4E79"/>
-                <w:sz w:val="19"/>
-              </w:rPr>
-              <w:t>Maßnahme</w:t>
-            </w:r>
-            <w:proofErr w:type="spellEnd"/>
-            <w:r>
-              <w:rPr>
-                <w:b/>
-                <w:color w:val="1F4E79"/>
-                <w:sz w:val="19"/>
-              </w:rPr>
-              <w:t xml:space="preserve"> / Ticket</w:t>
-            </w:r>
-          </w:p>
-        </w:tc>
-        <w:tc>
-          <w:tcPr>
-            <w:tcW w:w="1800" w:type="dxa"/>
-            <w:shd w:val="clear" w:color="auto" w:fill="D9EAF7"/>
-            <w:tcMar>
-              <w:top w:w="100" w:type="dxa"/>
-              <w:left w:w="100" w:type="dxa"/>
-              <w:bottom w:w="100" w:type="dxa"/>
-              <w:right w:w="100" w:type="dxa"/>
-            </w:tcMar>
-            <w:vAlign w:val="center"/>
-          </w:tcPr>
-          <w:p>
-            <w:pPr>
-              <w:spacing w:before="40" w:after="40"/>
-            </w:pPr>
-            <w:r>
-              <w:rPr>
-                <w:b/>
-                <w:color w:val="1F4E79"/>
-                <w:sz w:val="19"/>
-              </w:rPr>
-              <w:t>Status</w:t>
-            </w:r>
-          </w:p>
-        </w:tc>
-      </w:tr>
-      <w:tr>
-        <w:trPr>
-          <w:cantSplit/>
-          <w:jc w:val="center"/>
-        </w:trPr>
-        <w:tc>
-          <w:tcPr>
-            <w:tcW w:w="1296" w:type="dxa"/>
-            <w:tcMar>
-              <w:top w:w="100" w:type="dxa"/>
-              <w:left w:w="100" w:type="dxa"/>
-              <w:bottom w:w="100" w:type="dxa"/>
-              <w:right w:w="100" w:type="dxa"/>
-            </w:tcMar>
-            <w:vAlign w:val="center"/>
-          </w:tcPr>
-          <w:p>
-            <w:pPr>
-              <w:spacing w:before="40" w:after="40"/>
-            </w:pPr>
-            <w:r>
-              <w:rPr>
-                <w:sz w:val="19"/>
-              </w:rPr>
-              <w:t>[UT-ID]</w:t>
-            </w:r>
-          </w:p>
-        </w:tc>
-        <w:tc>
-          <w:tcPr>
-            <w:tcW w:w="3672" w:type="dxa"/>
-            <w:tcMar>
-              <w:top w:w="100" w:type="dxa"/>
-              <w:left w:w="100" w:type="dxa"/>
-              <w:bottom w:w="100" w:type="dxa"/>
-              <w:right w:w="100" w:type="dxa"/>
-            </w:tcMar>
-            <w:vAlign w:val="center"/>
-          </w:tcPr>
-          <w:p>
-            <w:pPr>
-              <w:spacing w:before="40" w:after="40"/>
-            </w:pPr>
-            <w:r>
-              <w:rPr>
-                <w:sz w:val="19"/>
-              </w:rPr>
-              <w:t>[</w:t>
-            </w:r>
-            <w:proofErr w:type="spellStart"/>
-            <w:r>
-              <w:rPr>
-                <w:sz w:val="19"/>
-              </w:rPr>
-              <w:t>Ergebnis</w:t>
-            </w:r>
-            <w:proofErr w:type="spellEnd"/>
-            <w:r>
-              <w:rPr>
-                <w:sz w:val="19"/>
-              </w:rPr>
-              <w:t xml:space="preserve"> oder </w:t>
-            </w:r>
-            <w:proofErr w:type="spellStart"/>
-            <w:r>
-              <w:rPr>
-                <w:sz w:val="19"/>
-              </w:rPr>
-              <w:t>Auffälligkeit</w:t>
-            </w:r>
-            <w:proofErr w:type="spellEnd"/>
-            <w:r>
-              <w:rPr>
-                <w:sz w:val="19"/>
-              </w:rPr>
-              <w:t>]</w:t>
-            </w:r>
-          </w:p>
-        </w:tc>
-        <w:tc>
-          <w:tcPr>
-            <w:tcW w:w="3168" w:type="dxa"/>
-            <w:tcMar>
-              <w:top w:w="100" w:type="dxa"/>
-              <w:left w:w="100" w:type="dxa"/>
-              <w:bottom w:w="100" w:type="dxa"/>
-              <w:right w:w="100" w:type="dxa"/>
-            </w:tcMar>
-            <w:vAlign w:val="center"/>
-          </w:tcPr>
-          <w:p>
-            <w:pPr>
-              <w:spacing w:before="40" w:after="40"/>
-            </w:pPr>
-            <w:r>
-              <w:rPr>
-                <w:sz w:val="19"/>
-              </w:rPr>
-              <w:t xml:space="preserve">[Ticket / </w:t>
-            </w:r>
-            <w:proofErr w:type="spellStart"/>
-            <w:r>
-              <w:rPr>
-                <w:sz w:val="19"/>
-              </w:rPr>
-              <w:t>keine</w:t>
-            </w:r>
-            <w:proofErr w:type="spellEnd"/>
-            <w:r>
-              <w:rPr>
-                <w:sz w:val="19"/>
-              </w:rPr>
-              <w:t xml:space="preserve"> </w:t>
-            </w:r>
-            <w:proofErr w:type="spellStart"/>
-            <w:r>
-              <w:rPr>
-                <w:sz w:val="19"/>
-              </w:rPr>
-              <w:t>Maßnahme</w:t>
-            </w:r>
-            <w:proofErr w:type="spellEnd"/>
-            <w:r>
-              <w:rPr>
-                <w:sz w:val="19"/>
-              </w:rPr>
-              <w:t>]</w:t>
-            </w:r>
-          </w:p>
-        </w:tc>
-        <w:tc>
-          <w:tcPr>
-            <w:tcW w:w="1800" w:type="dxa"/>
-            <w:tcMar>
-              <w:top w:w="100" w:type="dxa"/>
-              <w:left w:w="100" w:type="dxa"/>
-              <w:bottom w:w="100" w:type="dxa"/>
-              <w:right w:w="100" w:type="dxa"/>
-            </w:tcMar>
-            <w:vAlign w:val="center"/>
-          </w:tcPr>
-          <w:p>
-            <w:pPr>
-              <w:spacing w:before="40" w:after="40"/>
-            </w:pPr>
-            <w:r>
-              <w:rPr>
-                <w:sz w:val="19"/>
-              </w:rPr>
-              <w:t xml:space="preserve">[Offen / </w:t>
-            </w:r>
-            <w:proofErr w:type="spellStart"/>
-            <w:r>
-              <w:rPr>
-                <w:sz w:val="19"/>
-              </w:rPr>
-              <w:t>Erledigt</w:t>
-            </w:r>
-            <w:proofErr w:type="spellEnd"/>
-            <w:r>
-              <w:rPr>
-                <w:sz w:val="19"/>
-              </w:rPr>
-              <w:t>]</w:t>
-            </w:r>
-          </w:p>
-        </w:tc>
-      </w:tr>
-    </w:tbl>
-    <w:p>
-      <w:pPr>
         <w:pStyle w:val="berschrift1"/>
         <w:spacing w:before="240" w:after="120"/>
       </w:pPr>
@@ -6688,357 +4297,6 @@
         <w:t>Berechnung und Bereitstellung administrativer Kennzahlen aus vorhandenen Restaurantdaten.</w:t>
       </w:r>
     </w:p>
-    <w:tbl>
-      <w:tblPr>
-        <w:tblStyle w:val="Tabellenraster"/>
-        <w:tblW w:w="0" w:type="auto"/>
-        <w:jc w:val="center"/>
-        <w:tblLook w:val="04A0" w:firstRow="1" w:lastRow="0" w:firstColumn="1" w:lastColumn="0" w:noHBand="0" w:noVBand="1"/>
-      </w:tblPr>
-      <w:tblGrid>
-        <w:gridCol w:w="2376"/>
-        <w:gridCol w:w="7704"/>
-      </w:tblGrid>
-      <w:tr>
-        <w:trPr>
-          <w:cantSplit/>
-          <w:jc w:val="center"/>
-        </w:trPr>
-        <w:tc>
-          <w:tcPr>
-            <w:tcW w:w="2376" w:type="dxa"/>
-            <w:shd w:val="clear" w:color="auto" w:fill="EEF4F8"/>
-            <w:tcMar>
-              <w:top w:w="100" w:type="dxa"/>
-              <w:left w:w="100" w:type="dxa"/>
-              <w:bottom w:w="100" w:type="dxa"/>
-              <w:right w:w="100" w:type="dxa"/>
-            </w:tcMar>
-            <w:vAlign w:val="center"/>
-          </w:tcPr>
-          <w:p>
-            <w:pPr>
-              <w:spacing w:before="40" w:after="40"/>
-            </w:pPr>
-            <w:proofErr w:type="spellStart"/>
-            <w:r>
-              <w:rPr>
-                <w:b/>
-                <w:color w:val="1F4E79"/>
-                <w:sz w:val="19"/>
-              </w:rPr>
-              <w:lastRenderedPageBreak/>
-              <w:t>Verantwortlich</w:t>
-            </w:r>
-            <w:proofErr w:type="spellEnd"/>
-          </w:p>
-        </w:tc>
-        <w:tc>
-          <w:tcPr>
-            <w:tcW w:w="7704" w:type="dxa"/>
-            <w:tcMar>
-              <w:top w:w="100" w:type="dxa"/>
-              <w:left w:w="100" w:type="dxa"/>
-              <w:bottom w:w="100" w:type="dxa"/>
-              <w:right w:w="100" w:type="dxa"/>
-            </w:tcMar>
-            <w:vAlign w:val="center"/>
-          </w:tcPr>
-          <w:p>
-            <w:pPr>
-              <w:spacing w:before="40" w:after="40"/>
-            </w:pPr>
-            <w:r>
-              <w:rPr>
-                <w:sz w:val="19"/>
-              </w:rPr>
-              <w:t>[Name / Team]</w:t>
-            </w:r>
-          </w:p>
-        </w:tc>
-      </w:tr>
-      <w:tr>
-        <w:trPr>
-          <w:cantSplit/>
-          <w:jc w:val="center"/>
-        </w:trPr>
-        <w:tc>
-          <w:tcPr>
-            <w:tcW w:w="2376" w:type="dxa"/>
-            <w:shd w:val="clear" w:color="auto" w:fill="EEF4F8"/>
-            <w:tcMar>
-              <w:top w:w="100" w:type="dxa"/>
-              <w:left w:w="100" w:type="dxa"/>
-              <w:bottom w:w="100" w:type="dxa"/>
-              <w:right w:w="100" w:type="dxa"/>
-            </w:tcMar>
-            <w:vAlign w:val="center"/>
-          </w:tcPr>
-          <w:p>
-            <w:pPr>
-              <w:spacing w:before="40" w:after="40"/>
-            </w:pPr>
-            <w:r>
-              <w:rPr>
-                <w:b/>
-                <w:color w:val="1F4E79"/>
-                <w:sz w:val="19"/>
-              </w:rPr>
-              <w:t>Datum</w:t>
-            </w:r>
-          </w:p>
-        </w:tc>
-        <w:tc>
-          <w:tcPr>
-            <w:tcW w:w="7704" w:type="dxa"/>
-            <w:tcMar>
-              <w:top w:w="100" w:type="dxa"/>
-              <w:left w:w="100" w:type="dxa"/>
-              <w:bottom w:w="100" w:type="dxa"/>
-              <w:right w:w="100" w:type="dxa"/>
-            </w:tcMar>
-            <w:vAlign w:val="center"/>
-          </w:tcPr>
-          <w:p>
-            <w:pPr>
-              <w:spacing w:before="40" w:after="40"/>
-            </w:pPr>
-            <w:r>
-              <w:rPr>
-                <w:sz w:val="19"/>
-              </w:rPr>
-              <w:t>[TT.MM.JJJJ]</w:t>
-            </w:r>
-          </w:p>
-        </w:tc>
-      </w:tr>
-      <w:tr>
-        <w:trPr>
-          <w:cantSplit/>
-          <w:jc w:val="center"/>
-        </w:trPr>
-        <w:tc>
-          <w:tcPr>
-            <w:tcW w:w="2376" w:type="dxa"/>
-            <w:shd w:val="clear" w:color="auto" w:fill="EEF4F8"/>
-            <w:tcMar>
-              <w:top w:w="100" w:type="dxa"/>
-              <w:left w:w="100" w:type="dxa"/>
-              <w:bottom w:w="100" w:type="dxa"/>
-              <w:right w:w="100" w:type="dxa"/>
-            </w:tcMar>
-            <w:vAlign w:val="center"/>
-          </w:tcPr>
-          <w:p>
-            <w:pPr>
-              <w:spacing w:before="40" w:after="40"/>
-            </w:pPr>
-            <w:r>
-              <w:rPr>
-                <w:b/>
-                <w:color w:val="1F4E79"/>
-                <w:sz w:val="19"/>
-              </w:rPr>
-              <w:t>Build / Commit</w:t>
-            </w:r>
-          </w:p>
-        </w:tc>
-        <w:tc>
-          <w:tcPr>
-            <w:tcW w:w="7704" w:type="dxa"/>
-            <w:tcMar>
-              <w:top w:w="100" w:type="dxa"/>
-              <w:left w:w="100" w:type="dxa"/>
-              <w:bottom w:w="100" w:type="dxa"/>
-              <w:right w:w="100" w:type="dxa"/>
-            </w:tcMar>
-            <w:vAlign w:val="center"/>
-          </w:tcPr>
-          <w:p>
-            <w:pPr>
-              <w:spacing w:before="40" w:after="40"/>
-            </w:pPr>
-            <w:r>
-              <w:rPr>
-                <w:sz w:val="19"/>
-              </w:rPr>
-              <w:t>[z. B. Commit-ID]</w:t>
-            </w:r>
-          </w:p>
-        </w:tc>
-      </w:tr>
-      <w:tr>
-        <w:trPr>
-          <w:cantSplit/>
-          <w:jc w:val="center"/>
-        </w:trPr>
-        <w:tc>
-          <w:tcPr>
-            <w:tcW w:w="2376" w:type="dxa"/>
-            <w:shd w:val="clear" w:color="auto" w:fill="EEF4F8"/>
-            <w:tcMar>
-              <w:top w:w="100" w:type="dxa"/>
-              <w:left w:w="100" w:type="dxa"/>
-              <w:bottom w:w="100" w:type="dxa"/>
-              <w:right w:w="100" w:type="dxa"/>
-            </w:tcMar>
-            <w:vAlign w:val="center"/>
-          </w:tcPr>
-          <w:p>
-            <w:pPr>
-              <w:spacing w:before="40" w:after="40"/>
-            </w:pPr>
-            <w:proofErr w:type="spellStart"/>
-            <w:r>
-              <w:rPr>
-                <w:b/>
-                <w:color w:val="1F4E79"/>
-                <w:sz w:val="19"/>
-              </w:rPr>
-              <w:t>Testframework</w:t>
-            </w:r>
-            <w:proofErr w:type="spellEnd"/>
-          </w:p>
-        </w:tc>
-        <w:tc>
-          <w:tcPr>
-            <w:tcW w:w="7704" w:type="dxa"/>
-            <w:tcMar>
-              <w:top w:w="100" w:type="dxa"/>
-              <w:left w:w="100" w:type="dxa"/>
-              <w:bottom w:w="100" w:type="dxa"/>
-              <w:right w:w="100" w:type="dxa"/>
-            </w:tcMar>
-            <w:vAlign w:val="center"/>
-          </w:tcPr>
-          <w:p>
-            <w:pPr>
-              <w:spacing w:before="40" w:after="40"/>
-            </w:pPr>
-            <w:r>
-              <w:rPr>
-                <w:sz w:val="19"/>
-              </w:rPr>
-              <w:t xml:space="preserve">[z. B. JUnit / </w:t>
-            </w:r>
-            <w:proofErr w:type="spellStart"/>
-            <w:r>
-              <w:rPr>
-                <w:sz w:val="19"/>
-              </w:rPr>
-              <w:t>pytest</w:t>
-            </w:r>
-            <w:proofErr w:type="spellEnd"/>
-            <w:r>
-              <w:rPr>
-                <w:sz w:val="19"/>
-              </w:rPr>
-              <w:t xml:space="preserve"> / Jest]</w:t>
-            </w:r>
-          </w:p>
-        </w:tc>
-      </w:tr>
-      <w:tr>
-        <w:trPr>
-          <w:cantSplit/>
-          <w:jc w:val="center"/>
-        </w:trPr>
-        <w:tc>
-          <w:tcPr>
-            <w:tcW w:w="2376" w:type="dxa"/>
-            <w:shd w:val="clear" w:color="auto" w:fill="EEF4F8"/>
-            <w:tcMar>
-              <w:top w:w="100" w:type="dxa"/>
-              <w:left w:w="100" w:type="dxa"/>
-              <w:bottom w:w="100" w:type="dxa"/>
-              <w:right w:w="100" w:type="dxa"/>
-            </w:tcMar>
-            <w:vAlign w:val="center"/>
-          </w:tcPr>
-          <w:p>
-            <w:pPr>
-              <w:spacing w:before="40" w:after="40"/>
-            </w:pPr>
-            <w:proofErr w:type="spellStart"/>
-            <w:r>
-              <w:rPr>
-                <w:b/>
-                <w:color w:val="1F4E79"/>
-                <w:sz w:val="19"/>
-              </w:rPr>
-              <w:t>Testumfang</w:t>
-            </w:r>
-            <w:proofErr w:type="spellEnd"/>
-          </w:p>
-        </w:tc>
-        <w:tc>
-          <w:tcPr>
-            <w:tcW w:w="7704" w:type="dxa"/>
-            <w:tcMar>
-              <w:top w:w="100" w:type="dxa"/>
-              <w:left w:w="100" w:type="dxa"/>
-              <w:bottom w:w="100" w:type="dxa"/>
-              <w:right w:w="100" w:type="dxa"/>
-            </w:tcMar>
-            <w:vAlign w:val="center"/>
-          </w:tcPr>
-          <w:p>
-            <w:pPr>
-              <w:spacing w:before="40" w:after="40"/>
-            </w:pPr>
-            <w:r>
-              <w:rPr>
-                <w:sz w:val="19"/>
-              </w:rPr>
-              <w:t>[</w:t>
-            </w:r>
-            <w:proofErr w:type="spellStart"/>
-            <w:r>
-              <w:rPr>
-                <w:sz w:val="19"/>
-              </w:rPr>
-              <w:t>Welche</w:t>
-            </w:r>
-            <w:proofErr w:type="spellEnd"/>
-            <w:r>
-              <w:rPr>
-                <w:sz w:val="19"/>
-              </w:rPr>
-              <w:t xml:space="preserve"> Units </w:t>
-            </w:r>
-            <w:proofErr w:type="spellStart"/>
-            <w:r>
-              <w:rPr>
-                <w:sz w:val="19"/>
-              </w:rPr>
-              <w:t>werden</w:t>
-            </w:r>
-            <w:proofErr w:type="spellEnd"/>
-            <w:r>
-              <w:rPr>
-                <w:sz w:val="19"/>
-              </w:rPr>
-              <w:t xml:space="preserve"> </w:t>
-            </w:r>
-            <w:proofErr w:type="spellStart"/>
-            <w:r>
-              <w:rPr>
-                <w:sz w:val="19"/>
-              </w:rPr>
-              <w:t>betrachtet</w:t>
-            </w:r>
-            <w:proofErr w:type="spellEnd"/>
-            <w:r>
-              <w:rPr>
-                <w:sz w:val="19"/>
-              </w:rPr>
-              <w:t>?]</w:t>
-            </w:r>
-          </w:p>
-        </w:tc>
-      </w:tr>
-    </w:tbl>
-    <w:p/>
     <w:p>
       <w:pPr>
         <w:pStyle w:val="berschrift2"/>
@@ -7331,6 +4589,7 @@
               <w:rPr>
                 <w:sz w:val="19"/>
               </w:rPr>
+              <w:lastRenderedPageBreak/>
               <w:t>UT-XXX</w:t>
             </w:r>
           </w:p>
@@ -7388,7 +4647,6 @@
               <w:spacing w:before="40" w:after="40"/>
             </w:pPr>
             <w:proofErr w:type="spellStart"/>
-            <w:proofErr w:type="gramStart"/>
             <w:r>
               <w:rPr>
                 <w:sz w:val="19"/>
@@ -7400,14 +4658,7 @@
               <w:rPr>
                 <w:sz w:val="19"/>
               </w:rPr>
-              <w:t>,</w:t>
-            </w:r>
-            <w:proofErr w:type="gramEnd"/>
-            <w:r>
-              <w:rPr>
-                <w:sz w:val="19"/>
-              </w:rPr>
-              <w:t xml:space="preserve"> was </w:t>
+              <w:t xml:space="preserve">, was </w:t>
             </w:r>
             <w:proofErr w:type="spellStart"/>
             <w:r>
@@ -7649,24 +4900,9 @@
               <w:rPr>
                 <w:sz w:val="19"/>
               </w:rPr>
-              <w:t xml:space="preserve">☐ </w:t>
-            </w:r>
-            <w:proofErr w:type="gramStart"/>
-            <w:r>
-              <w:rPr>
-                <w:sz w:val="19"/>
-              </w:rPr>
-              <w:t>Offen  ☐</w:t>
-            </w:r>
-            <w:proofErr w:type="gramEnd"/>
-            <w:r>
-              <w:rPr>
-                <w:sz w:val="19"/>
-              </w:rPr>
-              <w:t xml:space="preserve"> </w:t>
+              <w:t xml:space="preserve">☐ Offen  ☐ </w:t>
             </w:r>
             <w:proofErr w:type="spellStart"/>
-            <w:proofErr w:type="gramStart"/>
             <w:r>
               <w:rPr>
                 <w:sz w:val="19"/>
@@ -7678,14 +4914,7 @@
               <w:rPr>
                 <w:sz w:val="19"/>
               </w:rPr>
-              <w:t xml:space="preserve">  ☐</w:t>
-            </w:r>
-            <w:proofErr w:type="gramEnd"/>
-            <w:r>
-              <w:rPr>
-                <w:sz w:val="19"/>
-              </w:rPr>
-              <w:t xml:space="preserve"> </w:t>
+              <w:t xml:space="preserve">  ☐ </w:t>
             </w:r>
             <w:proofErr w:type="spellStart"/>
             <w:r>
@@ -7779,7 +5008,6 @@
               <w:spacing w:before="40" w:after="40"/>
             </w:pPr>
             <w:proofErr w:type="spellStart"/>
-            <w:proofErr w:type="gramStart"/>
             <w:r>
               <w:rPr>
                 <w:sz w:val="19"/>
@@ -7791,14 +5019,7 @@
               <w:rPr>
                 <w:sz w:val="19"/>
               </w:rPr>
-              <w:t>,</w:t>
-            </w:r>
-            <w:proofErr w:type="gramEnd"/>
-            <w:r>
-              <w:rPr>
-                <w:sz w:val="19"/>
-              </w:rPr>
-              <w:t xml:space="preserve"> was </w:t>
+              <w:t xml:space="preserve">, was </w:t>
             </w:r>
             <w:proofErr w:type="spellStart"/>
             <w:r>
@@ -8040,24 +5261,9 @@
               <w:rPr>
                 <w:sz w:val="19"/>
               </w:rPr>
-              <w:t xml:space="preserve">☐ </w:t>
-            </w:r>
-            <w:proofErr w:type="gramStart"/>
-            <w:r>
-              <w:rPr>
-                <w:sz w:val="19"/>
-              </w:rPr>
-              <w:t>Offen  ☐</w:t>
-            </w:r>
-            <w:proofErr w:type="gramEnd"/>
-            <w:r>
-              <w:rPr>
-                <w:sz w:val="19"/>
-              </w:rPr>
-              <w:t xml:space="preserve"> </w:t>
+              <w:t xml:space="preserve">☐ Offen  ☐ </w:t>
             </w:r>
             <w:proofErr w:type="spellStart"/>
-            <w:proofErr w:type="gramStart"/>
             <w:r>
               <w:rPr>
                 <w:sz w:val="19"/>
@@ -8069,14 +5275,7 @@
               <w:rPr>
                 <w:sz w:val="19"/>
               </w:rPr>
-              <w:t xml:space="preserve">  ☐</w:t>
-            </w:r>
-            <w:proofErr w:type="gramEnd"/>
-            <w:r>
-              <w:rPr>
-                <w:sz w:val="19"/>
-              </w:rPr>
-              <w:t xml:space="preserve"> </w:t>
+              <w:t xml:space="preserve">  ☐ </w:t>
             </w:r>
             <w:proofErr w:type="spellStart"/>
             <w:r>
@@ -8202,367 +5401,6 @@
     </w:p>
     <w:p>
       <w:pPr>
-        <w:pStyle w:val="Aufzhlungszeichen"/>
-        <w:rPr>
-          <w:lang w:val="de-DE"/>
-        </w:rPr>
-      </w:pPr>
-      <w:r>
-        <w:rPr>
-          <w:lang w:val="de-DE"/>
-        </w:rPr>
-        <w:t>Umgang mit ungültigen oder fehlenden Eingangsdaten.</w:t>
-      </w:r>
-    </w:p>
-    <w:p>
-      <w:pPr>
-        <w:pStyle w:val="Aufzhlungszeichen"/>
-        <w:rPr>
-          <w:lang w:val="de-DE"/>
-        </w:rPr>
-      </w:pPr>
-      <w:r>
-        <w:rPr>
-          <w:lang w:val="de-DE"/>
-        </w:rPr>
-        <w:t>Rundung und Datentypen bei numerischen Ergebnissen.</w:t>
-      </w:r>
-    </w:p>
-    <w:p>
-      <w:pPr>
-        <w:pStyle w:val="berschrift2"/>
-        <w:spacing w:before="160" w:after="120"/>
-      </w:pPr>
-      <w:proofErr w:type="spellStart"/>
-      <w:r>
-        <w:t>Ergebnisse</w:t>
-      </w:r>
-      <w:proofErr w:type="spellEnd"/>
-      <w:r>
-        <w:t xml:space="preserve"> / </w:t>
-      </w:r>
-      <w:proofErr w:type="spellStart"/>
-      <w:r>
-        <w:t>Auffälligkeiten</w:t>
-      </w:r>
-      <w:proofErr w:type="spellEnd"/>
-    </w:p>
-    <w:tbl>
-      <w:tblPr>
-        <w:tblStyle w:val="Tabellenraster"/>
-        <w:tblW w:w="0" w:type="auto"/>
-        <w:jc w:val="center"/>
-        <w:tblLook w:val="04A0" w:firstRow="1" w:lastRow="0" w:firstColumn="1" w:lastColumn="0" w:noHBand="0" w:noVBand="1"/>
-      </w:tblPr>
-      <w:tblGrid>
-        <w:gridCol w:w="1296"/>
-        <w:gridCol w:w="3672"/>
-        <w:gridCol w:w="3168"/>
-        <w:gridCol w:w="1800"/>
-      </w:tblGrid>
-      <w:tr>
-        <w:trPr>
-          <w:cantSplit/>
-          <w:tblHeader/>
-          <w:jc w:val="center"/>
-        </w:trPr>
-        <w:tc>
-          <w:tcPr>
-            <w:tcW w:w="1296" w:type="dxa"/>
-            <w:shd w:val="clear" w:color="auto" w:fill="D9EAF7"/>
-            <w:tcMar>
-              <w:top w:w="100" w:type="dxa"/>
-              <w:left w:w="100" w:type="dxa"/>
-              <w:bottom w:w="100" w:type="dxa"/>
-              <w:right w:w="100" w:type="dxa"/>
-            </w:tcMar>
-            <w:vAlign w:val="center"/>
-          </w:tcPr>
-          <w:p>
-            <w:pPr>
-              <w:spacing w:before="40" w:after="40"/>
-            </w:pPr>
-            <w:proofErr w:type="spellStart"/>
-            <w:r>
-              <w:rPr>
-                <w:b/>
-                <w:color w:val="1F4E79"/>
-                <w:sz w:val="19"/>
-              </w:rPr>
-              <w:t>Referenz</w:t>
-            </w:r>
-            <w:proofErr w:type="spellEnd"/>
-          </w:p>
-        </w:tc>
-        <w:tc>
-          <w:tcPr>
-            <w:tcW w:w="3672" w:type="dxa"/>
-            <w:shd w:val="clear" w:color="auto" w:fill="D9EAF7"/>
-            <w:tcMar>
-              <w:top w:w="100" w:type="dxa"/>
-              <w:left w:w="100" w:type="dxa"/>
-              <w:bottom w:w="100" w:type="dxa"/>
-              <w:right w:w="100" w:type="dxa"/>
-            </w:tcMar>
-            <w:vAlign w:val="center"/>
-          </w:tcPr>
-          <w:p>
-            <w:pPr>
-              <w:spacing w:before="40" w:after="40"/>
-            </w:pPr>
-            <w:proofErr w:type="spellStart"/>
-            <w:r>
-              <w:rPr>
-                <w:b/>
-                <w:color w:val="1F4E79"/>
-                <w:sz w:val="19"/>
-              </w:rPr>
-              <w:t>Beobachtung</w:t>
-            </w:r>
-            <w:proofErr w:type="spellEnd"/>
-          </w:p>
-        </w:tc>
-        <w:tc>
-          <w:tcPr>
-            <w:tcW w:w="3168" w:type="dxa"/>
-            <w:shd w:val="clear" w:color="auto" w:fill="D9EAF7"/>
-            <w:tcMar>
-              <w:top w:w="100" w:type="dxa"/>
-              <w:left w:w="100" w:type="dxa"/>
-              <w:bottom w:w="100" w:type="dxa"/>
-              <w:right w:w="100" w:type="dxa"/>
-            </w:tcMar>
-            <w:vAlign w:val="center"/>
-          </w:tcPr>
-          <w:p>
-            <w:pPr>
-              <w:spacing w:before="40" w:after="40"/>
-            </w:pPr>
-            <w:proofErr w:type="spellStart"/>
-            <w:r>
-              <w:rPr>
-                <w:b/>
-                <w:color w:val="1F4E79"/>
-                <w:sz w:val="19"/>
-              </w:rPr>
-              <w:t>Maßnahme</w:t>
-            </w:r>
-            <w:proofErr w:type="spellEnd"/>
-            <w:r>
-              <w:rPr>
-                <w:b/>
-                <w:color w:val="1F4E79"/>
-                <w:sz w:val="19"/>
-              </w:rPr>
-              <w:t xml:space="preserve"> / Ticket</w:t>
-            </w:r>
-          </w:p>
-        </w:tc>
-        <w:tc>
-          <w:tcPr>
-            <w:tcW w:w="1800" w:type="dxa"/>
-            <w:shd w:val="clear" w:color="auto" w:fill="D9EAF7"/>
-            <w:tcMar>
-              <w:top w:w="100" w:type="dxa"/>
-              <w:left w:w="100" w:type="dxa"/>
-              <w:bottom w:w="100" w:type="dxa"/>
-              <w:right w:w="100" w:type="dxa"/>
-            </w:tcMar>
-            <w:vAlign w:val="center"/>
-          </w:tcPr>
-          <w:p>
-            <w:pPr>
-              <w:spacing w:before="40" w:after="40"/>
-            </w:pPr>
-            <w:r>
-              <w:rPr>
-                <w:b/>
-                <w:color w:val="1F4E79"/>
-                <w:sz w:val="19"/>
-              </w:rPr>
-              <w:t>Status</w:t>
-            </w:r>
-          </w:p>
-        </w:tc>
-      </w:tr>
-      <w:tr>
-        <w:trPr>
-          <w:cantSplit/>
-          <w:jc w:val="center"/>
-        </w:trPr>
-        <w:tc>
-          <w:tcPr>
-            <w:tcW w:w="1296" w:type="dxa"/>
-            <w:tcMar>
-              <w:top w:w="100" w:type="dxa"/>
-              <w:left w:w="100" w:type="dxa"/>
-              <w:bottom w:w="100" w:type="dxa"/>
-              <w:right w:w="100" w:type="dxa"/>
-            </w:tcMar>
-            <w:vAlign w:val="center"/>
-          </w:tcPr>
-          <w:p>
-            <w:pPr>
-              <w:spacing w:before="40" w:after="40"/>
-            </w:pPr>
-            <w:r>
-              <w:rPr>
-                <w:sz w:val="19"/>
-              </w:rPr>
-              <w:t>[UT-ID]</w:t>
-            </w:r>
-          </w:p>
-        </w:tc>
-        <w:tc>
-          <w:tcPr>
-            <w:tcW w:w="3672" w:type="dxa"/>
-            <w:tcMar>
-              <w:top w:w="100" w:type="dxa"/>
-              <w:left w:w="100" w:type="dxa"/>
-              <w:bottom w:w="100" w:type="dxa"/>
-              <w:right w:w="100" w:type="dxa"/>
-            </w:tcMar>
-            <w:vAlign w:val="center"/>
-          </w:tcPr>
-          <w:p>
-            <w:pPr>
-              <w:spacing w:before="40" w:after="40"/>
-            </w:pPr>
-            <w:r>
-              <w:rPr>
-                <w:sz w:val="19"/>
-              </w:rPr>
-              <w:t>[</w:t>
-            </w:r>
-            <w:proofErr w:type="spellStart"/>
-            <w:r>
-              <w:rPr>
-                <w:sz w:val="19"/>
-              </w:rPr>
-              <w:t>Ergebnis</w:t>
-            </w:r>
-            <w:proofErr w:type="spellEnd"/>
-            <w:r>
-              <w:rPr>
-                <w:sz w:val="19"/>
-              </w:rPr>
-              <w:t xml:space="preserve"> oder </w:t>
-            </w:r>
-            <w:proofErr w:type="spellStart"/>
-            <w:r>
-              <w:rPr>
-                <w:sz w:val="19"/>
-              </w:rPr>
-              <w:t>Auffälligkeit</w:t>
-            </w:r>
-            <w:proofErr w:type="spellEnd"/>
-            <w:r>
-              <w:rPr>
-                <w:sz w:val="19"/>
-              </w:rPr>
-              <w:t>]</w:t>
-            </w:r>
-          </w:p>
-        </w:tc>
-        <w:tc>
-          <w:tcPr>
-            <w:tcW w:w="3168" w:type="dxa"/>
-            <w:tcMar>
-              <w:top w:w="100" w:type="dxa"/>
-              <w:left w:w="100" w:type="dxa"/>
-              <w:bottom w:w="100" w:type="dxa"/>
-              <w:right w:w="100" w:type="dxa"/>
-            </w:tcMar>
-            <w:vAlign w:val="center"/>
-          </w:tcPr>
-          <w:p>
-            <w:pPr>
-              <w:spacing w:before="40" w:after="40"/>
-            </w:pPr>
-            <w:r>
-              <w:rPr>
-                <w:sz w:val="19"/>
-              </w:rPr>
-              <w:t xml:space="preserve">[Ticket / </w:t>
-            </w:r>
-            <w:proofErr w:type="spellStart"/>
-            <w:r>
-              <w:rPr>
-                <w:sz w:val="19"/>
-              </w:rPr>
-              <w:t>keine</w:t>
-            </w:r>
-            <w:proofErr w:type="spellEnd"/>
-            <w:r>
-              <w:rPr>
-                <w:sz w:val="19"/>
-              </w:rPr>
-              <w:t xml:space="preserve"> </w:t>
-            </w:r>
-            <w:proofErr w:type="spellStart"/>
-            <w:r>
-              <w:rPr>
-                <w:sz w:val="19"/>
-              </w:rPr>
-              <w:t>Maßnahme</w:t>
-            </w:r>
-            <w:proofErr w:type="spellEnd"/>
-            <w:r>
-              <w:rPr>
-                <w:sz w:val="19"/>
-              </w:rPr>
-              <w:t>]</w:t>
-            </w:r>
-          </w:p>
-        </w:tc>
-        <w:tc>
-          <w:tcPr>
-            <w:tcW w:w="1800" w:type="dxa"/>
-            <w:tcMar>
-              <w:top w:w="100" w:type="dxa"/>
-              <w:left w:w="100" w:type="dxa"/>
-              <w:bottom w:w="100" w:type="dxa"/>
-              <w:right w:w="100" w:type="dxa"/>
-            </w:tcMar>
-            <w:vAlign w:val="center"/>
-          </w:tcPr>
-          <w:p>
-            <w:pPr>
-              <w:spacing w:before="40" w:after="40"/>
-            </w:pPr>
-            <w:r>
-              <w:rPr>
-                <w:sz w:val="19"/>
-              </w:rPr>
-              <w:t xml:space="preserve">[Offen / </w:t>
-            </w:r>
-            <w:proofErr w:type="spellStart"/>
-            <w:r>
-              <w:rPr>
-                <w:sz w:val="19"/>
-              </w:rPr>
-              <w:t>Erledigt</w:t>
-            </w:r>
-            <w:proofErr w:type="spellEnd"/>
-            <w:r>
-              <w:rPr>
-                <w:sz w:val="19"/>
-              </w:rPr>
-              <w:t>]</w:t>
-            </w:r>
-          </w:p>
-        </w:tc>
-      </w:tr>
-    </w:tbl>
-    <w:p>
-      <w:pPr>
-        <w:pStyle w:val="berschrift1"/>
-        <w:spacing w:before="240" w:after="120"/>
-      </w:pPr>
-    </w:p>
-    <w:p/>
-    <w:p>
-      <w:pPr>
         <w:pStyle w:val="berschrift1"/>
         <w:spacing w:before="240" w:after="120"/>
       </w:pPr>
@@ -8598,357 +5436,6 @@
         <w:t>Verwaltung der für das Restaurant relevanten Zutaten und deren Stammdaten.</w:t>
       </w:r>
     </w:p>
-    <w:tbl>
-      <w:tblPr>
-        <w:tblStyle w:val="Tabellenraster"/>
-        <w:tblW w:w="0" w:type="auto"/>
-        <w:jc w:val="center"/>
-        <w:tblLook w:val="04A0" w:firstRow="1" w:lastRow="0" w:firstColumn="1" w:lastColumn="0" w:noHBand="0" w:noVBand="1"/>
-      </w:tblPr>
-      <w:tblGrid>
-        <w:gridCol w:w="2376"/>
-        <w:gridCol w:w="7704"/>
-      </w:tblGrid>
-      <w:tr>
-        <w:trPr>
-          <w:cantSplit/>
-          <w:jc w:val="center"/>
-        </w:trPr>
-        <w:tc>
-          <w:tcPr>
-            <w:tcW w:w="2376" w:type="dxa"/>
-            <w:shd w:val="clear" w:color="auto" w:fill="EEF4F8"/>
-            <w:tcMar>
-              <w:top w:w="100" w:type="dxa"/>
-              <w:left w:w="100" w:type="dxa"/>
-              <w:bottom w:w="100" w:type="dxa"/>
-              <w:right w:w="100" w:type="dxa"/>
-            </w:tcMar>
-            <w:vAlign w:val="center"/>
-          </w:tcPr>
-          <w:p>
-            <w:pPr>
-              <w:spacing w:before="40" w:after="40"/>
-            </w:pPr>
-            <w:proofErr w:type="spellStart"/>
-            <w:r>
-              <w:rPr>
-                <w:b/>
-                <w:color w:val="1F4E79"/>
-                <w:sz w:val="19"/>
-              </w:rPr>
-              <w:t>Verantwortlich</w:t>
-            </w:r>
-            <w:proofErr w:type="spellEnd"/>
-          </w:p>
-        </w:tc>
-        <w:tc>
-          <w:tcPr>
-            <w:tcW w:w="7704" w:type="dxa"/>
-            <w:tcMar>
-              <w:top w:w="100" w:type="dxa"/>
-              <w:left w:w="100" w:type="dxa"/>
-              <w:bottom w:w="100" w:type="dxa"/>
-              <w:right w:w="100" w:type="dxa"/>
-            </w:tcMar>
-            <w:vAlign w:val="center"/>
-          </w:tcPr>
-          <w:p>
-            <w:pPr>
-              <w:spacing w:before="40" w:after="40"/>
-            </w:pPr>
-            <w:r>
-              <w:rPr>
-                <w:sz w:val="19"/>
-              </w:rPr>
-              <w:t>[Name / Team]</w:t>
-            </w:r>
-          </w:p>
-        </w:tc>
-      </w:tr>
-      <w:tr>
-        <w:trPr>
-          <w:cantSplit/>
-          <w:jc w:val="center"/>
-        </w:trPr>
-        <w:tc>
-          <w:tcPr>
-            <w:tcW w:w="2376" w:type="dxa"/>
-            <w:shd w:val="clear" w:color="auto" w:fill="EEF4F8"/>
-            <w:tcMar>
-              <w:top w:w="100" w:type="dxa"/>
-              <w:left w:w="100" w:type="dxa"/>
-              <w:bottom w:w="100" w:type="dxa"/>
-              <w:right w:w="100" w:type="dxa"/>
-            </w:tcMar>
-            <w:vAlign w:val="center"/>
-          </w:tcPr>
-          <w:p>
-            <w:pPr>
-              <w:spacing w:before="40" w:after="40"/>
-            </w:pPr>
-            <w:r>
-              <w:rPr>
-                <w:b/>
-                <w:color w:val="1F4E79"/>
-                <w:sz w:val="19"/>
-              </w:rPr>
-              <w:lastRenderedPageBreak/>
-              <w:t>Datum</w:t>
-            </w:r>
-          </w:p>
-        </w:tc>
-        <w:tc>
-          <w:tcPr>
-            <w:tcW w:w="7704" w:type="dxa"/>
-            <w:tcMar>
-              <w:top w:w="100" w:type="dxa"/>
-              <w:left w:w="100" w:type="dxa"/>
-              <w:bottom w:w="100" w:type="dxa"/>
-              <w:right w:w="100" w:type="dxa"/>
-            </w:tcMar>
-            <w:vAlign w:val="center"/>
-          </w:tcPr>
-          <w:p>
-            <w:pPr>
-              <w:spacing w:before="40" w:after="40"/>
-            </w:pPr>
-            <w:r>
-              <w:rPr>
-                <w:sz w:val="19"/>
-              </w:rPr>
-              <w:t>[TT.MM.JJJJ]</w:t>
-            </w:r>
-          </w:p>
-        </w:tc>
-      </w:tr>
-      <w:tr>
-        <w:trPr>
-          <w:cantSplit/>
-          <w:jc w:val="center"/>
-        </w:trPr>
-        <w:tc>
-          <w:tcPr>
-            <w:tcW w:w="2376" w:type="dxa"/>
-            <w:shd w:val="clear" w:color="auto" w:fill="EEF4F8"/>
-            <w:tcMar>
-              <w:top w:w="100" w:type="dxa"/>
-              <w:left w:w="100" w:type="dxa"/>
-              <w:bottom w:w="100" w:type="dxa"/>
-              <w:right w:w="100" w:type="dxa"/>
-            </w:tcMar>
-            <w:vAlign w:val="center"/>
-          </w:tcPr>
-          <w:p>
-            <w:pPr>
-              <w:spacing w:before="40" w:after="40"/>
-            </w:pPr>
-            <w:r>
-              <w:rPr>
-                <w:b/>
-                <w:color w:val="1F4E79"/>
-                <w:sz w:val="19"/>
-              </w:rPr>
-              <w:t>Build / Commit</w:t>
-            </w:r>
-          </w:p>
-        </w:tc>
-        <w:tc>
-          <w:tcPr>
-            <w:tcW w:w="7704" w:type="dxa"/>
-            <w:tcMar>
-              <w:top w:w="100" w:type="dxa"/>
-              <w:left w:w="100" w:type="dxa"/>
-              <w:bottom w:w="100" w:type="dxa"/>
-              <w:right w:w="100" w:type="dxa"/>
-            </w:tcMar>
-            <w:vAlign w:val="center"/>
-          </w:tcPr>
-          <w:p>
-            <w:pPr>
-              <w:spacing w:before="40" w:after="40"/>
-            </w:pPr>
-            <w:r>
-              <w:rPr>
-                <w:sz w:val="19"/>
-              </w:rPr>
-              <w:t>[z. B. Commit-ID]</w:t>
-            </w:r>
-          </w:p>
-        </w:tc>
-      </w:tr>
-      <w:tr>
-        <w:trPr>
-          <w:cantSplit/>
-          <w:jc w:val="center"/>
-        </w:trPr>
-        <w:tc>
-          <w:tcPr>
-            <w:tcW w:w="2376" w:type="dxa"/>
-            <w:shd w:val="clear" w:color="auto" w:fill="EEF4F8"/>
-            <w:tcMar>
-              <w:top w:w="100" w:type="dxa"/>
-              <w:left w:w="100" w:type="dxa"/>
-              <w:bottom w:w="100" w:type="dxa"/>
-              <w:right w:w="100" w:type="dxa"/>
-            </w:tcMar>
-            <w:vAlign w:val="center"/>
-          </w:tcPr>
-          <w:p>
-            <w:pPr>
-              <w:spacing w:before="40" w:after="40"/>
-            </w:pPr>
-            <w:proofErr w:type="spellStart"/>
-            <w:r>
-              <w:rPr>
-                <w:b/>
-                <w:color w:val="1F4E79"/>
-                <w:sz w:val="19"/>
-              </w:rPr>
-              <w:t>Testframework</w:t>
-            </w:r>
-            <w:proofErr w:type="spellEnd"/>
-          </w:p>
-        </w:tc>
-        <w:tc>
-          <w:tcPr>
-            <w:tcW w:w="7704" w:type="dxa"/>
-            <w:tcMar>
-              <w:top w:w="100" w:type="dxa"/>
-              <w:left w:w="100" w:type="dxa"/>
-              <w:bottom w:w="100" w:type="dxa"/>
-              <w:right w:w="100" w:type="dxa"/>
-            </w:tcMar>
-            <w:vAlign w:val="center"/>
-          </w:tcPr>
-          <w:p>
-            <w:pPr>
-              <w:spacing w:before="40" w:after="40"/>
-            </w:pPr>
-            <w:r>
-              <w:rPr>
-                <w:sz w:val="19"/>
-              </w:rPr>
-              <w:t xml:space="preserve">[z. B. JUnit / </w:t>
-            </w:r>
-            <w:proofErr w:type="spellStart"/>
-            <w:r>
-              <w:rPr>
-                <w:sz w:val="19"/>
-              </w:rPr>
-              <w:t>pytest</w:t>
-            </w:r>
-            <w:proofErr w:type="spellEnd"/>
-            <w:r>
-              <w:rPr>
-                <w:sz w:val="19"/>
-              </w:rPr>
-              <w:t xml:space="preserve"> / Jest]</w:t>
-            </w:r>
-          </w:p>
-        </w:tc>
-      </w:tr>
-      <w:tr>
-        <w:trPr>
-          <w:cantSplit/>
-          <w:jc w:val="center"/>
-        </w:trPr>
-        <w:tc>
-          <w:tcPr>
-            <w:tcW w:w="2376" w:type="dxa"/>
-            <w:shd w:val="clear" w:color="auto" w:fill="EEF4F8"/>
-            <w:tcMar>
-              <w:top w:w="100" w:type="dxa"/>
-              <w:left w:w="100" w:type="dxa"/>
-              <w:bottom w:w="100" w:type="dxa"/>
-              <w:right w:w="100" w:type="dxa"/>
-            </w:tcMar>
-            <w:vAlign w:val="center"/>
-          </w:tcPr>
-          <w:p>
-            <w:pPr>
-              <w:spacing w:before="40" w:after="40"/>
-            </w:pPr>
-            <w:proofErr w:type="spellStart"/>
-            <w:r>
-              <w:rPr>
-                <w:b/>
-                <w:color w:val="1F4E79"/>
-                <w:sz w:val="19"/>
-              </w:rPr>
-              <w:t>Testumfang</w:t>
-            </w:r>
-            <w:proofErr w:type="spellEnd"/>
-          </w:p>
-        </w:tc>
-        <w:tc>
-          <w:tcPr>
-            <w:tcW w:w="7704" w:type="dxa"/>
-            <w:tcMar>
-              <w:top w:w="100" w:type="dxa"/>
-              <w:left w:w="100" w:type="dxa"/>
-              <w:bottom w:w="100" w:type="dxa"/>
-              <w:right w:w="100" w:type="dxa"/>
-            </w:tcMar>
-            <w:vAlign w:val="center"/>
-          </w:tcPr>
-          <w:p>
-            <w:pPr>
-              <w:spacing w:before="40" w:after="40"/>
-            </w:pPr>
-            <w:r>
-              <w:rPr>
-                <w:sz w:val="19"/>
-              </w:rPr>
-              <w:t>[</w:t>
-            </w:r>
-            <w:proofErr w:type="spellStart"/>
-            <w:r>
-              <w:rPr>
-                <w:sz w:val="19"/>
-              </w:rPr>
-              <w:t>Welche</w:t>
-            </w:r>
-            <w:proofErr w:type="spellEnd"/>
-            <w:r>
-              <w:rPr>
-                <w:sz w:val="19"/>
-              </w:rPr>
-              <w:t xml:space="preserve"> Units </w:t>
-            </w:r>
-            <w:proofErr w:type="spellStart"/>
-            <w:r>
-              <w:rPr>
-                <w:sz w:val="19"/>
-              </w:rPr>
-              <w:t>werden</w:t>
-            </w:r>
-            <w:proofErr w:type="spellEnd"/>
-            <w:r>
-              <w:rPr>
-                <w:sz w:val="19"/>
-              </w:rPr>
-              <w:t xml:space="preserve"> </w:t>
-            </w:r>
-            <w:proofErr w:type="spellStart"/>
-            <w:r>
-              <w:rPr>
-                <w:sz w:val="19"/>
-              </w:rPr>
-              <w:t>betrachtet</w:t>
-            </w:r>
-            <w:proofErr w:type="spellEnd"/>
-            <w:r>
-              <w:rPr>
-                <w:sz w:val="19"/>
-              </w:rPr>
-              <w:t>?]</w:t>
-            </w:r>
-          </w:p>
-        </w:tc>
-      </w:tr>
-    </w:tbl>
-    <w:p/>
     <w:p>
       <w:pPr>
         <w:pStyle w:val="berschrift2"/>
@@ -8968,12 +5455,12 @@
         <w:tblLook w:val="04A0" w:firstRow="1" w:lastRow="0" w:firstColumn="1" w:lastColumn="0" w:noHBand="0" w:noVBand="1"/>
       </w:tblPr>
       <w:tblGrid>
-        <w:gridCol w:w="956"/>
+        <w:gridCol w:w="953"/>
         <w:gridCol w:w="2393"/>
-        <w:gridCol w:w="1276"/>
-        <w:gridCol w:w="1430"/>
-        <w:gridCol w:w="1257"/>
-        <w:gridCol w:w="1333"/>
+        <w:gridCol w:w="1270"/>
+        <w:gridCol w:w="1428"/>
+        <w:gridCol w:w="1243"/>
+        <w:gridCol w:w="1358"/>
         <w:gridCol w:w="1491"/>
       </w:tblGrid>
       <w:tr>
@@ -9241,7 +5728,13 @@
               <w:rPr>
                 <w:sz w:val="19"/>
               </w:rPr>
-              <w:t>UT-XXX</w:t>
+              <w:t>UT-</w:t>
+            </w:r>
+            <w:r>
+              <w:rPr>
+                <w:sz w:val="19"/>
+              </w:rPr>
+              <w:t>03</w:t>
             </w:r>
           </w:p>
         </w:tc>
@@ -9271,7 +5764,7 @@
               <w:rPr>
                 <w:sz w:val="19"/>
               </w:rPr>
-              <w:t>MitarbeiterService.create</w:t>
+              <w:t>ZutatAdapterTest</w:t>
             </w:r>
             <w:proofErr w:type="spellEnd"/>
             <w:r>
@@ -9296,56 +5789,23 @@
           <w:p>
             <w:pPr>
               <w:spacing w:before="40" w:after="40"/>
+              <w:rPr>
+                <w:lang w:val="de-DE"/>
+              </w:rPr>
             </w:pPr>
-            <w:proofErr w:type="spellStart"/>
-            <w:proofErr w:type="gramStart"/>
-            <w:r>
-              <w:rPr>
-                <w:sz w:val="19"/>
-              </w:rPr>
-              <w:t>Beschreibt</w:t>
-            </w:r>
-            <w:proofErr w:type="spellEnd"/>
-            <w:r>
-              <w:rPr>
-                <w:sz w:val="19"/>
-              </w:rPr>
-              <w:t>,</w:t>
-            </w:r>
-            <w:proofErr w:type="gramEnd"/>
-            <w:r>
-              <w:rPr>
-                <w:sz w:val="19"/>
-              </w:rPr>
-              <w:t xml:space="preserve"> was </w:t>
-            </w:r>
-            <w:proofErr w:type="spellStart"/>
-            <w:r>
-              <w:rPr>
-                <w:sz w:val="19"/>
-              </w:rPr>
-              <w:t>geprüft</w:t>
-            </w:r>
-            <w:proofErr w:type="spellEnd"/>
-            <w:r>
-              <w:rPr>
-                <w:sz w:val="19"/>
-              </w:rPr>
-              <w:t xml:space="preserve"> </w:t>
-            </w:r>
-            <w:proofErr w:type="spellStart"/>
-            <w:r>
-              <w:rPr>
-                <w:sz w:val="19"/>
-              </w:rPr>
-              <w:t>wird</w:t>
-            </w:r>
-            <w:proofErr w:type="spellEnd"/>
-            <w:r>
-              <w:rPr>
-                <w:sz w:val="19"/>
-              </w:rPr>
-              <w:t>.</w:t>
+            <w:r>
+              <w:rPr>
+                <w:sz w:val="19"/>
+                <w:lang w:val="de-DE"/>
+              </w:rPr>
+              <w:t>Prüft ob der Zutat-A</w:t>
+            </w:r>
+            <w:r>
+              <w:rPr>
+                <w:sz w:val="19"/>
+                <w:lang w:val="de-DE"/>
+              </w:rPr>
+              <w:t>dapter funktioniert</w:t>
             </w:r>
           </w:p>
         </w:tc>
@@ -9366,46 +5826,17 @@
             </w:pPr>
             <w:proofErr w:type="spellStart"/>
             <w:r>
-              <w:rPr>
-                <w:sz w:val="19"/>
-              </w:rPr>
-              <w:t>Relevante</w:t>
+              <w:t>Zutat</w:t>
             </w:r>
             <w:proofErr w:type="spellEnd"/>
             <w:r>
-              <w:rPr>
-                <w:sz w:val="19"/>
-              </w:rPr>
-              <w:t xml:space="preserve"> </w:t>
+              <w:t xml:space="preserve">-Adapter </w:t>
             </w:r>
             <w:proofErr w:type="spellStart"/>
             <w:r>
-              <w:rPr>
-                <w:sz w:val="19"/>
-              </w:rPr>
-              <w:t>Objekte</w:t>
+              <w:t>existiert</w:t>
             </w:r>
             <w:proofErr w:type="spellEnd"/>
-            <w:r>
-              <w:rPr>
-                <w:sz w:val="19"/>
-              </w:rPr>
-              <w:t xml:space="preserve"> / Mocks </w:t>
-            </w:r>
-            <w:proofErr w:type="spellStart"/>
-            <w:r>
-              <w:rPr>
-                <w:sz w:val="19"/>
-              </w:rPr>
-              <w:t>vorhanden</w:t>
-            </w:r>
-            <w:proofErr w:type="spellEnd"/>
-            <w:r>
-              <w:rPr>
-                <w:sz w:val="19"/>
-              </w:rPr>
-              <w:t>.</w:t>
-            </w:r>
           </w:p>
         </w:tc>
         <w:tc>
@@ -9423,47 +5854,8 @@
             <w:pPr>
               <w:spacing w:before="40" w:after="40"/>
             </w:pPr>
-            <w:proofErr w:type="spellStart"/>
-            <w:r>
-              <w:rPr>
-                <w:sz w:val="19"/>
-              </w:rPr>
-              <w:t>Konkrete</w:t>
-            </w:r>
-            <w:proofErr w:type="spellEnd"/>
-            <w:r>
-              <w:rPr>
-                <w:sz w:val="19"/>
-              </w:rPr>
-              <w:t xml:space="preserve"> </w:t>
-            </w:r>
-            <w:proofErr w:type="spellStart"/>
-            <w:r>
-              <w:rPr>
-                <w:sz w:val="19"/>
-              </w:rPr>
-              <w:t>Testwerte</w:t>
-            </w:r>
-            <w:proofErr w:type="spellEnd"/>
-            <w:r>
-              <w:rPr>
-                <w:sz w:val="19"/>
-              </w:rPr>
-              <w:t xml:space="preserve"> </w:t>
-            </w:r>
-            <w:proofErr w:type="spellStart"/>
-            <w:r>
-              <w:rPr>
-                <w:sz w:val="19"/>
-              </w:rPr>
-              <w:t>eintragen</w:t>
-            </w:r>
-            <w:proofErr w:type="spellEnd"/>
-            <w:r>
-              <w:rPr>
-                <w:sz w:val="19"/>
-              </w:rPr>
-              <w:t>.</w:t>
+            <w:r>
+              <w:t>/</w:t>
             </w:r>
           </w:p>
         </w:tc>
@@ -9481,62 +5873,23 @@
           <w:p>
             <w:pPr>
               <w:spacing w:before="40" w:after="40"/>
+              <w:rPr>
+                <w:lang w:val="de-DE"/>
+              </w:rPr>
             </w:pPr>
-            <w:proofErr w:type="spellStart"/>
-            <w:r>
-              <w:rPr>
-                <w:sz w:val="19"/>
-              </w:rPr>
-              <w:t>Konkretes</w:t>
-            </w:r>
-            <w:proofErr w:type="spellEnd"/>
-            <w:r>
-              <w:rPr>
-                <w:sz w:val="19"/>
-              </w:rPr>
-              <w:t xml:space="preserve"> </w:t>
-            </w:r>
-            <w:proofErr w:type="spellStart"/>
-            <w:r>
-              <w:rPr>
-                <w:sz w:val="19"/>
-              </w:rPr>
-              <w:t>erwartetes</w:t>
-            </w:r>
-            <w:proofErr w:type="spellEnd"/>
-            <w:r>
-              <w:rPr>
-                <w:sz w:val="19"/>
-              </w:rPr>
-              <w:t xml:space="preserve"> </w:t>
-            </w:r>
-            <w:proofErr w:type="spellStart"/>
-            <w:r>
-              <w:rPr>
-                <w:sz w:val="19"/>
-              </w:rPr>
-              <w:t>Verhalten</w:t>
-            </w:r>
-            <w:proofErr w:type="spellEnd"/>
-            <w:r>
-              <w:rPr>
-                <w:sz w:val="19"/>
-              </w:rPr>
-              <w:t xml:space="preserve"> </w:t>
-            </w:r>
-            <w:proofErr w:type="spellStart"/>
-            <w:r>
-              <w:rPr>
-                <w:sz w:val="19"/>
-              </w:rPr>
-              <w:t>eintragen</w:t>
-            </w:r>
-            <w:proofErr w:type="spellEnd"/>
-            <w:r>
-              <w:rPr>
-                <w:sz w:val="19"/>
-              </w:rPr>
-              <w:t>.</w:t>
+            <w:r>
+              <w:rPr>
+                <w:sz w:val="19"/>
+                <w:lang w:val="de-DE"/>
+              </w:rPr>
+              <w:t>Es wird kein Error a</w:t>
+            </w:r>
+            <w:r>
+              <w:rPr>
+                <w:sz w:val="19"/>
+                <w:lang w:val="de-DE"/>
+              </w:rPr>
+              <w:t>usgegeben</w:t>
             </w:r>
           </w:p>
         </w:tc>
@@ -9555,54 +5908,12 @@
             <w:pPr>
               <w:spacing w:before="40" w:after="40"/>
             </w:pPr>
-            <w:r>
-              <w:rPr>
-                <w:sz w:val="19"/>
-              </w:rPr>
-              <w:t xml:space="preserve">☐ </w:t>
-            </w:r>
-            <w:proofErr w:type="gramStart"/>
-            <w:r>
-              <w:rPr>
-                <w:sz w:val="19"/>
-              </w:rPr>
-              <w:t>Offen  ☐</w:t>
-            </w:r>
-            <w:proofErr w:type="gramEnd"/>
-            <w:r>
-              <w:rPr>
-                <w:sz w:val="19"/>
-              </w:rPr>
-              <w:t xml:space="preserve"> </w:t>
-            </w:r>
             <w:proofErr w:type="spellStart"/>
-            <w:proofErr w:type="gramStart"/>
             <w:r>
               <w:rPr>
                 <w:sz w:val="19"/>
               </w:rPr>
               <w:t>Bestanden</w:t>
-            </w:r>
-            <w:proofErr w:type="spellEnd"/>
-            <w:r>
-              <w:rPr>
-                <w:sz w:val="19"/>
-              </w:rPr>
-              <w:t xml:space="preserve">  ☐</w:t>
-            </w:r>
-            <w:proofErr w:type="gramEnd"/>
-            <w:r>
-              <w:rPr>
-                <w:sz w:val="19"/>
-              </w:rPr>
-              <w:t xml:space="preserve"> </w:t>
-            </w:r>
-            <w:proofErr w:type="spellStart"/>
-            <w:r>
-              <w:rPr>
-                <w:sz w:val="19"/>
-              </w:rPr>
-              <w:t>Fehlgeschlagen</w:t>
             </w:r>
             <w:proofErr w:type="spellEnd"/>
           </w:p>
@@ -9689,7 +6000,6 @@
               <w:spacing w:before="40" w:after="40"/>
             </w:pPr>
             <w:proofErr w:type="spellStart"/>
-            <w:proofErr w:type="gramStart"/>
             <w:r>
               <w:rPr>
                 <w:sz w:val="19"/>
@@ -9701,14 +6011,7 @@
               <w:rPr>
                 <w:sz w:val="19"/>
               </w:rPr>
-              <w:t>,</w:t>
-            </w:r>
-            <w:proofErr w:type="gramEnd"/>
-            <w:r>
-              <w:rPr>
-                <w:sz w:val="19"/>
-              </w:rPr>
-              <w:t xml:space="preserve"> was </w:t>
+              <w:t xml:space="preserve">, was </w:t>
             </w:r>
             <w:proofErr w:type="spellStart"/>
             <w:r>
@@ -9950,24 +6253,9 @@
               <w:rPr>
                 <w:sz w:val="19"/>
               </w:rPr>
-              <w:t xml:space="preserve">☐ </w:t>
-            </w:r>
-            <w:proofErr w:type="gramStart"/>
-            <w:r>
-              <w:rPr>
-                <w:sz w:val="19"/>
-              </w:rPr>
-              <w:t>Offen  ☐</w:t>
-            </w:r>
-            <w:proofErr w:type="gramEnd"/>
-            <w:r>
-              <w:rPr>
-                <w:sz w:val="19"/>
-              </w:rPr>
-              <w:t xml:space="preserve"> </w:t>
+              <w:t xml:space="preserve">☐ Offen  ☐ </w:t>
             </w:r>
             <w:proofErr w:type="spellStart"/>
-            <w:proofErr w:type="gramStart"/>
             <w:r>
               <w:rPr>
                 <w:sz w:val="19"/>
@@ -9979,14 +6267,7 @@
               <w:rPr>
                 <w:sz w:val="19"/>
               </w:rPr>
-              <w:t xml:space="preserve">  ☐</w:t>
-            </w:r>
-            <w:proofErr w:type="gramEnd"/>
-            <w:r>
-              <w:rPr>
-                <w:sz w:val="19"/>
-              </w:rPr>
-              <w:t xml:space="preserve"> </w:t>
+              <w:t xml:space="preserve">  ☐ </w:t>
             </w:r>
             <w:proofErr w:type="spellStart"/>
             <w:r>
@@ -10101,350 +6382,16 @@
     <w:p>
       <w:pPr>
         <w:pStyle w:val="Aufzhlungszeichen"/>
+        <w:numPr>
+          <w:ilvl w:val="0"/>
+          <w:numId w:val="0"/>
+        </w:numPr>
+        <w:ind w:left="360"/>
         <w:rPr>
           <w:lang w:val="de-DE"/>
         </w:rPr>
       </w:pPr>
-      <w:r>
-        <w:rPr>
-          <w:lang w:val="de-DE"/>
-        </w:rPr>
-        <w:t>Behandlung doppelter oder nicht gefundener Zutaten.</w:t>
-      </w:r>
     </w:p>
-    <w:p>
-      <w:pPr>
-        <w:pStyle w:val="berschrift2"/>
-        <w:spacing w:before="160" w:after="120"/>
-      </w:pPr>
-      <w:proofErr w:type="spellStart"/>
-      <w:r>
-        <w:t>Ergebnisse</w:t>
-      </w:r>
-      <w:proofErr w:type="spellEnd"/>
-      <w:r>
-        <w:t xml:space="preserve"> / </w:t>
-      </w:r>
-      <w:proofErr w:type="spellStart"/>
-      <w:r>
-        <w:t>Auffälligkeiten</w:t>
-      </w:r>
-      <w:proofErr w:type="spellEnd"/>
-    </w:p>
-    <w:tbl>
-      <w:tblPr>
-        <w:tblStyle w:val="Tabellenraster"/>
-        <w:tblW w:w="0" w:type="auto"/>
-        <w:jc w:val="center"/>
-        <w:tblLook w:val="04A0" w:firstRow="1" w:lastRow="0" w:firstColumn="1" w:lastColumn="0" w:noHBand="0" w:noVBand="1"/>
-      </w:tblPr>
-      <w:tblGrid>
-        <w:gridCol w:w="1296"/>
-        <w:gridCol w:w="3672"/>
-        <w:gridCol w:w="3168"/>
-        <w:gridCol w:w="1800"/>
-      </w:tblGrid>
-      <w:tr>
-        <w:trPr>
-          <w:cantSplit/>
-          <w:tblHeader/>
-          <w:jc w:val="center"/>
-        </w:trPr>
-        <w:tc>
-          <w:tcPr>
-            <w:tcW w:w="1296" w:type="dxa"/>
-            <w:shd w:val="clear" w:color="auto" w:fill="D9EAF7"/>
-            <w:tcMar>
-              <w:top w:w="100" w:type="dxa"/>
-              <w:left w:w="100" w:type="dxa"/>
-              <w:bottom w:w="100" w:type="dxa"/>
-              <w:right w:w="100" w:type="dxa"/>
-            </w:tcMar>
-            <w:vAlign w:val="center"/>
-          </w:tcPr>
-          <w:p>
-            <w:pPr>
-              <w:spacing w:before="40" w:after="40"/>
-            </w:pPr>
-            <w:proofErr w:type="spellStart"/>
-            <w:r>
-              <w:rPr>
-                <w:b/>
-                <w:color w:val="1F4E79"/>
-                <w:sz w:val="19"/>
-              </w:rPr>
-              <w:t>Referenz</w:t>
-            </w:r>
-            <w:proofErr w:type="spellEnd"/>
-          </w:p>
-        </w:tc>
-        <w:tc>
-          <w:tcPr>
-            <w:tcW w:w="3672" w:type="dxa"/>
-            <w:shd w:val="clear" w:color="auto" w:fill="D9EAF7"/>
-            <w:tcMar>
-              <w:top w:w="100" w:type="dxa"/>
-              <w:left w:w="100" w:type="dxa"/>
-              <w:bottom w:w="100" w:type="dxa"/>
-              <w:right w:w="100" w:type="dxa"/>
-            </w:tcMar>
-            <w:vAlign w:val="center"/>
-          </w:tcPr>
-          <w:p>
-            <w:pPr>
-              <w:spacing w:before="40" w:after="40"/>
-            </w:pPr>
-            <w:proofErr w:type="spellStart"/>
-            <w:r>
-              <w:rPr>
-                <w:b/>
-                <w:color w:val="1F4E79"/>
-                <w:sz w:val="19"/>
-              </w:rPr>
-              <w:t>Beobachtung</w:t>
-            </w:r>
-            <w:proofErr w:type="spellEnd"/>
-          </w:p>
-        </w:tc>
-        <w:tc>
-          <w:tcPr>
-            <w:tcW w:w="3168" w:type="dxa"/>
-            <w:shd w:val="clear" w:color="auto" w:fill="D9EAF7"/>
-            <w:tcMar>
-              <w:top w:w="100" w:type="dxa"/>
-              <w:left w:w="100" w:type="dxa"/>
-              <w:bottom w:w="100" w:type="dxa"/>
-              <w:right w:w="100" w:type="dxa"/>
-            </w:tcMar>
-            <w:vAlign w:val="center"/>
-          </w:tcPr>
-          <w:p>
-            <w:pPr>
-              <w:spacing w:before="40" w:after="40"/>
-            </w:pPr>
-            <w:proofErr w:type="spellStart"/>
-            <w:r>
-              <w:rPr>
-                <w:b/>
-                <w:color w:val="1F4E79"/>
-                <w:sz w:val="19"/>
-              </w:rPr>
-              <w:t>Maßnahme</w:t>
-            </w:r>
-            <w:proofErr w:type="spellEnd"/>
-            <w:r>
-              <w:rPr>
-                <w:b/>
-                <w:color w:val="1F4E79"/>
-                <w:sz w:val="19"/>
-              </w:rPr>
-              <w:t xml:space="preserve"> / Ticket</w:t>
-            </w:r>
-          </w:p>
-        </w:tc>
-        <w:tc>
-          <w:tcPr>
-            <w:tcW w:w="1800" w:type="dxa"/>
-            <w:shd w:val="clear" w:color="auto" w:fill="D9EAF7"/>
-            <w:tcMar>
-              <w:top w:w="100" w:type="dxa"/>
-              <w:left w:w="100" w:type="dxa"/>
-              <w:bottom w:w="100" w:type="dxa"/>
-              <w:right w:w="100" w:type="dxa"/>
-            </w:tcMar>
-            <w:vAlign w:val="center"/>
-          </w:tcPr>
-          <w:p>
-            <w:pPr>
-              <w:spacing w:before="40" w:after="40"/>
-            </w:pPr>
-            <w:r>
-              <w:rPr>
-                <w:b/>
-                <w:color w:val="1F4E79"/>
-                <w:sz w:val="19"/>
-              </w:rPr>
-              <w:t>Status</w:t>
-            </w:r>
-          </w:p>
-        </w:tc>
-      </w:tr>
-      <w:tr>
-        <w:trPr>
-          <w:cantSplit/>
-          <w:jc w:val="center"/>
-        </w:trPr>
-        <w:tc>
-          <w:tcPr>
-            <w:tcW w:w="1296" w:type="dxa"/>
-            <w:tcMar>
-              <w:top w:w="100" w:type="dxa"/>
-              <w:left w:w="100" w:type="dxa"/>
-              <w:bottom w:w="100" w:type="dxa"/>
-              <w:right w:w="100" w:type="dxa"/>
-            </w:tcMar>
-            <w:vAlign w:val="center"/>
-          </w:tcPr>
-          <w:p>
-            <w:pPr>
-              <w:spacing w:before="40" w:after="40"/>
-            </w:pPr>
-            <w:r>
-              <w:rPr>
-                <w:sz w:val="19"/>
-              </w:rPr>
-              <w:t>[UT-ID]</w:t>
-            </w:r>
-          </w:p>
-        </w:tc>
-        <w:tc>
-          <w:tcPr>
-            <w:tcW w:w="3672" w:type="dxa"/>
-            <w:tcMar>
-              <w:top w:w="100" w:type="dxa"/>
-              <w:left w:w="100" w:type="dxa"/>
-              <w:bottom w:w="100" w:type="dxa"/>
-              <w:right w:w="100" w:type="dxa"/>
-            </w:tcMar>
-            <w:vAlign w:val="center"/>
-          </w:tcPr>
-          <w:p>
-            <w:pPr>
-              <w:spacing w:before="40" w:after="40"/>
-            </w:pPr>
-            <w:r>
-              <w:rPr>
-                <w:sz w:val="19"/>
-              </w:rPr>
-              <w:t>[</w:t>
-            </w:r>
-            <w:proofErr w:type="spellStart"/>
-            <w:r>
-              <w:rPr>
-                <w:sz w:val="19"/>
-              </w:rPr>
-              <w:t>Ergebnis</w:t>
-            </w:r>
-            <w:proofErr w:type="spellEnd"/>
-            <w:r>
-              <w:rPr>
-                <w:sz w:val="19"/>
-              </w:rPr>
-              <w:t xml:space="preserve"> oder </w:t>
-            </w:r>
-            <w:proofErr w:type="spellStart"/>
-            <w:r>
-              <w:rPr>
-                <w:sz w:val="19"/>
-              </w:rPr>
-              <w:t>Auffälligkeit</w:t>
-            </w:r>
-            <w:proofErr w:type="spellEnd"/>
-            <w:r>
-              <w:rPr>
-                <w:sz w:val="19"/>
-              </w:rPr>
-              <w:t>]</w:t>
-            </w:r>
-          </w:p>
-        </w:tc>
-        <w:tc>
-          <w:tcPr>
-            <w:tcW w:w="3168" w:type="dxa"/>
-            <w:tcMar>
-              <w:top w:w="100" w:type="dxa"/>
-              <w:left w:w="100" w:type="dxa"/>
-              <w:bottom w:w="100" w:type="dxa"/>
-              <w:right w:w="100" w:type="dxa"/>
-            </w:tcMar>
-            <w:vAlign w:val="center"/>
-          </w:tcPr>
-          <w:p>
-            <w:pPr>
-              <w:spacing w:before="40" w:after="40"/>
-            </w:pPr>
-            <w:r>
-              <w:rPr>
-                <w:sz w:val="19"/>
-              </w:rPr>
-              <w:t xml:space="preserve">[Ticket / </w:t>
-            </w:r>
-            <w:proofErr w:type="spellStart"/>
-            <w:r>
-              <w:rPr>
-                <w:sz w:val="19"/>
-              </w:rPr>
-              <w:t>keine</w:t>
-            </w:r>
-            <w:proofErr w:type="spellEnd"/>
-            <w:r>
-              <w:rPr>
-                <w:sz w:val="19"/>
-              </w:rPr>
-              <w:t xml:space="preserve"> </w:t>
-            </w:r>
-            <w:proofErr w:type="spellStart"/>
-            <w:r>
-              <w:rPr>
-                <w:sz w:val="19"/>
-              </w:rPr>
-              <w:t>Maßnahme</w:t>
-            </w:r>
-            <w:proofErr w:type="spellEnd"/>
-            <w:r>
-              <w:rPr>
-                <w:sz w:val="19"/>
-              </w:rPr>
-              <w:t>]</w:t>
-            </w:r>
-          </w:p>
-        </w:tc>
-        <w:tc>
-          <w:tcPr>
-            <w:tcW w:w="1800" w:type="dxa"/>
-            <w:tcMar>
-              <w:top w:w="100" w:type="dxa"/>
-              <w:left w:w="100" w:type="dxa"/>
-              <w:bottom w:w="100" w:type="dxa"/>
-              <w:right w:w="100" w:type="dxa"/>
-            </w:tcMar>
-            <w:vAlign w:val="center"/>
-          </w:tcPr>
-          <w:p>
-            <w:pPr>
-              <w:spacing w:before="40" w:after="40"/>
-            </w:pPr>
-            <w:r>
-              <w:rPr>
-                <w:sz w:val="19"/>
-              </w:rPr>
-              <w:t xml:space="preserve">[Offen / </w:t>
-            </w:r>
-            <w:proofErr w:type="spellStart"/>
-            <w:r>
-              <w:rPr>
-                <w:sz w:val="19"/>
-              </w:rPr>
-              <w:t>Erledigt</w:t>
-            </w:r>
-            <w:proofErr w:type="spellEnd"/>
-            <w:r>
-              <w:rPr>
-                <w:sz w:val="19"/>
-              </w:rPr>
-              <w:t>]</w:t>
-            </w:r>
-          </w:p>
-        </w:tc>
-      </w:tr>
-    </w:tbl>
-    <w:p>
-      <w:pPr>
-        <w:pStyle w:val="berschrift1"/>
-        <w:spacing w:before="240" w:after="120"/>
-      </w:pPr>
-    </w:p>
-    <w:p/>
     <w:p>
       <w:pPr>
         <w:pStyle w:val="berschrift1"/>
@@ -10661,6 +6608,7 @@
                 <w:color w:val="1F4E79"/>
                 <w:sz w:val="19"/>
               </w:rPr>
+              <w:lastRenderedPageBreak/>
               <w:t>Fehlgeschlagen</w:t>
             </w:r>
             <w:proofErr w:type="spellEnd"/>
@@ -10732,7 +6680,6 @@
                 <w:color w:val="1F4E79"/>
                 <w:sz w:val="19"/>
               </w:rPr>
-              <w:lastRenderedPageBreak/>
               <w:t>Übersprungen</w:t>
             </w:r>
             <w:proofErr w:type="spellEnd"/>
@@ -12284,6 +8231,7 @@
   <w:style w:type="character" w:default="1" w:styleId="Absatz-Standardschriftart">
     <w:name w:val="Default Paragraph Font"/>
     <w:uiPriority w:val="1"/>
+    <w:semiHidden/>
     <w:unhideWhenUsed/>
   </w:style>
   <w:style w:type="table" w:default="1" w:styleId="NormaleTabelle">

</xml_diff>